<commit_message>
PII at registration: one Yes/No question (Unknown and PTA questionnaire removed from registration/Categorize); Yes adds the privacy controls at once (FIPS: SP 800-53B privacy baseline; NSS: CNSSI 1253 Privacy Overlay variant for the impact level) with a count note; toggling via Categorize/system details or PUT /systems/{id}/pii adds/removes with confirmation and audit (system.pii_answered); PTA write endpoints 410, records read-only; Select shows 'Applied from registration (PII = Yes)'; tests; whitepaper source + rebuilt PDF/DOCX
</commit_message>
<xml_diff>
--- a/backend/app/static/whitepaper/IronVision_AI_Whitepaper.docx
+++ b/backend/app/static/whitepaper/IronVision_AI_Whitepaper.docx
@@ -1771,7 +1771,7 @@
               <w:rPr>
                 <w:sz w:val="17"/>
               </w:rPr>
-              <w:t>Information types from the NIST SP 800-60 Vol. 2 Rev. 1 catalog (168 types); FIPS 199 high-water mark or CNSSI 1253 per-objective C/I/A; NSS determination (Yes/No/Unsure); PTA; AO approval with revision history and re-approval on change.</w:t>
+              <w:t>Information types from the NIST SP 800-60 Vol. 2 Rev. 1 catalog (168 types); FIPS 199 high-water mark or CNSSI 1253 per-objective C/I/A; NSS determination (Yes/No/Unsure); PII Yes/No (Yes adds the Privacy Overlay); AO approval with revision history and re-approval on change.</w:t>
             </w:r>
           </w:p>
         </w:tc>
@@ -3324,7 +3324,7 @@
               <w:rPr>
                 <w:sz w:val="17"/>
               </w:rPr>
-              <w:t>Select information types and compute the security category. Record the NSS determination, framework (FIPS 199 or CNSSI 1253), PII presence and Privacy Threshold Analysis.</w:t>
+              <w:t>Select information types and compute the security category. Record the NSS determination, framework (FIPS 199 or CNSSI 1253) and one Yes/No answer: 'Does this system contain PII?'.</w:t>
             </w:r>
           </w:p>
         </w:tc>
@@ -3354,7 +3354,7 @@
               <w:rPr>
                 <w:sz w:val="17"/>
               </w:rPr>
-              <w:t>ISSO (prepares), AO (approves), Privacy Official (PTA)</w:t>
+              <w:t>ISSO (prepares), AO (approves)</w:t>
             </w:r>
           </w:p>
         </w:tc>
@@ -3384,7 +3384,7 @@
               <w:rPr>
                 <w:sz w:val="17"/>
               </w:rPr>
-              <w:t>Pick SP 800-60 information types with provisional impacts and adjust them with justification; answer 'Is this a National Security System?' (Yes/No/Unsure); fill in the PTA questionnaire; submit for approval.</w:t>
+              <w:t>Pick SP 800-60 information types with provisional impacts and adjust them with justification; answer 'Is this a National Security System?' (Yes/No/Unsure); answer the PII question (Yes or No); submit for approval.</w:t>
             </w:r>
           </w:p>
         </w:tc>
@@ -3414,7 +3414,7 @@
               <w:rPr>
                 <w:sz w:val="17"/>
               </w:rPr>
-              <w:t>FIPS 199: per-objective high-water mark and overall category. CNSSI 1253: separate C/I/A trigraph (e.g. M-H-L) and no overall value. A versioned categorization revision.</w:t>
+              <w:t>FIPS 199: per-objective high-water mark and overall category. CNSSI 1253: separate C/I/A trigraph (e.g. M-H-L) and no overall value. A versioned categorization revision. PII = Yes adds the Privacy Overlay at once (FIPS 199: SP 800-53B privacy baseline; CNSSI 1253: the Privacy Overlay variant for the impact level) and the note under the question shows how many controls it adds.</w:t>
             </w:r>
           </w:p>
         </w:tc>
@@ -3444,44 +3444,7 @@
               <w:rPr>
                 <w:sz w:val="17"/>
               </w:rPr>
-              <w:t>Approval needs authorization.decide. A change to an approved categorization creates a pending re-approval and the approved values stay in force. PTA outcomes are recommendations only; a single 'No' never concludes 'no PIA required'. Only a Privacy Official approves a PTA.</w:t>
-            </w:r>
-          </w:p>
-        </w:tc>
-      </w:tr>
-    </w:tbl>
-    <w:p/>
-    <w:tbl>
-      <w:tblPr>
-        <w:tblW w:type="auto" w:w="0"/>
-        <w:tblLook w:firstColumn="1" w:firstRow="1" w:lastColumn="0" w:lastRow="0" w:noHBand="0" w:noVBand="1" w:val="04A0"/>
-      </w:tblPr>
-      <w:tblGrid>
-        <w:gridCol w:w="9752"/>
-      </w:tblGrid>
-      <w:tr>
-        <w:tc>
-          <w:tcPr>
-            <w:tcW w:type="dxa" w:w="9752"/>
-            <w:shd w:val="clear" w:color="auto" w:fill="F1ECFB"/>
-          </w:tcPr>
-          <w:p>
-            <w:r/>
-            <w:r>
-              <w:rPr>
-                <w:b/>
-                <w:color w:val="5B3FA6"/>
-                <w:sz w:val="16"/>
-              </w:rPr>
-              <w:t>SME REVIEW REQUIRED</w:t>
-            </w:r>
-          </w:p>
-          <w:p>
-            <w:r>
-              <w:rPr>
-                <w:sz w:val="19"/>
-              </w:rPr>
-              <w:t>The default PTA questions are a generic example set ('validate against your agency's privacy requirements'). Agencies must replace or confirm them.</w:t>
+              <w:t>Approval needs authorization.decide. A change to an approved categorization creates a pending re-approval and the approved values stay in force. Changing the PII answer later asks for confirmation naming the controls affected; removal never deletes implementation statements or evidence. The answer and the overlay change are audited. The earlier Privacy Threshold Analysis questionnaire is retired; existing PTA records stay read-only.</w:t>
             </w:r>
           </w:p>
         </w:tc>
@@ -3541,57 +3504,6 @@
     </w:p>
     <w:p>
       <w:pPr>
-        <w:jc w:val="center"/>
-      </w:pPr>
-      <w:r>
-        <w:drawing>
-          <wp:inline xmlns:a="http://schemas.openxmlformats.org/drawingml/2006/main" xmlns:pic="http://schemas.openxmlformats.org/drawingml/2006/picture">
-            <wp:extent cx="5572800" cy="3483000"/>
-            <wp:docPr id="7" name="Picture 7"/>
-            <wp:cNvGraphicFramePr>
-              <a:graphicFrameLocks noChangeAspect="1"/>
-            </wp:cNvGraphicFramePr>
-            <a:graphic>
-              <a:graphicData uri="http://schemas.openxmlformats.org/drawingml/2006/picture">
-                <pic:pic>
-                  <pic:nvPicPr>
-                    <pic:cNvPr id="0" name="rmf-accuracy_04_pta_questionnaire.jpg"/>
-                    <pic:cNvPicPr/>
-                  </pic:nvPicPr>
-                  <pic:blipFill>
-                    <a:blip r:embed="rId16"/>
-                    <a:stretch>
-                      <a:fillRect/>
-                    </a:stretch>
-                  </pic:blipFill>
-                  <pic:spPr>
-                    <a:xfrm>
-                      <a:off x="0" y="0"/>
-                      <a:ext cx="5572800" cy="3483000"/>
-                    </a:xfrm>
-                    <a:prstGeom prst="rect"/>
-                  </pic:spPr>
-                </pic:pic>
-              </a:graphicData>
-            </a:graphic>
-          </wp:inline>
-        </w:drawing>
-      </w:r>
-    </w:p>
-    <w:p>
-      <w:pPr>
-        <w:jc w:val="center"/>
-      </w:pPr>
-      <w:r>
-        <w:rPr>
-          <w:color w:val="4B6470"/>
-          <w:sz w:val="17"/>
-        </w:rPr>
-        <w:t>Figure: Privacy Threshold Analysis questionnaire (example question set)</w:t>
-      </w:r>
-    </w:p>
-    <w:p>
-      <w:pPr>
         <w:pStyle w:val="Heading2"/>
       </w:pPr>
       <w:r>
@@ -3812,7 +3724,7 @@
         <w:drawing>
           <wp:inline xmlns:a="http://schemas.openxmlformats.org/drawingml/2006/main" xmlns:pic="http://schemas.openxmlformats.org/drawingml/2006/picture">
             <wp:extent cx="5572800" cy="3483000"/>
-            <wp:docPr id="8" name="Picture 8"/>
+            <wp:docPr id="7" name="Picture 7"/>
             <wp:cNvGraphicFramePr>
               <a:graphicFrameLocks noChangeAspect="1"/>
             </wp:cNvGraphicFramePr>
@@ -3824,7 +3736,7 @@
                     <pic:cNvPicPr/>
                   </pic:nvPicPr>
                   <pic:blipFill>
-                    <a:blip r:embed="rId17"/>
+                    <a:blip r:embed="rId16"/>
                     <a:stretch>
                       <a:fillRect/>
                     </a:stretch>
@@ -3863,7 +3775,7 @@
         <w:drawing>
           <wp:inline xmlns:a="http://schemas.openxmlformats.org/drawingml/2006/main" xmlns:pic="http://schemas.openxmlformats.org/drawingml/2006/picture">
             <wp:extent cx="5572800" cy="3483000"/>
-            <wp:docPr id="9" name="Picture 9"/>
+            <wp:docPr id="8" name="Picture 8"/>
             <wp:cNvGraphicFramePr>
               <a:graphicFrameLocks noChangeAspect="1"/>
             </wp:cNvGraphicFramePr>
@@ -3875,7 +3787,7 @@
                     <pic:cNvPicPr/>
                   </pic:nvPicPr>
                   <pic:blipFill>
-                    <a:blip r:embed="rId18"/>
+                    <a:blip r:embed="rId17"/>
                     <a:stretch>
                       <a:fillRect/>
                     </a:stretch>
@@ -4495,7 +4407,7 @@
               <w:rPr>
                 <w:sz w:val="17"/>
               </w:rPr>
-              <w:t>Versioned implementation statements, review requests.</w:t>
+              <w:t>Versioned implementation statements, review requests, eMASS Implementation Plan and Risk Assessment fields.</w:t>
             </w:r>
           </w:p>
         </w:tc>
@@ -4526,6 +4438,212 @@
                 <w:sz w:val="17"/>
               </w:rPr>
               <w:t>AI drafts are labelled, carry validated citations and need human approval. Only the SCA sets the assessment status.</w:t>
+            </w:r>
+          </w:p>
+        </w:tc>
+      </w:tr>
+    </w:tbl>
+    <w:p/>
+    <w:p>
+      <w:pPr>
+        <w:pStyle w:val="Heading3"/>
+      </w:pPr>
+      <w:r>
+        <w:t>eMASS Implementation Plan and Risk Assessment (Control Workbench panels)</w:t>
+      </w:r>
+    </w:p>
+    <w:tbl>
+      <w:tblPr>
+        <w:tblStyle w:val="TableGrid"/>
+        <w:tblW w:type="auto" w:w="0"/>
+        <w:tblLook w:firstColumn="1" w:firstRow="1" w:lastColumn="0" w:lastRow="0" w:noHBand="0" w:noVBand="1" w:val="04A0"/>
+      </w:tblPr>
+      <w:tblGrid>
+        <w:gridCol w:w="4876"/>
+        <w:gridCol w:w="4876"/>
+      </w:tblGrid>
+      <w:tr>
+        <w:tc>
+          <w:tcPr>
+            <w:tcW w:type="dxa" w:w="1755"/>
+            <w:shd w:val="clear" w:color="auto" w:fill="2597B2"/>
+          </w:tcPr>
+          <w:p>
+            <w:r/>
+            <w:r>
+              <w:rPr>
+                <w:b/>
+                <w:color w:val="FFFFFF"/>
+                <w:sz w:val="17"/>
+              </w:rPr>
+              <w:t>Aspect</w:t>
+            </w:r>
+          </w:p>
+        </w:tc>
+        <w:tc>
+          <w:tcPr>
+            <w:tcW w:type="dxa" w:w="7996"/>
+            <w:shd w:val="clear" w:color="auto" w:fill="2597B2"/>
+          </w:tcPr>
+          <w:p>
+            <w:r/>
+            <w:r>
+              <w:rPr>
+                <w:b/>
+                <w:color w:val="FFFFFF"/>
+                <w:sz w:val="17"/>
+              </w:rPr>
+              <w:t>Detail</w:t>
+            </w:r>
+          </w:p>
+        </w:tc>
+      </w:tr>
+      <w:tr>
+        <w:tc>
+          <w:tcPr>
+            <w:tcW w:type="dxa" w:w="1755"/>
+          </w:tcPr>
+          <w:p>
+            <w:r/>
+            <w:r>
+              <w:rPr>
+                <w:sz w:val="17"/>
+              </w:rPr>
+              <w:t>Purpose</w:t>
+            </w:r>
+          </w:p>
+        </w:tc>
+        <w:tc>
+          <w:tcPr>
+            <w:tcW w:type="dxa" w:w="7996"/>
+          </w:tcPr>
+          <w:p>
+            <w:r/>
+            <w:r>
+              <w:rPr>
+                <w:sz w:val="17"/>
+              </w:rPr>
+              <w:t>eMASS field names and values (Implementation Status, Security Control Designation, Estimated Completion Date, Responsible Entities, SLCM Criticality/Frequency/Method/Reporting/Tracking/Comments, N/A Justification, Common Control Provider; Severity, Relevance of Threat, Likelihood, Impact, Residual Risk Level and risk text). Required fields follow the eMASS API business rules for each status.</w:t>
+            </w:r>
+          </w:p>
+        </w:tc>
+      </w:tr>
+      <w:tr>
+        <w:tc>
+          <w:tcPr>
+            <w:tcW w:type="dxa" w:w="1755"/>
+          </w:tcPr>
+          <w:p>
+            <w:r/>
+            <w:r>
+              <w:rPr>
+                <w:sz w:val="17"/>
+              </w:rPr>
+              <w:t>Used by</w:t>
+            </w:r>
+          </w:p>
+        </w:tc>
+        <w:tc>
+          <w:tcPr>
+            <w:tcW w:type="dxa" w:w="7996"/>
+          </w:tcPr>
+          <w:p>
+            <w:r/>
+            <w:r>
+              <w:rPr>
+                <w:sz w:val="17"/>
+              </w:rPr>
+              <w:t>ISSO, System Owner (edit); other roles read-only</w:t>
+            </w:r>
+          </w:p>
+        </w:tc>
+      </w:tr>
+      <w:tr>
+        <w:tc>
+          <w:tcPr>
+            <w:tcW w:type="dxa" w:w="1755"/>
+          </w:tcPr>
+          <w:p>
+            <w:r/>
+            <w:r>
+              <w:rPr>
+                <w:sz w:val="17"/>
+              </w:rPr>
+              <w:t>Key actions</w:t>
+            </w:r>
+          </w:p>
+        </w:tc>
+        <w:tc>
+          <w:tcPr>
+            <w:tcW w:type="dxa" w:w="7996"/>
+          </w:tcPr>
+          <w:p>
+            <w:r/>
+            <w:r>
+              <w:rPr>
+                <w:sz w:val="17"/>
+              </w:rPr>
+              <w:t>Pick values from dropdowns (with Other… for free-text fields); Suggest values (AI or deterministic rules) and accept per field or all; bulk-set plan fields on selected controls; filter by eMASS status or missing required fields; Import from eMASS: upload an eMASS Control Information export (compatibility pending verification against a real eMASS export), review current vs imported values per field, accept or reject, then apply (audited with the file name and SHA-256). The same shared eMASS report import also recognises System Details, Test Results, POA&amp;M and Hardware/Software List exports by their headers (each labelled compatibility pending verification against a real eMASS export), asks whether to update the current system, register a new one or pick an existing one, and shows one grouped review; Test Results stay proposals pending SCA approval and POA&amp;Ms match by eMASS ID, then control + weakness.</w:t>
+            </w:r>
+          </w:p>
+        </w:tc>
+      </w:tr>
+      <w:tr>
+        <w:tc>
+          <w:tcPr>
+            <w:tcW w:type="dxa" w:w="1755"/>
+          </w:tcPr>
+          <w:p>
+            <w:r/>
+            <w:r>
+              <w:rPr>
+                <w:sz w:val="17"/>
+              </w:rPr>
+              <w:t>Outputs</w:t>
+            </w:r>
+          </w:p>
+        </w:tc>
+        <w:tc>
+          <w:tcPr>
+            <w:tcW w:type="dxa" w:w="7996"/>
+          </w:tcPr>
+          <w:p>
+            <w:r/>
+            <w:r>
+              <w:rPr>
+                <w:sz w:val="17"/>
+              </w:rPr>
+              <w:t>eMASS-formatted Implementation Plan xlsx (compatibility pending human verification), validation report, OSCAL SSP props/remarks, MOCKED eMASS sync payload with eMASS API field names.</w:t>
+            </w:r>
+          </w:p>
+        </w:tc>
+      </w:tr>
+      <w:tr>
+        <w:tc>
+          <w:tcPr>
+            <w:tcW w:type="dxa" w:w="1755"/>
+          </w:tcPr>
+          <w:p>
+            <w:r/>
+            <w:r>
+              <w:rPr>
+                <w:sz w:val="17"/>
+              </w:rPr>
+              <w:t>Guardrails</w:t>
+            </w:r>
+          </w:p>
+        </w:tc>
+        <w:tc>
+          <w:tcPr>
+            <w:tcW w:type="dxa" w:w="7996"/>
+          </w:tcPr>
+          <w:p>
+            <w:r/>
+            <w:r>
+              <w:rPr>
+                <w:sz w:val="17"/>
+              </w:rPr>
+              <w:t>One implementation status (eMASS status is derived from it). Inherited controls are read-only and their Risk Assessment cannot be edited. Suggestions are never saved automatically; accepted values are audited as AI- or rule-assisted. AI never sets compliance or test results.</w:t>
             </w:r>
           </w:p>
         </w:tc>
@@ -4540,7 +4658,7 @@
         <w:drawing>
           <wp:inline xmlns:a="http://schemas.openxmlformats.org/drawingml/2006/main" xmlns:pic="http://schemas.openxmlformats.org/drawingml/2006/picture">
             <wp:extent cx="5696639" cy="3204359"/>
-            <wp:docPr id="10" name="Picture 10"/>
+            <wp:docPr id="9" name="Picture 9"/>
             <wp:cNvGraphicFramePr>
               <a:graphicFrameLocks noChangeAspect="1"/>
             </wp:cNvGraphicFramePr>
@@ -4552,7 +4670,7 @@
                     <pic:cNvPicPr/>
                   </pic:nvPicPr>
                   <pic:blipFill>
-                    <a:blip r:embed="rId19"/>
+                    <a:blip r:embed="rId18"/>
                     <a:stretch>
                       <a:fillRect/>
                     </a:stretch>
@@ -5003,7 +5121,7 @@
         <w:drawing>
           <wp:inline xmlns:a="http://schemas.openxmlformats.org/drawingml/2006/main" xmlns:pic="http://schemas.openxmlformats.org/drawingml/2006/picture">
             <wp:extent cx="5572800" cy="3831300"/>
-            <wp:docPr id="11" name="Picture 11"/>
+            <wp:docPr id="10" name="Picture 10"/>
             <wp:cNvGraphicFramePr>
               <a:graphicFrameLocks noChangeAspect="1"/>
             </wp:cNvGraphicFramePr>
@@ -5015,7 +5133,7 @@
                     <pic:cNvPicPr/>
                   </pic:nvPicPr>
                   <pic:blipFill>
-                    <a:blip r:embed="rId20"/>
+                    <a:blip r:embed="rId19"/>
                     <a:stretch>
                       <a:fillRect/>
                     </a:stretch>
@@ -5466,7 +5584,7 @@
         <w:drawing>
           <wp:inline xmlns:a="http://schemas.openxmlformats.org/drawingml/2006/main" xmlns:pic="http://schemas.openxmlformats.org/drawingml/2006/picture">
             <wp:extent cx="5572800" cy="3483000"/>
-            <wp:docPr id="12" name="Picture 12"/>
+            <wp:docPr id="11" name="Picture 11"/>
             <wp:cNvGraphicFramePr>
               <a:graphicFrameLocks noChangeAspect="1"/>
             </wp:cNvGraphicFramePr>
@@ -5478,7 +5596,7 @@
                     <pic:cNvPicPr/>
                   </pic:nvPicPr>
                   <pic:blipFill>
-                    <a:blip r:embed="rId21"/>
+                    <a:blip r:embed="rId20"/>
                     <a:stretch>
                       <a:fillRect/>
                     </a:stretch>
@@ -5773,7 +5891,7 @@
         <w:drawing>
           <wp:inline xmlns:a="http://schemas.openxmlformats.org/drawingml/2006/main" xmlns:pic="http://schemas.openxmlformats.org/drawingml/2006/picture">
             <wp:extent cx="5572800" cy="3483000"/>
-            <wp:docPr id="13" name="Picture 13"/>
+            <wp:docPr id="12" name="Picture 12"/>
             <wp:cNvGraphicFramePr>
               <a:graphicFrameLocks noChangeAspect="1"/>
             </wp:cNvGraphicFramePr>
@@ -5785,7 +5903,7 @@
                     <pic:cNvPicPr/>
                   </pic:nvPicPr>
                   <pic:blipFill>
-                    <a:blip r:embed="rId22"/>
+                    <a:blip r:embed="rId21"/>
                     <a:stretch>
                       <a:fillRect/>
                     </a:stretch>
@@ -6450,7 +6568,7 @@
         <w:drawing>
           <wp:inline xmlns:a="http://schemas.openxmlformats.org/drawingml/2006/main" xmlns:pic="http://schemas.openxmlformats.org/drawingml/2006/picture">
             <wp:extent cx="5572800" cy="3483000"/>
-            <wp:docPr id="14" name="Picture 14"/>
+            <wp:docPr id="13" name="Picture 13"/>
             <wp:cNvGraphicFramePr>
               <a:graphicFrameLocks noChangeAspect="1"/>
             </wp:cNvGraphicFramePr>
@@ -6462,7 +6580,7 @@
                     <pic:cNvPicPr/>
                   </pic:nvPicPr>
                   <pic:blipFill>
-                    <a:blip r:embed="rId23"/>
+                    <a:blip r:embed="rId22"/>
                     <a:stretch>
                       <a:fillRect/>
                     </a:stretch>
@@ -6707,7 +6825,7 @@
         <w:drawing>
           <wp:inline xmlns:a="http://schemas.openxmlformats.org/drawingml/2006/main" xmlns:pic="http://schemas.openxmlformats.org/drawingml/2006/picture">
             <wp:extent cx="5572800" cy="3483000"/>
-            <wp:docPr id="15" name="Picture 15"/>
+            <wp:docPr id="14" name="Picture 14"/>
             <wp:cNvGraphicFramePr>
               <a:graphicFrameLocks noChangeAspect="1"/>
             </wp:cNvGraphicFramePr>
@@ -6719,7 +6837,7 @@
                     <pic:cNvPicPr/>
                   </pic:nvPicPr>
                   <pic:blipFill>
-                    <a:blip r:embed="rId24"/>
+                    <a:blip r:embed="rId23"/>
                     <a:stretch>
                       <a:fillRect/>
                     </a:stretch>
@@ -6972,7 +7090,7 @@
         <w:drawing>
           <wp:inline xmlns:a="http://schemas.openxmlformats.org/drawingml/2006/main" xmlns:pic="http://schemas.openxmlformats.org/drawingml/2006/picture">
             <wp:extent cx="5448960" cy="3405600"/>
-            <wp:docPr id="16" name="Picture 16"/>
+            <wp:docPr id="15" name="Picture 15"/>
             <wp:cNvGraphicFramePr>
               <a:graphicFrameLocks noChangeAspect="1"/>
             </wp:cNvGraphicFramePr>
@@ -6984,7 +7102,7 @@
                     <pic:cNvPicPr/>
                   </pic:nvPicPr>
                   <pic:blipFill>
-                    <a:blip r:embed="rId25"/>
+                    <a:blip r:embed="rId24"/>
                     <a:stretch>
                       <a:fillRect/>
                     </a:stretch>
@@ -7229,7 +7347,7 @@
         <w:drawing>
           <wp:inline xmlns:a="http://schemas.openxmlformats.org/drawingml/2006/main" xmlns:pic="http://schemas.openxmlformats.org/drawingml/2006/picture">
             <wp:extent cx="5572800" cy="3134700"/>
-            <wp:docPr id="17" name="Picture 17"/>
+            <wp:docPr id="16" name="Picture 16"/>
             <wp:cNvGraphicFramePr>
               <a:graphicFrameLocks noChangeAspect="1"/>
             </wp:cNvGraphicFramePr>
@@ -7241,7 +7359,7 @@
                     <pic:cNvPicPr/>
                   </pic:nvPicPr>
                   <pic:blipFill>
-                    <a:blip r:embed="rId26"/>
+                    <a:blip r:embed="rId25"/>
                     <a:stretch>
                       <a:fillRect/>
                     </a:stretch>
@@ -7969,7 +8087,7 @@
         <w:drawing>
           <wp:inline xmlns:a="http://schemas.openxmlformats.org/drawingml/2006/main" xmlns:pic="http://schemas.openxmlformats.org/drawingml/2006/picture">
             <wp:extent cx="5572800" cy="3134700"/>
-            <wp:docPr id="18" name="Picture 18"/>
+            <wp:docPr id="17" name="Picture 17"/>
             <wp:cNvGraphicFramePr>
               <a:graphicFrameLocks noChangeAspect="1"/>
             </wp:cNvGraphicFramePr>
@@ -7981,7 +8099,7 @@
                     <pic:cNvPicPr/>
                   </pic:nvPicPr>
                   <pic:blipFill>
-                    <a:blip r:embed="rId27"/>
+                    <a:blip r:embed="rId26"/>
                     <a:stretch>
                       <a:fillRect/>
                     </a:stretch>
@@ -11666,7 +11784,7 @@
         <w:drawing>
           <wp:inline xmlns:a="http://schemas.openxmlformats.org/drawingml/2006/main" xmlns:pic="http://schemas.openxmlformats.org/drawingml/2006/picture">
             <wp:extent cx="5263200" cy="3289500"/>
-            <wp:docPr id="19" name="Picture 19"/>
+            <wp:docPr id="18" name="Picture 18"/>
             <wp:cNvGraphicFramePr>
               <a:graphicFrameLocks noChangeAspect="1"/>
             </wp:cNvGraphicFramePr>
@@ -11678,7 +11796,7 @@
                     <pic:cNvPicPr/>
                   </pic:nvPicPr>
                   <pic:blipFill>
-                    <a:blip r:embed="rId28"/>
+                    <a:blip r:embed="rId27"/>
                     <a:stretch>
                       <a:fillRect/>
                     </a:stretch>
@@ -11808,7 +11926,7 @@
         <w:drawing>
           <wp:inline xmlns:a="http://schemas.openxmlformats.org/drawingml/2006/main" xmlns:pic="http://schemas.openxmlformats.org/drawingml/2006/picture">
             <wp:extent cx="5448960" cy="3524796"/>
-            <wp:docPr id="20" name="Picture 20"/>
+            <wp:docPr id="19" name="Picture 19"/>
             <wp:cNvGraphicFramePr>
               <a:graphicFrameLocks noChangeAspect="1"/>
             </wp:cNvGraphicFramePr>
@@ -11820,7 +11938,7 @@
                     <pic:cNvPicPr/>
                   </pic:nvPicPr>
                   <pic:blipFill>
-                    <a:blip r:embed="rId29"/>
+                    <a:blip r:embed="rId28"/>
                     <a:stretch>
                       <a:fillRect/>
                     </a:stretch>
@@ -11947,7 +12065,7 @@
         <w:drawing>
           <wp:inline xmlns:a="http://schemas.openxmlformats.org/drawingml/2006/main" xmlns:pic="http://schemas.openxmlformats.org/drawingml/2006/picture">
             <wp:extent cx="6192000" cy="3803657"/>
-            <wp:docPr id="21" name="Picture 21"/>
+            <wp:docPr id="20" name="Picture 20"/>
             <wp:cNvGraphicFramePr>
               <a:graphicFrameLocks noChangeAspect="1"/>
             </wp:cNvGraphicFramePr>
@@ -11959,7 +12077,7 @@
                     <pic:cNvPicPr/>
                   </pic:nvPicPr>
                   <pic:blipFill>
-                    <a:blip r:embed="rId30"/>
+                    <a:blip r:embed="rId29"/>
                     <a:stretch>
                       <a:fillRect/>
                     </a:stretch>
@@ -14697,7 +14815,7 @@
         <w:rPr>
           <w:b/>
         </w:rPr>
-        <w:t>236 paths, 257 operations</w:t>
+        <w:t>281 paths, 306 operations</w:t>
       </w:r>
       <w:r>
         <w:t>, grouped by the first path segment under /api/v1. Every mutating operation requires a permission (see section 11); only sign-in, demo login, refresh, logout, sign-up, health and the public whitepaper downloads are unauthenticated.</w:t>
@@ -15320,7 +15438,7 @@
               <w:rPr>
                 <w:sz w:val="17"/>
               </w:rPr>
-              <w:t>3</w:t>
+              <w:t>4</w:t>
             </w:r>
           </w:p>
         </w:tc>
@@ -15334,7 +15452,7 @@
               <w:rPr>
                 <w:sz w:val="17"/>
               </w:rPr>
-              <w:t>GET /controls; GET /controls/families; GET /controls/{control_id}</w:t>
+              <w:t>GET /controls; GET /controls/cci-index; GET /controls/families; GET /controls/{control_id}</w:t>
             </w:r>
           </w:p>
         </w:tc>
@@ -15614,7 +15732,7 @@
               <w:rPr>
                 <w:sz w:val="17"/>
               </w:rPr>
-              <w:t>evidence</w:t>
+              <w:t>emass-imports</w:t>
             </w:r>
           </w:p>
         </w:tc>
@@ -15628,7 +15746,7 @@
               <w:rPr>
                 <w:sz w:val="17"/>
               </w:rPr>
-              <w:t>5</w:t>
+              <w:t>8</w:t>
             </w:r>
           </w:p>
         </w:tc>
@@ -15642,7 +15760,7 @@
               <w:rPr>
                 <w:sz w:val="17"/>
               </w:rPr>
-              <w:t>GET /evidence/{evidence_id}; GET /evidence/{evidence_id}/download; POST /evidence/{evidence_id}/legal-hold; POST /evidence/{evidence_id}/remove …</w:t>
+              <w:t>GET /emass-imports; GET /emass-imports/samples/{report_type}; GET /emass-imports/{import_id}; POST /emass-imports …</w:t>
             </w:r>
           </w:p>
         </w:tc>
@@ -15658,7 +15776,7 @@
               <w:rPr>
                 <w:sz w:val="17"/>
               </w:rPr>
-              <w:t>findings</w:t>
+              <w:t>evidence</w:t>
             </w:r>
           </w:p>
         </w:tc>
@@ -15672,7 +15790,7 @@
               <w:rPr>
                 <w:sz w:val="17"/>
               </w:rPr>
-              <w:t>8</w:t>
+              <w:t>5</w:t>
             </w:r>
           </w:p>
         </w:tc>
@@ -15686,7 +15804,7 @@
               <w:rPr>
                 <w:sz w:val="17"/>
               </w:rPr>
-              <w:t>GET /findings/{finding_id}; GET /findings/{finding_id}/mappings; GET /findings/{finding_id}/poam-match; GET /findings/{finding_id}/score …</w:t>
+              <w:t>GET /evidence/{evidence_id}; GET /evidence/{evidence_id}/download; POST /evidence/{evidence_id}/legal-hold; POST /evidence/{evidence_id}/remove …</w:t>
             </w:r>
           </w:p>
         </w:tc>
@@ -15702,7 +15820,7 @@
               <w:rPr>
                 <w:sz w:val="17"/>
               </w:rPr>
-              <w:t>freshness-policies</w:t>
+              <w:t>findings</w:t>
             </w:r>
           </w:p>
         </w:tc>
@@ -15716,7 +15834,7 @@
               <w:rPr>
                 <w:sz w:val="17"/>
               </w:rPr>
-              <w:t>1</w:t>
+              <w:t>8</w:t>
             </w:r>
           </w:p>
         </w:tc>
@@ -15730,7 +15848,7 @@
               <w:rPr>
                 <w:sz w:val="17"/>
               </w:rPr>
-              <w:t>GET /freshness-policies</w:t>
+              <w:t>GET /findings/{finding_id}; GET /findings/{finding_id}/mappings; GET /findings/{finding_id}/poam-match; GET /findings/{finding_id}/score …</w:t>
             </w:r>
           </w:p>
         </w:tc>
@@ -15746,7 +15864,7 @@
               <w:rPr>
                 <w:sz w:val="17"/>
               </w:rPr>
-              <w:t>health</w:t>
+              <w:t>freshness-policies</w:t>
             </w:r>
           </w:p>
         </w:tc>
@@ -15760,7 +15878,7 @@
               <w:rPr>
                 <w:sz w:val="17"/>
               </w:rPr>
-              <w:t>2</w:t>
+              <w:t>1</w:t>
             </w:r>
           </w:p>
         </w:tc>
@@ -15774,7 +15892,7 @@
               <w:rPr>
                 <w:sz w:val="17"/>
               </w:rPr>
-              <w:t>GET /health; GET /health/live</w:t>
+              <w:t>GET /freshness-policies</w:t>
             </w:r>
           </w:p>
         </w:tc>
@@ -15790,7 +15908,7 @@
               <w:rPr>
                 <w:sz w:val="17"/>
               </w:rPr>
-              <w:t>ingest-runs</w:t>
+              <w:t>health</w:t>
             </w:r>
           </w:p>
         </w:tc>
@@ -15804,7 +15922,7 @@
               <w:rPr>
                 <w:sz w:val="17"/>
               </w:rPr>
-              <w:t>3</w:t>
+              <w:t>2</w:t>
             </w:r>
           </w:p>
         </w:tc>
@@ -15818,7 +15936,7 @@
               <w:rPr>
                 <w:sz w:val="17"/>
               </w:rPr>
-              <w:t>GET /ingest-runs/{run_id}; GET /ingest-runs/{run_id}/stig; POST /ingest-runs/{run_id}/retry</w:t>
+              <w:t>GET /health; GET /health/live</w:t>
             </w:r>
           </w:p>
         </w:tc>
@@ -15834,7 +15952,7 @@
               <w:rPr>
                 <w:sz w:val="17"/>
               </w:rPr>
-              <w:t>inventory</w:t>
+              <w:t>ingest-runs</w:t>
             </w:r>
           </w:p>
         </w:tc>
@@ -15848,7 +15966,7 @@
               <w:rPr>
                 <w:sz w:val="17"/>
               </w:rPr>
-              <w:t>4</w:t>
+              <w:t>3</w:t>
             </w:r>
           </w:p>
         </w:tc>
@@ -15862,7 +15980,7 @@
               <w:rPr>
                 <w:sz w:val="17"/>
               </w:rPr>
-              <w:t>GET /inventory/exports/{eid}/download; GET /inventory/exports/{eid}/validation-report; POST /inventory/correlations/{cid}; POST /inventory/discrepancies/{did}</w:t>
+              <w:t>GET /ingest-runs/{run_id}; GET /ingest-runs/{run_id}/stig; POST /ingest-runs/{run_id}/retry</w:t>
             </w:r>
           </w:p>
         </w:tc>
@@ -15878,7 +15996,7 @@
               <w:rPr>
                 <w:sz w:val="17"/>
               </w:rPr>
-              <w:t>jobs</w:t>
+              <w:t>inventory</w:t>
             </w:r>
           </w:p>
         </w:tc>
@@ -15892,7 +16010,7 @@
               <w:rPr>
                 <w:sz w:val="17"/>
               </w:rPr>
-              <w:t>2</w:t>
+              <w:t>4</w:t>
             </w:r>
           </w:p>
         </w:tc>
@@ -15906,7 +16024,7 @@
               <w:rPr>
                 <w:sz w:val="17"/>
               </w:rPr>
-              <w:t>GET /jobs; GET /jobs/{job_id}</w:t>
+              <w:t>GET /inventory/exports/{eid}/download; GET /inventory/exports/{eid}/validation-report; POST /inventory/correlations/{cid}; POST /inventory/discrepancies/{did}</w:t>
             </w:r>
           </w:p>
         </w:tc>
@@ -15922,7 +16040,7 @@
               <w:rPr>
                 <w:sz w:val="17"/>
               </w:rPr>
-              <w:t>mapping-review</w:t>
+              <w:t>jobs</w:t>
             </w:r>
           </w:p>
         </w:tc>
@@ -15936,7 +16054,7 @@
               <w:rPr>
                 <w:sz w:val="17"/>
               </w:rPr>
-              <w:t>3</w:t>
+              <w:t>2</w:t>
             </w:r>
           </w:p>
         </w:tc>
@@ -15950,7 +16068,7 @@
               <w:rPr>
                 <w:sz w:val="17"/>
               </w:rPr>
-              <w:t>GET /mapping-review; POST /mapping-review/decide; POST /mapping-review/rule-action</w:t>
+              <w:t>GET /jobs; GET /jobs/{job_id}</w:t>
             </w:r>
           </w:p>
         </w:tc>
@@ -15966,7 +16084,7 @@
               <w:rPr>
                 <w:sz w:val="17"/>
               </w:rPr>
-              <w:t>mappings</w:t>
+              <w:t>mapping-review</w:t>
             </w:r>
           </w:p>
         </w:tc>
@@ -15980,7 +16098,7 @@
               <w:rPr>
                 <w:sz w:val="17"/>
               </w:rPr>
-              <w:t>1</w:t>
+              <w:t>6</w:t>
             </w:r>
           </w:p>
         </w:tc>
@@ -15994,7 +16112,7 @@
               <w:rPr>
                 <w:sz w:val="17"/>
               </w:rPr>
-              <w:t>POST /mappings/{map_id}/review</w:t>
+              <w:t>GET /mapping-review; GET /mapping-review/bulk-jobs/{job_id}; POST /mapping-review/bulk-jobs; POST /mapping-review/bulk-jobs/{job_id}/retry …</w:t>
             </w:r>
           </w:p>
         </w:tc>
@@ -16010,7 +16128,7 @@
               <w:rPr>
                 <w:sz w:val="17"/>
               </w:rPr>
-              <w:t>notification-prefs</w:t>
+              <w:t>mappings</w:t>
             </w:r>
           </w:p>
         </w:tc>
@@ -16024,7 +16142,7 @@
               <w:rPr>
                 <w:sz w:val="17"/>
               </w:rPr>
-              <w:t>2</w:t>
+              <w:t>1</w:t>
             </w:r>
           </w:p>
         </w:tc>
@@ -16038,7 +16156,7 @@
               <w:rPr>
                 <w:sz w:val="17"/>
               </w:rPr>
-              <w:t>GET /notification-prefs; PUT /notification-prefs</w:t>
+              <w:t>POST /mappings/{map_id}/review</w:t>
             </w:r>
           </w:p>
         </w:tc>
@@ -16054,7 +16172,7 @@
               <w:rPr>
                 <w:sz w:val="17"/>
               </w:rPr>
-              <w:t>notifications</w:t>
+              <w:t>notification-prefs</w:t>
             </w:r>
           </w:p>
         </w:tc>
@@ -16082,7 +16200,7 @@
               <w:rPr>
                 <w:sz w:val="17"/>
               </w:rPr>
-              <w:t>GET /notifications; POST /notifications/{notification_id}/ack</w:t>
+              <w:t>GET /notification-prefs; PUT /notification-prefs</w:t>
             </w:r>
           </w:p>
         </w:tc>
@@ -16098,7 +16216,7 @@
               <w:rPr>
                 <w:sz w:val="17"/>
               </w:rPr>
-              <w:t>oscal-exports</w:t>
+              <w:t>notifications</w:t>
             </w:r>
           </w:p>
         </w:tc>
@@ -16112,7 +16230,7 @@
               <w:rPr>
                 <w:sz w:val="17"/>
               </w:rPr>
-              <w:t>1</w:t>
+              <w:t>2</w:t>
             </w:r>
           </w:p>
         </w:tc>
@@ -16126,7 +16244,7 @@
               <w:rPr>
                 <w:sz w:val="17"/>
               </w:rPr>
-              <w:t>GET /oscal-exports/{evidence_id}/download</w:t>
+              <w:t>GET /notifications; POST /notifications/{notification_id}/ack</w:t>
             </w:r>
           </w:p>
         </w:tc>
@@ -16142,7 +16260,7 @@
               <w:rPr>
                 <w:sz w:val="17"/>
               </w:rPr>
-              <w:t>overlays</w:t>
+              <w:t>oscal-exports</w:t>
             </w:r>
           </w:p>
         </w:tc>
@@ -16156,7 +16274,7 @@
               <w:rPr>
                 <w:sz w:val="17"/>
               </w:rPr>
-              <w:t>2</w:t>
+              <w:t>1</w:t>
             </w:r>
           </w:p>
         </w:tc>
@@ -16170,7 +16288,7 @@
               <w:rPr>
                 <w:sz w:val="17"/>
               </w:rPr>
-              <w:t>POST /overlays/import-reference; POST /overlays/{overlay_key}/import</w:t>
+              <w:t>GET /oscal-exports/{evidence_id}/download</w:t>
             </w:r>
           </w:p>
         </w:tc>
@@ -16186,7 +16304,7 @@
               <w:rPr>
                 <w:sz w:val="17"/>
               </w:rPr>
-              <w:t>poam-match-rules</w:t>
+              <w:t>overlays</w:t>
             </w:r>
           </w:p>
         </w:tc>
@@ -16200,7 +16318,7 @@
               <w:rPr>
                 <w:sz w:val="17"/>
               </w:rPr>
-              <w:t>1</w:t>
+              <w:t>2</w:t>
             </w:r>
           </w:p>
         </w:tc>
@@ -16214,7 +16332,7 @@
               <w:rPr>
                 <w:sz w:val="17"/>
               </w:rPr>
-              <w:t>GET /poam-match-rules</w:t>
+              <w:t>POST /overlays/import-reference; POST /overlays/{overlay_key}/import</w:t>
             </w:r>
           </w:p>
         </w:tc>
@@ -16230,7 +16348,7 @@
               <w:rPr>
                 <w:sz w:val="17"/>
               </w:rPr>
-              <w:t>poam-milestones</w:t>
+              <w:t>poam-match-rules</w:t>
             </w:r>
           </w:p>
         </w:tc>
@@ -16258,7 +16376,7 @@
               <w:rPr>
                 <w:sz w:val="17"/>
               </w:rPr>
-              <w:t>PATCH /poam-milestones/{milestone_id}</w:t>
+              <w:t>GET /poam-match-rules</w:t>
             </w:r>
           </w:p>
         </w:tc>
@@ -16274,7 +16392,7 @@
               <w:rPr>
                 <w:sz w:val="17"/>
               </w:rPr>
-              <w:t>poams</w:t>
+              <w:t>poam-milestones</w:t>
             </w:r>
           </w:p>
         </w:tc>
@@ -16288,7 +16406,7 @@
               <w:rPr>
                 <w:sz w:val="17"/>
               </w:rPr>
-              <w:t>10</w:t>
+              <w:t>1</w:t>
             </w:r>
           </w:p>
         </w:tc>
@@ -16302,7 +16420,7 @@
               <w:rPr>
                 <w:sz w:val="17"/>
               </w:rPr>
-              <w:t>GET /poams; GET /poams/{poam_id}; PATCH /poams/{poam_id}; POST /poams …</w:t>
+              <w:t>PATCH /poam-milestones/{milestone_id}</w:t>
             </w:r>
           </w:p>
         </w:tc>
@@ -16318,7 +16436,7 @@
               <w:rPr>
                 <w:sz w:val="17"/>
               </w:rPr>
-              <w:t>policies</w:t>
+              <w:t>poams</w:t>
             </w:r>
           </w:p>
         </w:tc>
@@ -16332,7 +16450,7 @@
               <w:rPr>
                 <w:sz w:val="17"/>
               </w:rPr>
-              <w:t>11</w:t>
+              <w:t>12</w:t>
             </w:r>
           </w:p>
         </w:tc>
@@ -16346,7 +16464,7 @@
               <w:rPr>
                 <w:sz w:val="17"/>
               </w:rPr>
-              <w:t>GET /policies; GET /policies/{policy_id}; GET /policies/{policy_id}/mappings/{control_id}/review; GET /policies/{policy_id}/parameters.csv …</w:t>
+              <w:t>GET /poams; GET /poams/{poam_id}; GET /poams/{poam_id}/risk; PATCH /poams/{poam_id} …</w:t>
             </w:r>
           </w:p>
         </w:tc>
@@ -16362,7 +16480,7 @@
               <w:rPr>
                 <w:sz w:val="17"/>
               </w:rPr>
-              <w:t>policy-findings</w:t>
+              <w:t>policies</w:t>
             </w:r>
           </w:p>
         </w:tc>
@@ -16376,7 +16494,7 @@
               <w:rPr>
                 <w:sz w:val="17"/>
               </w:rPr>
-              <w:t>1</w:t>
+              <w:t>12</w:t>
             </w:r>
           </w:p>
         </w:tc>
@@ -16390,7 +16508,7 @@
               <w:rPr>
                 <w:sz w:val="17"/>
               </w:rPr>
-              <w:t>POST /policy-findings/{pf_id}/{action}</w:t>
+              <w:t>GET /policies; GET /policies/{policy_id}; GET /policies/{policy_id}/mappings/{control_id}/review; GET /policies/{policy_id}/parameters.csv …</w:t>
             </w:r>
           </w:p>
         </w:tc>
@@ -16406,7 +16524,7 @@
               <w:rPr>
                 <w:sz w:val="17"/>
               </w:rPr>
-              <w:t>priority-weights</w:t>
+              <w:t>policy-findings</w:t>
             </w:r>
           </w:p>
         </w:tc>
@@ -16434,7 +16552,7 @@
               <w:rPr>
                 <w:sz w:val="17"/>
               </w:rPr>
-              <w:t>GET /priority-weights</w:t>
+              <w:t>POST /policy-findings/{pf_id}/{action}</w:t>
             </w:r>
           </w:p>
         </w:tc>
@@ -16450,7 +16568,7 @@
               <w:rPr>
                 <w:sz w:val="17"/>
               </w:rPr>
-              <w:t>providers</w:t>
+              <w:t>priority-weights</w:t>
             </w:r>
           </w:p>
         </w:tc>
@@ -16464,7 +16582,7 @@
               <w:rPr>
                 <w:sz w:val="17"/>
               </w:rPr>
-              <w:t>5</w:t>
+              <w:t>1</w:t>
             </w:r>
           </w:p>
         </w:tc>
@@ -16478,7 +16596,7 @@
               <w:rPr>
                 <w:sz w:val="17"/>
               </w:rPr>
-              <w:t>PATCH /providers/{provider_id}; POST /providers; POST /providers/{provider_id}/crm/apply; POST /providers/{provider_id}/crm/preview …</w:t>
+              <w:t>GET /priority-weights</w:t>
             </w:r>
           </w:p>
         </w:tc>
@@ -16494,7 +16612,7 @@
               <w:rPr>
                 <w:sz w:val="17"/>
               </w:rPr>
-              <w:t>pta</w:t>
+              <w:t>privacy</w:t>
             </w:r>
           </w:p>
         </w:tc>
@@ -16508,7 +16626,7 @@
               <w:rPr>
                 <w:sz w:val="17"/>
               </w:rPr>
-              <w:t>2</w:t>
+              <w:t>1</w:t>
             </w:r>
           </w:p>
         </w:tc>
@@ -16522,7 +16640,7 @@
               <w:rPr>
                 <w:sz w:val="17"/>
               </w:rPr>
-              <w:t>GET /pta/question-sets; POST /pta/question-sets</w:t>
+              <w:t>GET /privacy/preview</w:t>
             </w:r>
           </w:p>
         </w:tc>
@@ -16538,7 +16656,7 @@
               <w:rPr>
                 <w:sz w:val="17"/>
               </w:rPr>
-              <w:t>public</w:t>
+              <w:t>providers</w:t>
             </w:r>
           </w:p>
         </w:tc>
@@ -16552,7 +16670,7 @@
               <w:rPr>
                 <w:sz w:val="17"/>
               </w:rPr>
-              <w:t>1</w:t>
+              <w:t>5</w:t>
             </w:r>
           </w:p>
         </w:tc>
@@ -16566,7 +16684,7 @@
               <w:rPr>
                 <w:sz w:val="17"/>
               </w:rPr>
-              <w:t>GET /public/whitepaper.{ext}</w:t>
+              <w:t>PATCH /providers/{provider_id}; POST /providers; POST /providers/{provider_id}/crm/apply; POST /providers/{provider_id}/crm/preview …</w:t>
             </w:r>
           </w:p>
         </w:tc>
@@ -16582,7 +16700,7 @@
               <w:rPr>
                 <w:sz w:val="17"/>
               </w:rPr>
-              <w:t>rbac</w:t>
+              <w:t>pta</w:t>
             </w:r>
           </w:p>
         </w:tc>
@@ -16596,7 +16714,7 @@
               <w:rPr>
                 <w:sz w:val="17"/>
               </w:rPr>
-              <w:t>1</w:t>
+              <w:t>2</w:t>
             </w:r>
           </w:p>
         </w:tc>
@@ -16610,7 +16728,7 @@
               <w:rPr>
                 <w:sz w:val="17"/>
               </w:rPr>
-              <w:t>GET /rbac/matrix</w:t>
+              <w:t>GET /pta/question-sets; POST /pta/question-sets</w:t>
             </w:r>
           </w:p>
         </w:tc>
@@ -16626,7 +16744,7 @@
               <w:rPr>
                 <w:sz w:val="17"/>
               </w:rPr>
-              <w:t>ready</w:t>
+              <w:t>public</w:t>
             </w:r>
           </w:p>
         </w:tc>
@@ -16640,7 +16758,7 @@
               <w:rPr>
                 <w:sz w:val="17"/>
               </w:rPr>
-              <w:t>1</w:t>
+              <w:t>2</w:t>
             </w:r>
           </w:p>
         </w:tc>
@@ -16654,7 +16772,7 @@
               <w:rPr>
                 <w:sz w:val="17"/>
               </w:rPr>
-              <w:t>GET /ready</w:t>
+              <w:t>GET /public/demo/{name}; GET /public/whitepaper.{ext}</w:t>
             </w:r>
           </w:p>
         </w:tc>
@@ -16670,7 +16788,7 @@
               <w:rPr>
                 <w:sz w:val="17"/>
               </w:rPr>
-              <w:t>reference</w:t>
+              <w:t>rbac</w:t>
             </w:r>
           </w:p>
         </w:tc>
@@ -16684,7 +16802,7 @@
               <w:rPr>
                 <w:sz w:val="17"/>
               </w:rPr>
-              <w:t>6</w:t>
+              <w:t>1</w:t>
             </w:r>
           </w:p>
         </w:tc>
@@ -16698,7 +16816,7 @@
               <w:rPr>
                 <w:sz w:val="17"/>
               </w:rPr>
-              <w:t>GET /reference/frameworks; GET /reference/info-types; GET /reference/registration; GET /reference/rmf …</w:t>
+              <w:t>GET /rbac/matrix</w:t>
             </w:r>
           </w:p>
         </w:tc>
@@ -16714,7 +16832,7 @@
               <w:rPr>
                 <w:sz w:val="17"/>
               </w:rPr>
-              <w:t>reviews</w:t>
+              <w:t>ready</w:t>
             </w:r>
           </w:p>
         </w:tc>
@@ -16728,7 +16846,7 @@
               <w:rPr>
                 <w:sz w:val="17"/>
               </w:rPr>
-              <w:t>3</w:t>
+              <w:t>1</w:t>
             </w:r>
           </w:p>
         </w:tc>
@@ -16742,7 +16860,7 @@
               <w:rPr>
                 <w:sz w:val="17"/>
               </w:rPr>
-              <w:t>GET /reviews; GET /reviews/{request_id}; POST /reviews/{request_id}/decisions</w:t>
+              <w:t>GET /ready</w:t>
             </w:r>
           </w:p>
         </w:tc>
@@ -16758,7 +16876,7 @@
               <w:rPr>
                 <w:sz w:val="17"/>
               </w:rPr>
-              <w:t>risk</w:t>
+              <w:t>reference</w:t>
             </w:r>
           </w:p>
         </w:tc>
@@ -16772,7 +16890,7 @@
               <w:rPr>
                 <w:sz w:val="17"/>
               </w:rPr>
-              <w:t>2</w:t>
+              <w:t>6</w:t>
             </w:r>
           </w:p>
         </w:tc>
@@ -16786,7 +16904,7 @@
               <w:rPr>
                 <w:sz w:val="17"/>
               </w:rPr>
-              <w:t>GET /risk/weights; PUT /risk/weights</w:t>
+              <w:t>GET /reference/frameworks; GET /reference/info-types; GET /reference/registration; GET /reference/rmf …</w:t>
             </w:r>
           </w:p>
         </w:tc>
@@ -16802,7 +16920,7 @@
               <w:rPr>
                 <w:sz w:val="17"/>
               </w:rPr>
-              <w:t>sandbox</w:t>
+              <w:t>reviews</w:t>
             </w:r>
           </w:p>
         </w:tc>
@@ -16816,7 +16934,7 @@
               <w:rPr>
                 <w:sz w:val="17"/>
               </w:rPr>
-              <w:t>6</w:t>
+              <w:t>3</w:t>
             </w:r>
           </w:p>
         </w:tc>
@@ -16830,7 +16948,7 @@
               <w:rPr>
                 <w:sz w:val="17"/>
               </w:rPr>
-              <w:t>GET /sandbox/samples.zip; GET /sandbox/status; POST /sandbox/act-as; POST /sandbox/demo-data …</w:t>
+              <w:t>GET /reviews; GET /reviews/{request_id}; POST /reviews/{request_id}/decisions</w:t>
             </w:r>
           </w:p>
         </w:tc>
@@ -16846,7 +16964,7 @@
               <w:rPr>
                 <w:sz w:val="17"/>
               </w:rPr>
-              <w:t>scheduled-jobs</w:t>
+              <w:t>risk</w:t>
             </w:r>
           </w:p>
         </w:tc>
@@ -16860,7 +16978,7 @@
               <w:rPr>
                 <w:sz w:val="17"/>
               </w:rPr>
-              <w:t>3</w:t>
+              <w:t>2</w:t>
             </w:r>
           </w:p>
         </w:tc>
@@ -16874,7 +16992,7 @@
               <w:rPr>
                 <w:sz w:val="17"/>
               </w:rPr>
-              <w:t>GET /scheduled-jobs; POST /scheduled-jobs/{job_id}/run; PUT /scheduled-jobs/{job_id}</w:t>
+              <w:t>GET /risk/weights; PUT /risk/weights</w:t>
             </w:r>
           </w:p>
         </w:tc>
@@ -16890,7 +17008,7 @@
               <w:rPr>
                 <w:sz w:val="17"/>
               </w:rPr>
-              <w:t>search</w:t>
+              <w:t>sandbox</w:t>
             </w:r>
           </w:p>
         </w:tc>
@@ -16904,7 +17022,7 @@
               <w:rPr>
                 <w:sz w:val="17"/>
               </w:rPr>
-              <w:t>1</w:t>
+              <w:t>6</w:t>
             </w:r>
           </w:p>
         </w:tc>
@@ -16918,7 +17036,7 @@
               <w:rPr>
                 <w:sz w:val="17"/>
               </w:rPr>
-              <w:t>GET /search</w:t>
+              <w:t>GET /sandbox/samples.zip; GET /sandbox/status; POST /sandbox/act-as; POST /sandbox/demo-data …</w:t>
             </w:r>
           </w:p>
         </w:tc>
@@ -16934,7 +17052,7 @@
               <w:rPr>
                 <w:sz w:val="17"/>
               </w:rPr>
-              <w:t>source-types</w:t>
+              <w:t>scheduled-jobs</w:t>
             </w:r>
           </w:p>
         </w:tc>
@@ -16948,7 +17066,7 @@
               <w:rPr>
                 <w:sz w:val="17"/>
               </w:rPr>
-              <w:t>1</w:t>
+              <w:t>3</w:t>
             </w:r>
           </w:p>
         </w:tc>
@@ -16962,7 +17080,7 @@
               <w:rPr>
                 <w:sz w:val="17"/>
               </w:rPr>
-              <w:t>GET /source-types</w:t>
+              <w:t>GET /scheduled-jobs; POST /scheduled-jobs/{job_id}/run; PUT /scheduled-jobs/{job_id}</w:t>
             </w:r>
           </w:p>
         </w:tc>
@@ -16978,7 +17096,7 @@
               <w:rPr>
                 <w:sz w:val="17"/>
               </w:rPr>
-              <w:t>sources</w:t>
+              <w:t>search</w:t>
             </w:r>
           </w:p>
         </w:tc>
@@ -16992,7 +17110,7 @@
               <w:rPr>
                 <w:sz w:val="17"/>
               </w:rPr>
-              <w:t>3</w:t>
+              <w:t>1</w:t>
             </w:r>
           </w:p>
         </w:tc>
@@ -17006,7 +17124,7 @@
               <w:rPr>
                 <w:sz w:val="17"/>
               </w:rPr>
-              <w:t>PATCH /sources/{source_id}; POST /sources/{source_id}/run; POST /sources/{source_id}/test</w:t>
+              <w:t>GET /search</w:t>
             </w:r>
           </w:p>
         </w:tc>
@@ -17022,6 +17140,94 @@
               <w:rPr>
                 <w:sz w:val="17"/>
               </w:rPr>
+              <w:t>source-types</w:t>
+            </w:r>
+          </w:p>
+        </w:tc>
+        <w:tc>
+          <w:tcPr>
+            <w:tcW w:type="dxa" w:w="683"/>
+          </w:tcPr>
+          <w:p>
+            <w:r/>
+            <w:r>
+              <w:rPr>
+                <w:sz w:val="17"/>
+              </w:rPr>
+              <w:t>1</w:t>
+            </w:r>
+          </w:p>
+        </w:tc>
+        <w:tc>
+          <w:tcPr>
+            <w:tcW w:type="dxa" w:w="7508"/>
+          </w:tcPr>
+          <w:p>
+            <w:r/>
+            <w:r>
+              <w:rPr>
+                <w:sz w:val="17"/>
+              </w:rPr>
+              <w:t>GET /source-types</w:t>
+            </w:r>
+          </w:p>
+        </w:tc>
+      </w:tr>
+      <w:tr>
+        <w:tc>
+          <w:tcPr>
+            <w:tcW w:type="dxa" w:w="1560"/>
+          </w:tcPr>
+          <w:p>
+            <w:r/>
+            <w:r>
+              <w:rPr>
+                <w:sz w:val="17"/>
+              </w:rPr>
+              <w:t>sources</w:t>
+            </w:r>
+          </w:p>
+        </w:tc>
+        <w:tc>
+          <w:tcPr>
+            <w:tcW w:type="dxa" w:w="683"/>
+          </w:tcPr>
+          <w:p>
+            <w:r/>
+            <w:r>
+              <w:rPr>
+                <w:sz w:val="17"/>
+              </w:rPr>
+              <w:t>3</w:t>
+            </w:r>
+          </w:p>
+        </w:tc>
+        <w:tc>
+          <w:tcPr>
+            <w:tcW w:type="dxa" w:w="7508"/>
+          </w:tcPr>
+          <w:p>
+            <w:r/>
+            <w:r>
+              <w:rPr>
+                <w:sz w:val="17"/>
+              </w:rPr>
+              <w:t>PATCH /sources/{source_id}; POST /sources/{source_id}/run; POST /sources/{source_id}/test</w:t>
+            </w:r>
+          </w:p>
+        </w:tc>
+      </w:tr>
+      <w:tr>
+        <w:tc>
+          <w:tcPr>
+            <w:tcW w:type="dxa" w:w="1560"/>
+          </w:tcPr>
+          <w:p>
+            <w:r/>
+            <w:r>
+              <w:rPr>
+                <w:sz w:val="17"/>
+              </w:rPr>
               <w:t>systems</w:t>
             </w:r>
           </w:p>
@@ -17036,7 +17242,7 @@
               <w:rPr>
                 <w:sz w:val="17"/>
               </w:rPr>
-              <w:t>81</w:t>
+              <w:t>113</w:t>
             </w:r>
           </w:p>
         </w:tc>

</xml_diff>

<commit_message>
Implemented screenshots (dashboard, nav, My Work x4, Workbench, Import Center, Mapping Review, SCA workspace, SSP, Guided on/off); whitepaper rebuilt
</commit_message>
<xml_diff>
--- a/backend/app/static/whitepaper/IronVision_AI_Whitepaper.docx
+++ b/backend/app/static/whitepaper/IronVision_AI_Whitepaper.docx
@@ -1608,7 +1608,7 @@
     </w:p>
     <w:p>
       <w:r>
-        <w:t xml:space="preserve">The RMF overview ('Getting started') and the per-system stepper compute a status for each of the seven steps from live data. A status is never typed in by hand. Each step reports one of </w:t>
+        <w:t xml:space="preserve">The system dashboard, the RMF navigation and the per-system stepper compute a status for each of the seven steps from live data. A status is never typed in by hand. Each step reports one of </w:t>
       </w:r>
       <w:r>
         <w:rPr>
@@ -1635,7 +1635,7 @@
         <w:t>complete</w:t>
       </w:r>
       <w:r>
-        <w:t>, with the criteria behind it, a progress counter and the single next action with a deep link.</w:t>
+        <w:t>, with the criteria behind it, a progress counter and the single next action with a deep link. Every import and analysis ends with 'Completed – next: …' pointing to the step that uses the result.</w:t>
       </w:r>
     </w:p>
     <w:tbl>
@@ -2078,7 +2078,7 @@
     </w:p>
     <w:p>
       <w:r>
-        <w:t>Each entry describes one page in the application: its purpose, who uses it, the key actions, what it produces and the guardrails that apply. Routes are given for orientation. Navigation follows the RMF steps (Start, 1 Prepare … 7 Monitor, Tools).</w:t>
+        <w:t>Each entry describes one page in the application: its purpose, who uses it, the key actions, what it produces and the guardrails that apply. Routes are given for orientation. Navigation: My Work, Systems, Import Center, Help and Admin, then the seven RMF steps of the selected system (1 Prepare … 7 Monitor). Clicking a step opens its main page; the chevron lists the step's pages. Every older route still works and opens the same page inside its step. Both themes meet WCAG 2.2 AA contrast (text 4.5:1, controls, borders and focus rings 3:1, readable disabled labels) and button, tab and chip labels never wrap – toolbars move whole buttons to the next line or into a 'More' menu on phones, and wide tables scroll instead of squeezing columns.</w:t>
       </w:r>
     </w:p>
     <w:p>
@@ -2359,6 +2359,726 @@
         <w:pStyle w:val="Heading3"/>
       </w:pPr>
       <w:r>
+        <w:t>My Work (/my-work)</w:t>
+      </w:r>
+    </w:p>
+    <w:tbl>
+      <w:tblPr>
+        <w:tblStyle w:val="TableGrid"/>
+        <w:tblW w:type="auto" w:w="0"/>
+        <w:tblLook w:firstColumn="1" w:firstRow="1" w:lastColumn="0" w:lastRow="0" w:noHBand="0" w:noVBand="1" w:val="04A0"/>
+      </w:tblPr>
+      <w:tblGrid>
+        <w:gridCol w:w="4876"/>
+        <w:gridCol w:w="4876"/>
+      </w:tblGrid>
+      <w:tr>
+        <w:tc>
+          <w:tcPr>
+            <w:tcW w:type="dxa" w:w="1755"/>
+            <w:shd w:val="clear" w:color="auto" w:fill="2597B2"/>
+          </w:tcPr>
+          <w:p>
+            <w:r/>
+            <w:r>
+              <w:rPr>
+                <w:b/>
+                <w:color w:val="FFFFFF"/>
+                <w:sz w:val="17"/>
+              </w:rPr>
+              <w:t>Aspect</w:t>
+            </w:r>
+          </w:p>
+        </w:tc>
+        <w:tc>
+          <w:tcPr>
+            <w:tcW w:type="dxa" w:w="7996"/>
+            <w:shd w:val="clear" w:color="auto" w:fill="2597B2"/>
+          </w:tcPr>
+          <w:p>
+            <w:r/>
+            <w:r>
+              <w:rPr>
+                <w:b/>
+                <w:color w:val="FFFFFF"/>
+                <w:sz w:val="17"/>
+              </w:rPr>
+              <w:t>Detail</w:t>
+            </w:r>
+          </w:p>
+        </w:tc>
+      </w:tr>
+      <w:tr>
+        <w:tc>
+          <w:tcPr>
+            <w:tcW w:type="dxa" w:w="1755"/>
+          </w:tcPr>
+          <w:p>
+            <w:r/>
+            <w:r>
+              <w:rPr>
+                <w:sz w:val="17"/>
+              </w:rPr>
+              <w:t>Purpose</w:t>
+            </w:r>
+          </w:p>
+        </w:tc>
+        <w:tc>
+          <w:tcPr>
+            <w:tcW w:type="dxa" w:w="7996"/>
+          </w:tcPr>
+          <w:p>
+            <w:r/>
+            <w:r>
+              <w:rPr>
+                <w:sz w:val="17"/>
+              </w:rPr>
+              <w:t>Role-based home: what is waiting for the current role – statements and suggestions (ISSO), assessment requests and retests (SCA), strategy, package and review approvals (ISSM), authorization decisions (AO).</w:t>
+            </w:r>
+          </w:p>
+        </w:tc>
+      </w:tr>
+      <w:tr>
+        <w:tc>
+          <w:tcPr>
+            <w:tcW w:type="dxa" w:w="1755"/>
+          </w:tcPr>
+          <w:p>
+            <w:r/>
+            <w:r>
+              <w:rPr>
+                <w:sz w:val="17"/>
+              </w:rPr>
+              <w:t>Used by</w:t>
+            </w:r>
+          </w:p>
+        </w:tc>
+        <w:tc>
+          <w:tcPr>
+            <w:tcW w:type="dxa" w:w="7996"/>
+          </w:tcPr>
+          <w:p>
+            <w:r/>
+            <w:r>
+              <w:rPr>
+                <w:sz w:val="17"/>
+              </w:rPr>
+              <w:t>All roles</w:t>
+            </w:r>
+          </w:p>
+        </w:tc>
+      </w:tr>
+      <w:tr>
+        <w:tc>
+          <w:tcPr>
+            <w:tcW w:type="dxa" w:w="1755"/>
+          </w:tcPr>
+          <w:p>
+            <w:r/>
+            <w:r>
+              <w:rPr>
+                <w:sz w:val="17"/>
+              </w:rPr>
+              <w:t>Key actions</w:t>
+            </w:r>
+          </w:p>
+        </w:tc>
+        <w:tc>
+          <w:tcPr>
+            <w:tcW w:type="dxa" w:w="7996"/>
+          </w:tcPr>
+          <w:p>
+            <w:r/>
+            <w:r>
+              <w:rPr>
+                <w:sz w:val="17"/>
+              </w:rPr>
+              <w:t>Open an item; it opens the record in its RMF step.</w:t>
+            </w:r>
+          </w:p>
+        </w:tc>
+      </w:tr>
+      <w:tr>
+        <w:tc>
+          <w:tcPr>
+            <w:tcW w:type="dxa" w:w="1755"/>
+          </w:tcPr>
+          <w:p>
+            <w:r/>
+            <w:r>
+              <w:rPr>
+                <w:sz w:val="17"/>
+              </w:rPr>
+              <w:t>Outputs</w:t>
+            </w:r>
+          </w:p>
+        </w:tc>
+        <w:tc>
+          <w:tcPr>
+            <w:tcW w:type="dxa" w:w="7996"/>
+          </w:tcPr>
+          <w:p>
+            <w:r/>
+            <w:r>
+              <w:rPr>
+                <w:sz w:val="17"/>
+              </w:rPr>
+              <w:t>None (read-only aggregation of existing queues).</w:t>
+            </w:r>
+          </w:p>
+        </w:tc>
+      </w:tr>
+      <w:tr>
+        <w:tc>
+          <w:tcPr>
+            <w:tcW w:type="dxa" w:w="1755"/>
+          </w:tcPr>
+          <w:p>
+            <w:r/>
+            <w:r>
+              <w:rPr>
+                <w:sz w:val="17"/>
+              </w:rPr>
+              <w:t>Guardrails</w:t>
+            </w:r>
+          </w:p>
+        </w:tc>
+        <w:tc>
+          <w:tcPr>
+            <w:tcW w:type="dxa" w:w="7996"/>
+          </w:tcPr>
+          <w:p>
+            <w:r/>
+            <w:r>
+              <w:rPr>
+                <w:sz w:val="17"/>
+              </w:rPr>
+              <w:t>Shows only items the role may act on; approvals stay with the approving role (separation of duties, SCA independence, AO authority).</w:t>
+            </w:r>
+          </w:p>
+        </w:tc>
+      </w:tr>
+    </w:tbl>
+    <w:p/>
+    <w:p>
+      <w:pPr>
+        <w:pStyle w:val="Heading3"/>
+      </w:pPr>
+      <w:r>
+        <w:t>System dashboard (/dashboard)</w:t>
+      </w:r>
+    </w:p>
+    <w:tbl>
+      <w:tblPr>
+        <w:tblStyle w:val="TableGrid"/>
+        <w:tblW w:type="auto" w:w="0"/>
+        <w:tblLook w:firstColumn="1" w:firstRow="1" w:lastColumn="0" w:lastRow="0" w:noHBand="0" w:noVBand="1" w:val="04A0"/>
+      </w:tblPr>
+      <w:tblGrid>
+        <w:gridCol w:w="4876"/>
+        <w:gridCol w:w="4876"/>
+      </w:tblGrid>
+      <w:tr>
+        <w:tc>
+          <w:tcPr>
+            <w:tcW w:type="dxa" w:w="1755"/>
+            <w:shd w:val="clear" w:color="auto" w:fill="2597B2"/>
+          </w:tcPr>
+          <w:p>
+            <w:r/>
+            <w:r>
+              <w:rPr>
+                <w:b/>
+                <w:color w:val="FFFFFF"/>
+                <w:sz w:val="17"/>
+              </w:rPr>
+              <w:t>Aspect</w:t>
+            </w:r>
+          </w:p>
+        </w:tc>
+        <w:tc>
+          <w:tcPr>
+            <w:tcW w:type="dxa" w:w="7996"/>
+            <w:shd w:val="clear" w:color="auto" w:fill="2597B2"/>
+          </w:tcPr>
+          <w:p>
+            <w:r/>
+            <w:r>
+              <w:rPr>
+                <w:b/>
+                <w:color w:val="FFFFFF"/>
+                <w:sz w:val="17"/>
+              </w:rPr>
+              <w:t>Detail</w:t>
+            </w:r>
+          </w:p>
+        </w:tc>
+      </w:tr>
+      <w:tr>
+        <w:tc>
+          <w:tcPr>
+            <w:tcW w:type="dxa" w:w="1755"/>
+          </w:tcPr>
+          <w:p>
+            <w:r/>
+            <w:r>
+              <w:rPr>
+                <w:sz w:val="17"/>
+              </w:rPr>
+              <w:t>Purpose</w:t>
+            </w:r>
+          </w:p>
+        </w:tc>
+        <w:tc>
+          <w:tcPr>
+            <w:tcW w:type="dxa" w:w="7996"/>
+          </w:tcPr>
+          <w:p>
+            <w:r/>
+            <w:r>
+              <w:rPr>
+                <w:sz w:val="17"/>
+              </w:rPr>
+              <w:t>One page per system: seven step cards with live status, 'Continue where you left off', pending approvals and the next action.</w:t>
+            </w:r>
+          </w:p>
+        </w:tc>
+      </w:tr>
+      <w:tr>
+        <w:tc>
+          <w:tcPr>
+            <w:tcW w:type="dxa" w:w="1755"/>
+          </w:tcPr>
+          <w:p>
+            <w:r/>
+            <w:r>
+              <w:rPr>
+                <w:sz w:val="17"/>
+              </w:rPr>
+              <w:t>Used by</w:t>
+            </w:r>
+          </w:p>
+        </w:tc>
+        <w:tc>
+          <w:tcPr>
+            <w:tcW w:type="dxa" w:w="7996"/>
+          </w:tcPr>
+          <w:p>
+            <w:r/>
+            <w:r>
+              <w:rPr>
+                <w:sz w:val="17"/>
+              </w:rPr>
+              <w:t>All roles</w:t>
+            </w:r>
+          </w:p>
+        </w:tc>
+      </w:tr>
+      <w:tr>
+        <w:tc>
+          <w:tcPr>
+            <w:tcW w:type="dxa" w:w="1755"/>
+          </w:tcPr>
+          <w:p>
+            <w:r/>
+            <w:r>
+              <w:rPr>
+                <w:sz w:val="17"/>
+              </w:rPr>
+              <w:t>Key actions</w:t>
+            </w:r>
+          </w:p>
+        </w:tc>
+        <w:tc>
+          <w:tcPr>
+            <w:tcW w:type="dxa" w:w="7996"/>
+          </w:tcPr>
+          <w:p>
+            <w:r/>
+            <w:r>
+              <w:rPr>
+                <w:sz w:val="17"/>
+              </w:rPr>
+              <w:t>Open a step; continue the last record.</w:t>
+            </w:r>
+          </w:p>
+        </w:tc>
+      </w:tr>
+      <w:tr>
+        <w:tc>
+          <w:tcPr>
+            <w:tcW w:type="dxa" w:w="1755"/>
+          </w:tcPr>
+          <w:p>
+            <w:r/>
+            <w:r>
+              <w:rPr>
+                <w:sz w:val="17"/>
+              </w:rPr>
+              <w:t>Outputs</w:t>
+            </w:r>
+          </w:p>
+        </w:tc>
+        <w:tc>
+          <w:tcPr>
+            <w:tcW w:type="dxa" w:w="7996"/>
+          </w:tcPr>
+          <w:p>
+            <w:r/>
+            <w:r>
+              <w:rPr>
+                <w:sz w:val="17"/>
+              </w:rPr>
+              <w:t>None (read-only).</w:t>
+            </w:r>
+          </w:p>
+        </w:tc>
+      </w:tr>
+      <w:tr>
+        <w:tc>
+          <w:tcPr>
+            <w:tcW w:type="dxa" w:w="1755"/>
+          </w:tcPr>
+          <w:p>
+            <w:r/>
+            <w:r>
+              <w:rPr>
+                <w:sz w:val="17"/>
+              </w:rPr>
+              <w:t>Guardrails</w:t>
+            </w:r>
+          </w:p>
+        </w:tc>
+        <w:tc>
+          <w:tcPr>
+            <w:tcW w:type="dxa" w:w="7996"/>
+          </w:tcPr>
+          <w:p>
+            <w:r/>
+            <w:r>
+              <w:rPr>
+                <w:sz w:val="17"/>
+              </w:rPr>
+              <w:t>Statuses are computed, never edited.</w:t>
+            </w:r>
+          </w:p>
+        </w:tc>
+      </w:tr>
+    </w:tbl>
+    <w:p/>
+    <w:p>
+      <w:pPr>
+        <w:pStyle w:val="Heading3"/>
+      </w:pPr>
+      <w:r>
+        <w:t>Guided Mode (header toggle)</w:t>
+      </w:r>
+    </w:p>
+    <w:tbl>
+      <w:tblPr>
+        <w:tblStyle w:val="TableGrid"/>
+        <w:tblW w:type="auto" w:w="0"/>
+        <w:tblLook w:firstColumn="1" w:firstRow="1" w:lastColumn="0" w:lastRow="0" w:noHBand="0" w:noVBand="1" w:val="04A0"/>
+      </w:tblPr>
+      <w:tblGrid>
+        <w:gridCol w:w="4876"/>
+        <w:gridCol w:w="4876"/>
+      </w:tblGrid>
+      <w:tr>
+        <w:tc>
+          <w:tcPr>
+            <w:tcW w:type="dxa" w:w="1755"/>
+            <w:shd w:val="clear" w:color="auto" w:fill="2597B2"/>
+          </w:tcPr>
+          <w:p>
+            <w:r/>
+            <w:r>
+              <w:rPr>
+                <w:b/>
+                <w:color w:val="FFFFFF"/>
+                <w:sz w:val="17"/>
+              </w:rPr>
+              <w:t>Aspect</w:t>
+            </w:r>
+          </w:p>
+        </w:tc>
+        <w:tc>
+          <w:tcPr>
+            <w:tcW w:type="dxa" w:w="7996"/>
+            <w:shd w:val="clear" w:color="auto" w:fill="2597B2"/>
+          </w:tcPr>
+          <w:p>
+            <w:r/>
+            <w:r>
+              <w:rPr>
+                <w:b/>
+                <w:color w:val="FFFFFF"/>
+                <w:sz w:val="17"/>
+              </w:rPr>
+              <w:t>Detail</w:t>
+            </w:r>
+          </w:p>
+        </w:tc>
+      </w:tr>
+      <w:tr>
+        <w:tc>
+          <w:tcPr>
+            <w:tcW w:type="dxa" w:w="1755"/>
+          </w:tcPr>
+          <w:p>
+            <w:r/>
+            <w:r>
+              <w:rPr>
+                <w:sz w:val="17"/>
+              </w:rPr>
+              <w:t>Purpose</w:t>
+            </w:r>
+          </w:p>
+        </w:tc>
+        <w:tc>
+          <w:tcPr>
+            <w:tcW w:type="dxa" w:w="7996"/>
+          </w:tcPr>
+          <w:p>
+            <w:r/>
+            <w:r>
+              <w:rPr>
+                <w:sz w:val="17"/>
+              </w:rPr>
+              <w:t>Per user and off by default; offered once at first login. Adds to every step its purpose, why it matters, what you need, who does it and what comes next.</w:t>
+            </w:r>
+          </w:p>
+        </w:tc>
+      </w:tr>
+      <w:tr>
+        <w:tc>
+          <w:tcPr>
+            <w:tcW w:type="dxa" w:w="1755"/>
+          </w:tcPr>
+          <w:p>
+            <w:r/>
+            <w:r>
+              <w:rPr>
+                <w:sz w:val="17"/>
+              </w:rPr>
+              <w:t>Used by</w:t>
+            </w:r>
+          </w:p>
+        </w:tc>
+        <w:tc>
+          <w:tcPr>
+            <w:tcW w:type="dxa" w:w="7996"/>
+          </w:tcPr>
+          <w:p>
+            <w:r/>
+            <w:r>
+              <w:rPr>
+                <w:sz w:val="17"/>
+              </w:rPr>
+              <w:t>All roles</w:t>
+            </w:r>
+          </w:p>
+        </w:tc>
+      </w:tr>
+      <w:tr>
+        <w:tc>
+          <w:tcPr>
+            <w:tcW w:type="dxa" w:w="1755"/>
+          </w:tcPr>
+          <w:p>
+            <w:r/>
+            <w:r>
+              <w:rPr>
+                <w:sz w:val="17"/>
+              </w:rPr>
+              <w:t>Key actions</w:t>
+            </w:r>
+          </w:p>
+        </w:tc>
+        <w:tc>
+          <w:tcPr>
+            <w:tcW w:type="dxa" w:w="7996"/>
+          </w:tcPr>
+          <w:p>
+            <w:r/>
+            <w:r>
+              <w:rPr>
+                <w:sz w:val="17"/>
+              </w:rPr>
+              <w:t>Switch on or off at any time.</w:t>
+            </w:r>
+          </w:p>
+        </w:tc>
+      </w:tr>
+      <w:tr>
+        <w:tc>
+          <w:tcPr>
+            <w:tcW w:type="dxa" w:w="1755"/>
+          </w:tcPr>
+          <w:p>
+            <w:r/>
+            <w:r>
+              <w:rPr>
+                <w:sz w:val="17"/>
+              </w:rPr>
+              <w:t>Outputs</w:t>
+            </w:r>
+          </w:p>
+        </w:tc>
+        <w:tc>
+          <w:tcPr>
+            <w:tcW w:type="dxa" w:w="7996"/>
+          </w:tcPr>
+          <w:p>
+            <w:r/>
+            <w:r>
+              <w:rPr>
+                <w:sz w:val="17"/>
+              </w:rPr>
+              <w:t>None.</w:t>
+            </w:r>
+          </w:p>
+        </w:tc>
+      </w:tr>
+      <w:tr>
+        <w:tc>
+          <w:tcPr>
+            <w:tcW w:type="dxa" w:w="1755"/>
+          </w:tcPr>
+          <w:p>
+            <w:r/>
+            <w:r>
+              <w:rPr>
+                <w:sz w:val="17"/>
+              </w:rPr>
+              <w:t>Guardrails</w:t>
+            </w:r>
+          </w:p>
+        </w:tc>
+        <w:tc>
+          <w:tcPr>
+            <w:tcW w:type="dxa" w:w="7996"/>
+          </w:tcPr>
+          <w:p>
+            <w:r/>
+            <w:r>
+              <w:rPr>
+                <w:sz w:val="17"/>
+              </w:rPr>
+              <w:t>Same data, permissions and workflow rules as the streamlined mode – only explanations are added.</w:t>
+            </w:r>
+          </w:p>
+        </w:tc>
+      </w:tr>
+    </w:tbl>
+    <w:p/>
+    <w:p>
+      <w:pPr>
+        <w:jc w:val="center"/>
+      </w:pPr>
+      <w:r>
+        <w:drawing>
+          <wp:inline xmlns:a="http://schemas.openxmlformats.org/drawingml/2006/main" xmlns:pic="http://schemas.openxmlformats.org/drawingml/2006/picture">
+            <wp:extent cx="5696639" cy="3560399"/>
+            <wp:docPr id="5" name="Picture 5"/>
+            <wp:cNvGraphicFramePr>
+              <a:graphicFrameLocks noChangeAspect="1"/>
+            </wp:cNvGraphicFramePr>
+            <a:graphic>
+              <a:graphicData uri="http://schemas.openxmlformats.org/drawingml/2006/picture">
+                <pic:pic>
+                  <pic:nvPicPr>
+                    <pic:cNvPr id="0" name="implemented_dashboard.jpg"/>
+                    <pic:cNvPicPr/>
+                  </pic:nvPicPr>
+                  <pic:blipFill>
+                    <a:blip r:embed="rId14"/>
+                    <a:stretch>
+                      <a:fillRect/>
+                    </a:stretch>
+                  </pic:blipFill>
+                  <pic:spPr>
+                    <a:xfrm>
+                      <a:off x="0" y="0"/>
+                      <a:ext cx="5696639" cy="3560399"/>
+                    </a:xfrm>
+                    <a:prstGeom prst="rect"/>
+                  </pic:spPr>
+                </pic:pic>
+              </a:graphicData>
+            </a:graphic>
+          </wp:inline>
+        </w:drawing>
+      </w:r>
+    </w:p>
+    <w:p>
+      <w:pPr>
+        <w:jc w:val="center"/>
+      </w:pPr>
+      <w:r>
+        <w:rPr>
+          <w:color w:val="4B6470"/>
+          <w:sz w:val="17"/>
+        </w:rPr>
+        <w:t>Figure: System dashboard with the RMF navigation</w:t>
+      </w:r>
+    </w:p>
+    <w:p>
+      <w:pPr>
+        <w:jc w:val="center"/>
+      </w:pPr>
+      <w:r>
+        <w:drawing>
+          <wp:inline xmlns:a="http://schemas.openxmlformats.org/drawingml/2006/main" xmlns:pic="http://schemas.openxmlformats.org/drawingml/2006/picture">
+            <wp:extent cx="5696639" cy="3560399"/>
+            <wp:docPr id="6" name="Picture 6"/>
+            <wp:cNvGraphicFramePr>
+              <a:graphicFrameLocks noChangeAspect="1"/>
+            </wp:cNvGraphicFramePr>
+            <a:graphic>
+              <a:graphicData uri="http://schemas.openxmlformats.org/drawingml/2006/picture">
+                <pic:pic>
+                  <pic:nvPicPr>
+                    <pic:cNvPr id="0" name="implemented_guided_on.jpg"/>
+                    <pic:cNvPicPr/>
+                  </pic:nvPicPr>
+                  <pic:blipFill>
+                    <a:blip r:embed="rId15"/>
+                    <a:stretch>
+                      <a:fillRect/>
+                    </a:stretch>
+                  </pic:blipFill>
+                  <pic:spPr>
+                    <a:xfrm>
+                      <a:off x="0" y="0"/>
+                      <a:ext cx="5696639" cy="3560399"/>
+                    </a:xfrm>
+                    <a:prstGeom prst="rect"/>
+                  </pic:spPr>
+                </pic:pic>
+              </a:graphicData>
+            </a:graphic>
+          </wp:inline>
+        </w:drawing>
+      </w:r>
+    </w:p>
+    <w:p>
+      <w:pPr>
+        <w:jc w:val="center"/>
+      </w:pPr>
+      <w:r>
+        <w:rPr>
+          <w:color w:val="4B6470"/>
+          <w:sz w:val="17"/>
+        </w:rPr>
+        <w:t>Figure: Guided Mode on (Categorize)</w:t>
+      </w:r>
+    </w:p>
+    <w:p>
+      <w:pPr>
+        <w:pStyle w:val="Heading3"/>
+      </w:pPr>
+      <w:r>
         <w:t>Getting started – RMF overview (/rmf-workflow)</w:t>
       </w:r>
     </w:p>
@@ -2980,7 +3700,7 @@
         <w:drawing>
           <wp:inline xmlns:a="http://schemas.openxmlformats.org/drawingml/2006/main" xmlns:pic="http://schemas.openxmlformats.org/drawingml/2006/picture">
             <wp:extent cx="5572800" cy="3134700"/>
-            <wp:docPr id="5" name="Picture 5"/>
+            <wp:docPr id="7" name="Picture 7"/>
             <wp:cNvGraphicFramePr>
               <a:graphicFrameLocks noChangeAspect="1"/>
             </wp:cNvGraphicFramePr>
@@ -2992,7 +3712,7 @@
                     <pic:cNvPicPr/>
                   </pic:nvPicPr>
                   <pic:blipFill>
-                    <a:blip r:embed="rId14"/>
+                    <a:blip r:embed="rId16"/>
                     <a:stretch>
                       <a:fillRect/>
                     </a:stretch>
@@ -3459,7 +4179,7 @@
         <w:drawing>
           <wp:inline xmlns:a="http://schemas.openxmlformats.org/drawingml/2006/main" xmlns:pic="http://schemas.openxmlformats.org/drawingml/2006/picture">
             <wp:extent cx="5572800" cy="3483000"/>
-            <wp:docPr id="6" name="Picture 6"/>
+            <wp:docPr id="8" name="Picture 8"/>
             <wp:cNvGraphicFramePr>
               <a:graphicFrameLocks noChangeAspect="1"/>
             </wp:cNvGraphicFramePr>
@@ -3471,7 +4191,7 @@
                     <pic:cNvPicPr/>
                   </pic:nvPicPr>
                   <pic:blipFill>
-                    <a:blip r:embed="rId15"/>
+                    <a:blip r:embed="rId17"/>
                     <a:stretch>
                       <a:fillRect/>
                     </a:stretch>
@@ -3724,7 +4444,7 @@
         <w:drawing>
           <wp:inline xmlns:a="http://schemas.openxmlformats.org/drawingml/2006/main" xmlns:pic="http://schemas.openxmlformats.org/drawingml/2006/picture">
             <wp:extent cx="5572800" cy="3483000"/>
-            <wp:docPr id="7" name="Picture 7"/>
+            <wp:docPr id="9" name="Picture 9"/>
             <wp:cNvGraphicFramePr>
               <a:graphicFrameLocks noChangeAspect="1"/>
             </wp:cNvGraphicFramePr>
@@ -3736,7 +4456,7 @@
                     <pic:cNvPicPr/>
                   </pic:nvPicPr>
                   <pic:blipFill>
-                    <a:blip r:embed="rId16"/>
+                    <a:blip r:embed="rId18"/>
                     <a:stretch>
                       <a:fillRect/>
                     </a:stretch>
@@ -3775,7 +4495,7 @@
         <w:drawing>
           <wp:inline xmlns:a="http://schemas.openxmlformats.org/drawingml/2006/main" xmlns:pic="http://schemas.openxmlformats.org/drawingml/2006/picture">
             <wp:extent cx="5572800" cy="3483000"/>
-            <wp:docPr id="8" name="Picture 8"/>
+            <wp:docPr id="10" name="Picture 10"/>
             <wp:cNvGraphicFramePr>
               <a:graphicFrameLocks noChangeAspect="1"/>
             </wp:cNvGraphicFramePr>
@@ -3787,7 +4507,7 @@
                     <pic:cNvPicPr/>
                   </pic:nvPicPr>
                   <pic:blipFill>
-                    <a:blip r:embed="rId17"/>
+                    <a:blip r:embed="rId19"/>
                     <a:stretch>
                       <a:fillRect/>
                     </a:stretch>
@@ -4317,7 +5037,7 @@
               <w:rPr>
                 <w:sz w:val="17"/>
               </w:rPr>
-              <w:t>The ISSO's main workspace: one control at a time with status, implementation statement, parameters, inheritance, evidence, mapped policies, CCIs, findings and assessment.</w:t>
+              <w:t>The ISSO's main workspace: the control list (two primary filters, more filters collapsed, saved per system) beside one control in six tabs – Requirements, Implementation, Evidence &amp; Policies, Assessment, Findings &amp; POA&amp;M, Monitoring. Status chips use one glossary (implementation, policy coverage, assessment determination, authorization, evidence freshness, POA&amp;M) with tooltips; advanced eMASS fields are collapsed, not removed.</w:t>
             </w:r>
           </w:p>
         </w:tc>
@@ -4347,7 +5067,7 @@
               <w:rPr>
                 <w:sz w:val="17"/>
               </w:rPr>
-              <w:t>ISSO, System Owner, SCA (assessment section)</w:t>
+              <w:t>ISSO, System Owner, SCA (assessment tab)</w:t>
             </w:r>
           </w:p>
         </w:tc>
@@ -4613,7 +5333,7 @@
               <w:rPr>
                 <w:sz w:val="17"/>
               </w:rPr>
-              <w:t>eMASS-formatted Implementation Plan xlsx (compatibility pending human verification), validation report, OSCAL SSP props/remarks, MOCKED eMASS sync payload with eMASS API field names.</w:t>
+              <w:t>eMASS-formatted Implementation Plan xlsx (exported from the migration report and Authorize › Package &amp; documents; the parameter comparison CSV is in Select › Tailoring &amp; parameters; compatibility pending human verification), validation report, OSCAL SSP props/remarks, MOCKED eMASS sync payload with eMASS API field names.</w:t>
             </w:r>
           </w:p>
         </w:tc>
@@ -4657,8 +5377,8 @@
       <w:r>
         <w:drawing>
           <wp:inline xmlns:a="http://schemas.openxmlformats.org/drawingml/2006/main" xmlns:pic="http://schemas.openxmlformats.org/drawingml/2006/picture">
-            <wp:extent cx="5696639" cy="3204359"/>
-            <wp:docPr id="9" name="Picture 9"/>
+            <wp:extent cx="5696639" cy="3560399"/>
+            <wp:docPr id="11" name="Picture 11"/>
             <wp:cNvGraphicFramePr>
               <a:graphicFrameLocks noChangeAspect="1"/>
             </wp:cNvGraphicFramePr>
@@ -4666,11 +5386,11 @@
               <a:graphicData uri="http://schemas.openxmlformats.org/drawingml/2006/picture">
                 <pic:pic>
                   <pic:nvPicPr>
-                    <pic:cNvPr id="0" name="screenshots_controls-workbench-cm6-light.jpg"/>
+                    <pic:cNvPr id="0" name="implemented_workbench.jpg"/>
                     <pic:cNvPicPr/>
                   </pic:nvPicPr>
                   <pic:blipFill>
-                    <a:blip r:embed="rId18"/>
+                    <a:blip r:embed="rId20"/>
                     <a:stretch>
                       <a:fillRect/>
                     </a:stretch>
@@ -4678,7 +5398,7 @@
                   <pic:spPr>
                     <a:xfrm>
                       <a:off x="0" y="0"/>
-                      <a:ext cx="5696639" cy="3204359"/>
+                      <a:ext cx="5696639" cy="3560399"/>
                     </a:xfrm>
                     <a:prstGeom prst="rect"/>
                   </pic:spPr>
@@ -4698,7 +5418,7 @@
           <w:color w:val="4B6470"/>
           <w:sz w:val="17"/>
         </w:rPr>
-        <w:t>Figure: Control Workbench (CM-6)</w:t>
+        <w:t>Figure: Control Workbench: list and control tabs</w:t>
       </w:r>
     </w:p>
     <w:p>
@@ -5121,7 +5841,7 @@
         <w:drawing>
           <wp:inline xmlns:a="http://schemas.openxmlformats.org/drawingml/2006/main" xmlns:pic="http://schemas.openxmlformats.org/drawingml/2006/picture">
             <wp:extent cx="5572800" cy="3831300"/>
-            <wp:docPr id="10" name="Picture 10"/>
+            <wp:docPr id="12" name="Picture 12"/>
             <wp:cNvGraphicFramePr>
               <a:graphicFrameLocks noChangeAspect="1"/>
             </wp:cNvGraphicFramePr>
@@ -5133,7 +5853,7 @@
                     <pic:cNvPicPr/>
                   </pic:nvPicPr>
                   <pic:blipFill>
-                    <a:blip r:embed="rId19"/>
+                    <a:blip r:embed="rId21"/>
                     <a:stretch>
                       <a:fillRect/>
                     </a:stretch>
@@ -5584,7 +6304,7 @@
         <w:drawing>
           <wp:inline xmlns:a="http://schemas.openxmlformats.org/drawingml/2006/main" xmlns:pic="http://schemas.openxmlformats.org/drawingml/2006/picture">
             <wp:extent cx="5572800" cy="3483000"/>
-            <wp:docPr id="11" name="Picture 11"/>
+            <wp:docPr id="13" name="Picture 13"/>
             <wp:cNvGraphicFramePr>
               <a:graphicFrameLocks noChangeAspect="1"/>
             </wp:cNvGraphicFramePr>
@@ -5596,7 +6316,7 @@
                     <pic:cNvPicPr/>
                   </pic:nvPicPr>
                   <pic:blipFill>
-                    <a:blip r:embed="rId20"/>
+                    <a:blip r:embed="rId22"/>
                     <a:stretch>
                       <a:fillRect/>
                     </a:stretch>
@@ -5891,7 +6611,7 @@
         <w:drawing>
           <wp:inline xmlns:a="http://schemas.openxmlformats.org/drawingml/2006/main" xmlns:pic="http://schemas.openxmlformats.org/drawingml/2006/picture">
             <wp:extent cx="5572800" cy="3483000"/>
-            <wp:docPr id="12" name="Picture 12"/>
+            <wp:docPr id="14" name="Picture 14"/>
             <wp:cNvGraphicFramePr>
               <a:graphicFrameLocks noChangeAspect="1"/>
             </wp:cNvGraphicFramePr>
@@ -5903,7 +6623,7 @@
                     <pic:cNvPicPr/>
                   </pic:nvPicPr>
                   <pic:blipFill>
-                    <a:blip r:embed="rId21"/>
+                    <a:blip r:embed="rId23"/>
                     <a:stretch>
                       <a:fillRect/>
                     </a:stretch>
@@ -5947,6 +6667,263 @@
         <w:pStyle w:val="Heading3"/>
       </w:pPr>
       <w:r>
+        <w:t>SCA assessment workspace (/assess/workspace)</w:t>
+      </w:r>
+    </w:p>
+    <w:tbl>
+      <w:tblPr>
+        <w:tblStyle w:val="TableGrid"/>
+        <w:tblW w:type="auto" w:w="0"/>
+        <w:tblLook w:firstColumn="1" w:firstRow="1" w:lastColumn="0" w:lastRow="0" w:noHBand="0" w:noVBand="1" w:val="04A0"/>
+      </w:tblPr>
+      <w:tblGrid>
+        <w:gridCol w:w="4876"/>
+        <w:gridCol w:w="4876"/>
+      </w:tblGrid>
+      <w:tr>
+        <w:tc>
+          <w:tcPr>
+            <w:tcW w:type="dxa" w:w="1755"/>
+            <w:shd w:val="clear" w:color="auto" w:fill="2597B2"/>
+          </w:tcPr>
+          <w:p>
+            <w:r/>
+            <w:r>
+              <w:rPr>
+                <w:b/>
+                <w:color w:val="FFFFFF"/>
+                <w:sz w:val="17"/>
+              </w:rPr>
+              <w:t>Aspect</w:t>
+            </w:r>
+          </w:p>
+        </w:tc>
+        <w:tc>
+          <w:tcPr>
+            <w:tcW w:type="dxa" w:w="7996"/>
+            <w:shd w:val="clear" w:color="auto" w:fill="2597B2"/>
+          </w:tcPr>
+          <w:p>
+            <w:r/>
+            <w:r>
+              <w:rPr>
+                <w:b/>
+                <w:color w:val="FFFFFF"/>
+                <w:sz w:val="17"/>
+              </w:rPr>
+              <w:t>Detail</w:t>
+            </w:r>
+          </w:p>
+        </w:tc>
+      </w:tr>
+      <w:tr>
+        <w:tc>
+          <w:tcPr>
+            <w:tcW w:type="dxa" w:w="1755"/>
+          </w:tcPr>
+          <w:p>
+            <w:r/>
+            <w:r>
+              <w:rPr>
+                <w:sz w:val="17"/>
+              </w:rPr>
+              <w:t>Purpose</w:t>
+            </w:r>
+          </w:p>
+        </w:tc>
+        <w:tc>
+          <w:tcPr>
+            <w:tcW w:type="dxa" w:w="7996"/>
+          </w:tcPr>
+          <w:p>
+            <w:r/>
+            <w:r>
+              <w:rPr>
+                <w:sz w:val="17"/>
+              </w:rPr>
+              <w:t>The SCA's single place to work: the assessment queue, imported Test Result workbooks waiting for review and the determination for the selected control with its implementation statement and evidence.</w:t>
+            </w:r>
+          </w:p>
+        </w:tc>
+      </w:tr>
+      <w:tr>
+        <w:tc>
+          <w:tcPr>
+            <w:tcW w:type="dxa" w:w="1755"/>
+          </w:tcPr>
+          <w:p>
+            <w:r/>
+            <w:r>
+              <w:rPr>
+                <w:sz w:val="17"/>
+              </w:rPr>
+              <w:t>Used by</w:t>
+            </w:r>
+          </w:p>
+        </w:tc>
+        <w:tc>
+          <w:tcPr>
+            <w:tcW w:type="dxa" w:w="7996"/>
+          </w:tcPr>
+          <w:p>
+            <w:r/>
+            <w:r>
+              <w:rPr>
+                <w:sz w:val="17"/>
+              </w:rPr>
+              <w:t>SCA</w:t>
+            </w:r>
+          </w:p>
+        </w:tc>
+      </w:tr>
+      <w:tr>
+        <w:tc>
+          <w:tcPr>
+            <w:tcW w:type="dxa" w:w="1755"/>
+          </w:tcPr>
+          <w:p>
+            <w:r/>
+            <w:r>
+              <w:rPr>
+                <w:sz w:val="17"/>
+              </w:rPr>
+              <w:t>Key actions</w:t>
+            </w:r>
+          </w:p>
+        </w:tc>
+        <w:tc>
+          <w:tcPr>
+            <w:tcW w:type="dxa" w:w="7996"/>
+          </w:tcPr>
+          <w:p>
+            <w:r/>
+            <w:r>
+              <w:rPr>
+                <w:sz w:val="17"/>
+              </w:rPr>
+              <w:t>Pick a control; review statement and evidence; record the determination; open the next one.</w:t>
+            </w:r>
+          </w:p>
+        </w:tc>
+      </w:tr>
+      <w:tr>
+        <w:tc>
+          <w:tcPr>
+            <w:tcW w:type="dxa" w:w="1755"/>
+          </w:tcPr>
+          <w:p>
+            <w:r/>
+            <w:r>
+              <w:rPr>
+                <w:sz w:val="17"/>
+              </w:rPr>
+              <w:t>Outputs</w:t>
+            </w:r>
+          </w:p>
+        </w:tc>
+        <w:tc>
+          <w:tcPr>
+            <w:tcW w:type="dxa" w:w="7996"/>
+          </w:tcPr>
+          <w:p>
+            <w:r/>
+            <w:r>
+              <w:rPr>
+                <w:sz w:val="17"/>
+              </w:rPr>
+              <w:t>Assessment determinations (existing assessment service).</w:t>
+            </w:r>
+          </w:p>
+        </w:tc>
+      </w:tr>
+      <w:tr>
+        <w:tc>
+          <w:tcPr>
+            <w:tcW w:type="dxa" w:w="1755"/>
+          </w:tcPr>
+          <w:p>
+            <w:r/>
+            <w:r>
+              <w:rPr>
+                <w:sz w:val="17"/>
+              </w:rPr>
+              <w:t>Guardrails</w:t>
+            </w:r>
+          </w:p>
+        </w:tc>
+        <w:tc>
+          <w:tcPr>
+            <w:tcW w:type="dxa" w:w="7996"/>
+          </w:tcPr>
+          <w:p>
+            <w:r/>
+            <w:r>
+              <w:rPr>
+                <w:sz w:val="17"/>
+              </w:rPr>
+              <w:t>Only the SCA records determinations; the workspace reuses the existing permissions and SCA independence rules.</w:t>
+            </w:r>
+          </w:p>
+        </w:tc>
+      </w:tr>
+    </w:tbl>
+    <w:p/>
+    <w:p>
+      <w:pPr>
+        <w:jc w:val="center"/>
+      </w:pPr>
+      <w:r>
+        <w:drawing>
+          <wp:inline xmlns:a="http://schemas.openxmlformats.org/drawingml/2006/main" xmlns:pic="http://schemas.openxmlformats.org/drawingml/2006/picture">
+            <wp:extent cx="5572800" cy="3483000"/>
+            <wp:docPr id="15" name="Picture 15"/>
+            <wp:cNvGraphicFramePr>
+              <a:graphicFrameLocks noChangeAspect="1"/>
+            </wp:cNvGraphicFramePr>
+            <a:graphic>
+              <a:graphicData uri="http://schemas.openxmlformats.org/drawingml/2006/picture">
+                <pic:pic>
+                  <pic:nvPicPr>
+                    <pic:cNvPr id="0" name="implemented_sca_workspace.jpg"/>
+                    <pic:cNvPicPr/>
+                  </pic:nvPicPr>
+                  <pic:blipFill>
+                    <a:blip r:embed="rId24"/>
+                    <a:stretch>
+                      <a:fillRect/>
+                    </a:stretch>
+                  </pic:blipFill>
+                  <pic:spPr>
+                    <a:xfrm>
+                      <a:off x="0" y="0"/>
+                      <a:ext cx="5572800" cy="3483000"/>
+                    </a:xfrm>
+                    <a:prstGeom prst="rect"/>
+                  </pic:spPr>
+                </pic:pic>
+              </a:graphicData>
+            </a:graphic>
+          </wp:inline>
+        </w:drawing>
+      </w:r>
+    </w:p>
+    <w:p>
+      <w:pPr>
+        <w:jc w:val="center"/>
+      </w:pPr>
+      <w:r>
+        <w:rPr>
+          <w:color w:val="4B6470"/>
+          <w:sz w:val="17"/>
+        </w:rPr>
+        <w:t>Figure: SCA assessment workspace</w:t>
+      </w:r>
+    </w:p>
+    <w:p>
+      <w:pPr>
+        <w:pStyle w:val="Heading3"/>
+      </w:pPr>
+      <w:r>
         <w:t>Assessment progress (/rmf/assess)</w:t>
       </w:r>
     </w:p>
@@ -6568,7 +7545,7 @@
         <w:drawing>
           <wp:inline xmlns:a="http://schemas.openxmlformats.org/drawingml/2006/main" xmlns:pic="http://schemas.openxmlformats.org/drawingml/2006/picture">
             <wp:extent cx="5572800" cy="3483000"/>
-            <wp:docPr id="13" name="Picture 13"/>
+            <wp:docPr id="16" name="Picture 16"/>
             <wp:cNvGraphicFramePr>
               <a:graphicFrameLocks noChangeAspect="1"/>
             </wp:cNvGraphicFramePr>
@@ -6580,7 +7557,7 @@
                     <pic:cNvPicPr/>
                   </pic:nvPicPr>
                   <pic:blipFill>
-                    <a:blip r:embed="rId22"/>
+                    <a:blip r:embed="rId25"/>
                     <a:stretch>
                       <a:fillRect/>
                     </a:stretch>
@@ -6690,7 +7667,7 @@
               <w:rPr>
                 <w:sz w:val="17"/>
               </w:rPr>
-              <w:t>One queue for status suggestions, policy proposals, unmapped findings and asset correlations, with a side-by-side view of the source passage and the control requirement.</w:t>
+              <w:t>One queue in three main tabs – policy coverage, STIG mappings, status suggestions (plus All, status-from-policy and awaiting SCA) – with a side-by-side view of the source passage and the control requirement. Pending suggestions are also shown on the control.</w:t>
             </w:r>
           </w:p>
         </w:tc>
@@ -6825,7 +7802,7 @@
         <w:drawing>
           <wp:inline xmlns:a="http://schemas.openxmlformats.org/drawingml/2006/main" xmlns:pic="http://schemas.openxmlformats.org/drawingml/2006/picture">
             <wp:extent cx="5572800" cy="3483000"/>
-            <wp:docPr id="14" name="Picture 14"/>
+            <wp:docPr id="17" name="Picture 17"/>
             <wp:cNvGraphicFramePr>
               <a:graphicFrameLocks noChangeAspect="1"/>
             </wp:cNvGraphicFramePr>
@@ -6837,7 +7814,7 @@
                     <pic:cNvPicPr/>
                   </pic:nvPicPr>
                   <pic:blipFill>
-                    <a:blip r:embed="rId23"/>
+                    <a:blip r:embed="rId26"/>
                     <a:stretch>
                       <a:fillRect/>
                     </a:stretch>
@@ -7090,7 +8067,7 @@
         <w:drawing>
           <wp:inline xmlns:a="http://schemas.openxmlformats.org/drawingml/2006/main" xmlns:pic="http://schemas.openxmlformats.org/drawingml/2006/picture">
             <wp:extent cx="5448960" cy="3405600"/>
-            <wp:docPr id="15" name="Picture 15"/>
+            <wp:docPr id="18" name="Picture 18"/>
             <wp:cNvGraphicFramePr>
               <a:graphicFrameLocks noChangeAspect="1"/>
             </wp:cNvGraphicFramePr>
@@ -7102,7 +8079,7 @@
                     <pic:cNvPicPr/>
                   </pic:nvPicPr>
                   <pic:blipFill>
-                    <a:blip r:embed="rId24"/>
+                    <a:blip r:embed="rId27"/>
                     <a:stretch>
                       <a:fillRect/>
                     </a:stretch>
@@ -7347,7 +8324,7 @@
         <w:drawing>
           <wp:inline xmlns:a="http://schemas.openxmlformats.org/drawingml/2006/main" xmlns:pic="http://schemas.openxmlformats.org/drawingml/2006/picture">
             <wp:extent cx="5572800" cy="3134700"/>
-            <wp:docPr id="16" name="Picture 16"/>
+            <wp:docPr id="19" name="Picture 19"/>
             <wp:cNvGraphicFramePr>
               <a:graphicFrameLocks noChangeAspect="1"/>
             </wp:cNvGraphicFramePr>
@@ -7359,7 +8336,7 @@
                     <pic:cNvPicPr/>
                   </pic:nvPicPr>
                   <pic:blipFill>
-                    <a:blip r:embed="rId25"/>
+                    <a:blip r:embed="rId28"/>
                     <a:stretch>
                       <a:fillRect/>
                     </a:stretch>
@@ -8087,7 +9064,7 @@
         <w:drawing>
           <wp:inline xmlns:a="http://schemas.openxmlformats.org/drawingml/2006/main" xmlns:pic="http://schemas.openxmlformats.org/drawingml/2006/picture">
             <wp:extent cx="5572800" cy="3134700"/>
-            <wp:docPr id="17" name="Picture 17"/>
+            <wp:docPr id="20" name="Picture 20"/>
             <wp:cNvGraphicFramePr>
               <a:graphicFrameLocks noChangeAspect="1"/>
             </wp:cNvGraphicFramePr>
@@ -8099,7 +9076,7 @@
                     <pic:cNvPicPr/>
                   </pic:nvPicPr>
                   <pic:blipFill>
-                    <a:blip r:embed="rId26"/>
+                    <a:blip r:embed="rId29"/>
                     <a:stretch>
                       <a:fillRect/>
                     </a:stretch>
@@ -11784,7 +12761,7 @@
         <w:drawing>
           <wp:inline xmlns:a="http://schemas.openxmlformats.org/drawingml/2006/main" xmlns:pic="http://schemas.openxmlformats.org/drawingml/2006/picture">
             <wp:extent cx="5263200" cy="3289500"/>
-            <wp:docPr id="18" name="Picture 18"/>
+            <wp:docPr id="21" name="Picture 21"/>
             <wp:cNvGraphicFramePr>
               <a:graphicFrameLocks noChangeAspect="1"/>
             </wp:cNvGraphicFramePr>
@@ -11796,7 +12773,7 @@
                     <pic:cNvPicPr/>
                   </pic:nvPicPr>
                   <pic:blipFill>
-                    <a:blip r:embed="rId27"/>
+                    <a:blip r:embed="rId30"/>
                     <a:stretch>
                       <a:fillRect/>
                     </a:stretch>
@@ -11926,7 +12903,7 @@
         <w:drawing>
           <wp:inline xmlns:a="http://schemas.openxmlformats.org/drawingml/2006/main" xmlns:pic="http://schemas.openxmlformats.org/drawingml/2006/picture">
             <wp:extent cx="5448960" cy="3524796"/>
-            <wp:docPr id="19" name="Picture 19"/>
+            <wp:docPr id="22" name="Picture 22"/>
             <wp:cNvGraphicFramePr>
               <a:graphicFrameLocks noChangeAspect="1"/>
             </wp:cNvGraphicFramePr>
@@ -11938,7 +12915,7 @@
                     <pic:cNvPicPr/>
                   </pic:nvPicPr>
                   <pic:blipFill>
-                    <a:blip r:embed="rId28"/>
+                    <a:blip r:embed="rId31"/>
                     <a:stretch>
                       <a:fillRect/>
                     </a:stretch>
@@ -12065,7 +13042,7 @@
         <w:drawing>
           <wp:inline xmlns:a="http://schemas.openxmlformats.org/drawingml/2006/main" xmlns:pic="http://schemas.openxmlformats.org/drawingml/2006/picture">
             <wp:extent cx="6192000" cy="3803657"/>
-            <wp:docPr id="20" name="Picture 20"/>
+            <wp:docPr id="23" name="Picture 23"/>
             <wp:cNvGraphicFramePr>
               <a:graphicFrameLocks noChangeAspect="1"/>
             </wp:cNvGraphicFramePr>
@@ -12077,7 +13054,7 @@
                     <pic:cNvPicPr/>
                   </pic:nvPicPr>
                   <pic:blipFill>
-                    <a:blip r:embed="rId29"/>
+                    <a:blip r:embed="rId32"/>
                     <a:stretch>
                       <a:fillRect/>
                     </a:stretch>
@@ -14815,7 +15792,7 @@
         <w:rPr>
           <w:b/>
         </w:rPr>
-        <w:t>281 paths, 306 operations</w:t>
+        <w:t>292 paths, 318 operations</w:t>
       </w:r>
       <w:r>
         <w:t>, grouped by the first path segment under /api/v1. Every mutating operation requires a permission (see section 11); only sign-in, demo login, refresh, logout, sign-up, health and the public whitepaper downloads are unauthenticated.</w:t>
@@ -15732,7 +16709,7 @@
               <w:rPr>
                 <w:sz w:val="17"/>
               </w:rPr>
-              <w:t>emass-imports</w:t>
+              <w:t>emass-import-settings</w:t>
             </w:r>
           </w:p>
         </w:tc>
@@ -15746,7 +16723,7 @@
               <w:rPr>
                 <w:sz w:val="17"/>
               </w:rPr>
-              <w:t>8</w:t>
+              <w:t>2</w:t>
             </w:r>
           </w:p>
         </w:tc>
@@ -15760,7 +16737,7 @@
               <w:rPr>
                 <w:sz w:val="17"/>
               </w:rPr>
-              <w:t>GET /emass-imports; GET /emass-imports/samples/{report_type}; GET /emass-imports/{import_id}; POST /emass-imports …</w:t>
+              <w:t>GET /emass-import-settings/ai; PUT /emass-import-settings/ai</w:t>
             </w:r>
           </w:p>
         </w:tc>
@@ -15776,7 +16753,7 @@
               <w:rPr>
                 <w:sz w:val="17"/>
               </w:rPr>
-              <w:t>evidence</w:t>
+              <w:t>emass-imports</w:t>
             </w:r>
           </w:p>
         </w:tc>
@@ -15790,7 +16767,7 @@
               <w:rPr>
                 <w:sz w:val="17"/>
               </w:rPr>
-              <w:t>5</w:t>
+              <w:t>9</w:t>
             </w:r>
           </w:p>
         </w:tc>
@@ -15804,7 +16781,7 @@
               <w:rPr>
                 <w:sz w:val="17"/>
               </w:rPr>
-              <w:t>GET /evidence/{evidence_id}; GET /evidence/{evidence_id}/download; POST /evidence/{evidence_id}/legal-hold; POST /evidence/{evidence_id}/remove …</w:t>
+              <w:t>GET /emass-imports; GET /emass-imports/samples/{report_type}; GET /emass-imports/{import_id}; POST /emass-imports …</w:t>
             </w:r>
           </w:p>
         </w:tc>
@@ -15820,7 +16797,7 @@
               <w:rPr>
                 <w:sz w:val="17"/>
               </w:rPr>
-              <w:t>findings</w:t>
+              <w:t>evidence</w:t>
             </w:r>
           </w:p>
         </w:tc>
@@ -15834,7 +16811,7 @@
               <w:rPr>
                 <w:sz w:val="17"/>
               </w:rPr>
-              <w:t>8</w:t>
+              <w:t>5</w:t>
             </w:r>
           </w:p>
         </w:tc>
@@ -15848,7 +16825,7 @@
               <w:rPr>
                 <w:sz w:val="17"/>
               </w:rPr>
-              <w:t>GET /findings/{finding_id}; GET /findings/{finding_id}/mappings; GET /findings/{finding_id}/poam-match; GET /findings/{finding_id}/score …</w:t>
+              <w:t>GET /evidence/{evidence_id}; GET /evidence/{evidence_id}/download; POST /evidence/{evidence_id}/legal-hold; POST /evidence/{evidence_id}/remove …</w:t>
             </w:r>
           </w:p>
         </w:tc>
@@ -15864,7 +16841,7 @@
               <w:rPr>
                 <w:sz w:val="17"/>
               </w:rPr>
-              <w:t>freshness-policies</w:t>
+              <w:t>findings</w:t>
             </w:r>
           </w:p>
         </w:tc>
@@ -15878,7 +16855,7 @@
               <w:rPr>
                 <w:sz w:val="17"/>
               </w:rPr>
-              <w:t>1</w:t>
+              <w:t>8</w:t>
             </w:r>
           </w:p>
         </w:tc>
@@ -15892,7 +16869,7 @@
               <w:rPr>
                 <w:sz w:val="17"/>
               </w:rPr>
-              <w:t>GET /freshness-policies</w:t>
+              <w:t>GET /findings/{finding_id}; GET /findings/{finding_id}/mappings; GET /findings/{finding_id}/poam-match; GET /findings/{finding_id}/score …</w:t>
             </w:r>
           </w:p>
         </w:tc>
@@ -15908,7 +16885,7 @@
               <w:rPr>
                 <w:sz w:val="17"/>
               </w:rPr>
-              <w:t>health</w:t>
+              <w:t>freshness-policies</w:t>
             </w:r>
           </w:p>
         </w:tc>
@@ -15922,7 +16899,7 @@
               <w:rPr>
                 <w:sz w:val="17"/>
               </w:rPr>
-              <w:t>2</w:t>
+              <w:t>1</w:t>
             </w:r>
           </w:p>
         </w:tc>
@@ -15936,7 +16913,7 @@
               <w:rPr>
                 <w:sz w:val="17"/>
               </w:rPr>
-              <w:t>GET /health; GET /health/live</w:t>
+              <w:t>GET /freshness-policies</w:t>
             </w:r>
           </w:p>
         </w:tc>
@@ -15952,7 +16929,7 @@
               <w:rPr>
                 <w:sz w:val="17"/>
               </w:rPr>
-              <w:t>ingest-runs</w:t>
+              <w:t>health</w:t>
             </w:r>
           </w:p>
         </w:tc>
@@ -15966,7 +16943,7 @@
               <w:rPr>
                 <w:sz w:val="17"/>
               </w:rPr>
-              <w:t>3</w:t>
+              <w:t>2</w:t>
             </w:r>
           </w:p>
         </w:tc>
@@ -15980,7 +16957,7 @@
               <w:rPr>
                 <w:sz w:val="17"/>
               </w:rPr>
-              <w:t>GET /ingest-runs/{run_id}; GET /ingest-runs/{run_id}/stig; POST /ingest-runs/{run_id}/retry</w:t>
+              <w:t>GET /health; GET /health/live</w:t>
             </w:r>
           </w:p>
         </w:tc>
@@ -15996,7 +16973,7 @@
               <w:rPr>
                 <w:sz w:val="17"/>
               </w:rPr>
-              <w:t>inventory</w:t>
+              <w:t>import-center</w:t>
             </w:r>
           </w:p>
         </w:tc>
@@ -16024,7 +17001,7 @@
               <w:rPr>
                 <w:sz w:val="17"/>
               </w:rPr>
-              <w:t>GET /inventory/exports/{eid}/download; GET /inventory/exports/{eid}/validation-report; POST /inventory/correlations/{cid}; POST /inventory/discrepancies/{did}</w:t>
+              <w:t>GET /import-center/history; GET /import-center/types; POST /import-center/detect; POST /import-center/retry/{kind}/{item_id}</w:t>
             </w:r>
           </w:p>
         </w:tc>
@@ -16040,7 +17017,7 @@
               <w:rPr>
                 <w:sz w:val="17"/>
               </w:rPr>
-              <w:t>jobs</w:t>
+              <w:t>ingest-runs</w:t>
             </w:r>
           </w:p>
         </w:tc>
@@ -16054,7 +17031,7 @@
               <w:rPr>
                 <w:sz w:val="17"/>
               </w:rPr>
-              <w:t>2</w:t>
+              <w:t>3</w:t>
             </w:r>
           </w:p>
         </w:tc>
@@ -16068,7 +17045,7 @@
               <w:rPr>
                 <w:sz w:val="17"/>
               </w:rPr>
-              <w:t>GET /jobs; GET /jobs/{job_id}</w:t>
+              <w:t>GET /ingest-runs/{run_id}; GET /ingest-runs/{run_id}/stig; POST /ingest-runs/{run_id}/retry</w:t>
             </w:r>
           </w:p>
         </w:tc>
@@ -16084,7 +17061,7 @@
               <w:rPr>
                 <w:sz w:val="17"/>
               </w:rPr>
-              <w:t>mapping-review</w:t>
+              <w:t>inventory</w:t>
             </w:r>
           </w:p>
         </w:tc>
@@ -16098,7 +17075,7 @@
               <w:rPr>
                 <w:sz w:val="17"/>
               </w:rPr>
-              <w:t>6</w:t>
+              <w:t>4</w:t>
             </w:r>
           </w:p>
         </w:tc>
@@ -16112,7 +17089,7 @@
               <w:rPr>
                 <w:sz w:val="17"/>
               </w:rPr>
-              <w:t>GET /mapping-review; GET /mapping-review/bulk-jobs/{job_id}; POST /mapping-review/bulk-jobs; POST /mapping-review/bulk-jobs/{job_id}/retry …</w:t>
+              <w:t>GET /inventory/exports/{eid}/download; GET /inventory/exports/{eid}/validation-report; POST /inventory/correlations/{cid}; POST /inventory/discrepancies/{did}</w:t>
             </w:r>
           </w:p>
         </w:tc>
@@ -16128,7 +17105,7 @@
               <w:rPr>
                 <w:sz w:val="17"/>
               </w:rPr>
-              <w:t>mappings</w:t>
+              <w:t>jobs</w:t>
             </w:r>
           </w:p>
         </w:tc>
@@ -16142,7 +17119,7 @@
               <w:rPr>
                 <w:sz w:val="17"/>
               </w:rPr>
-              <w:t>1</w:t>
+              <w:t>2</w:t>
             </w:r>
           </w:p>
         </w:tc>
@@ -16156,7 +17133,7 @@
               <w:rPr>
                 <w:sz w:val="17"/>
               </w:rPr>
-              <w:t>POST /mappings/{map_id}/review</w:t>
+              <w:t>GET /jobs; GET /jobs/{job_id}</w:t>
             </w:r>
           </w:p>
         </w:tc>
@@ -16172,7 +17149,7 @@
               <w:rPr>
                 <w:sz w:val="17"/>
               </w:rPr>
-              <w:t>notification-prefs</w:t>
+              <w:t>mapping-review</w:t>
             </w:r>
           </w:p>
         </w:tc>
@@ -16186,7 +17163,7 @@
               <w:rPr>
                 <w:sz w:val="17"/>
               </w:rPr>
-              <w:t>2</w:t>
+              <w:t>6</w:t>
             </w:r>
           </w:p>
         </w:tc>
@@ -16200,7 +17177,7 @@
               <w:rPr>
                 <w:sz w:val="17"/>
               </w:rPr>
-              <w:t>GET /notification-prefs; PUT /notification-prefs</w:t>
+              <w:t>GET /mapping-review; GET /mapping-review/bulk-jobs/{job_id}; POST /mapping-review/bulk-jobs; POST /mapping-review/bulk-jobs/{job_id}/retry …</w:t>
             </w:r>
           </w:p>
         </w:tc>
@@ -16216,7 +17193,7 @@
               <w:rPr>
                 <w:sz w:val="17"/>
               </w:rPr>
-              <w:t>notifications</w:t>
+              <w:t>mappings</w:t>
             </w:r>
           </w:p>
         </w:tc>
@@ -16230,7 +17207,7 @@
               <w:rPr>
                 <w:sz w:val="17"/>
               </w:rPr>
-              <w:t>2</w:t>
+              <w:t>1</w:t>
             </w:r>
           </w:p>
         </w:tc>
@@ -16244,7 +17221,7 @@
               <w:rPr>
                 <w:sz w:val="17"/>
               </w:rPr>
-              <w:t>GET /notifications; POST /notifications/{notification_id}/ack</w:t>
+              <w:t>POST /mappings/{map_id}/review</w:t>
             </w:r>
           </w:p>
         </w:tc>
@@ -16260,7 +17237,7 @@
               <w:rPr>
                 <w:sz w:val="17"/>
               </w:rPr>
-              <w:t>oscal-exports</w:t>
+              <w:t>notification-prefs</w:t>
             </w:r>
           </w:p>
         </w:tc>
@@ -16274,7 +17251,7 @@
               <w:rPr>
                 <w:sz w:val="17"/>
               </w:rPr>
-              <w:t>1</w:t>
+              <w:t>2</w:t>
             </w:r>
           </w:p>
         </w:tc>
@@ -16288,7 +17265,7 @@
               <w:rPr>
                 <w:sz w:val="17"/>
               </w:rPr>
-              <w:t>GET /oscal-exports/{evidence_id}/download</w:t>
+              <w:t>GET /notification-prefs; PUT /notification-prefs</w:t>
             </w:r>
           </w:p>
         </w:tc>
@@ -16304,7 +17281,7 @@
               <w:rPr>
                 <w:sz w:val="17"/>
               </w:rPr>
-              <w:t>overlays</w:t>
+              <w:t>notifications</w:t>
             </w:r>
           </w:p>
         </w:tc>
@@ -16332,7 +17309,7 @@
               <w:rPr>
                 <w:sz w:val="17"/>
               </w:rPr>
-              <w:t>POST /overlays/import-reference; POST /overlays/{overlay_key}/import</w:t>
+              <w:t>GET /notifications; POST /notifications/{notification_id}/ack</w:t>
             </w:r>
           </w:p>
         </w:tc>
@@ -16348,7 +17325,7 @@
               <w:rPr>
                 <w:sz w:val="17"/>
               </w:rPr>
-              <w:t>poam-match-rules</w:t>
+              <w:t>oscal-exports</w:t>
             </w:r>
           </w:p>
         </w:tc>
@@ -16376,7 +17353,7 @@
               <w:rPr>
                 <w:sz w:val="17"/>
               </w:rPr>
-              <w:t>GET /poam-match-rules</w:t>
+              <w:t>GET /oscal-exports/{evidence_id}/download</w:t>
             </w:r>
           </w:p>
         </w:tc>
@@ -16392,7 +17369,7 @@
               <w:rPr>
                 <w:sz w:val="17"/>
               </w:rPr>
-              <w:t>poam-milestones</w:t>
+              <w:t>overlays</w:t>
             </w:r>
           </w:p>
         </w:tc>
@@ -16406,7 +17383,7 @@
               <w:rPr>
                 <w:sz w:val="17"/>
               </w:rPr>
-              <w:t>1</w:t>
+              <w:t>2</w:t>
             </w:r>
           </w:p>
         </w:tc>
@@ -16420,7 +17397,7 @@
               <w:rPr>
                 <w:sz w:val="17"/>
               </w:rPr>
-              <w:t>PATCH /poam-milestones/{milestone_id}</w:t>
+              <w:t>POST /overlays/import-reference; POST /overlays/{overlay_key}/import</w:t>
             </w:r>
           </w:p>
         </w:tc>
@@ -16436,7 +17413,7 @@
               <w:rPr>
                 <w:sz w:val="17"/>
               </w:rPr>
-              <w:t>poams</w:t>
+              <w:t>poam-match-rules</w:t>
             </w:r>
           </w:p>
         </w:tc>
@@ -16450,7 +17427,7 @@
               <w:rPr>
                 <w:sz w:val="17"/>
               </w:rPr>
-              <w:t>12</w:t>
+              <w:t>1</w:t>
             </w:r>
           </w:p>
         </w:tc>
@@ -16464,7 +17441,7 @@
               <w:rPr>
                 <w:sz w:val="17"/>
               </w:rPr>
-              <w:t>GET /poams; GET /poams/{poam_id}; GET /poams/{poam_id}/risk; PATCH /poams/{poam_id} …</w:t>
+              <w:t>GET /poam-match-rules</w:t>
             </w:r>
           </w:p>
         </w:tc>
@@ -16480,7 +17457,7 @@
               <w:rPr>
                 <w:sz w:val="17"/>
               </w:rPr>
-              <w:t>policies</w:t>
+              <w:t>poam-milestones</w:t>
             </w:r>
           </w:p>
         </w:tc>
@@ -16494,7 +17471,7 @@
               <w:rPr>
                 <w:sz w:val="17"/>
               </w:rPr>
-              <w:t>12</w:t>
+              <w:t>1</w:t>
             </w:r>
           </w:p>
         </w:tc>
@@ -16508,7 +17485,7 @@
               <w:rPr>
                 <w:sz w:val="17"/>
               </w:rPr>
-              <w:t>GET /policies; GET /policies/{policy_id}; GET /policies/{policy_id}/mappings/{control_id}/review; GET /policies/{policy_id}/parameters.csv …</w:t>
+              <w:t>PATCH /poam-milestones/{milestone_id}</w:t>
             </w:r>
           </w:p>
         </w:tc>
@@ -16524,7 +17501,7 @@
               <w:rPr>
                 <w:sz w:val="17"/>
               </w:rPr>
-              <w:t>policy-findings</w:t>
+              <w:t>poams</w:t>
             </w:r>
           </w:p>
         </w:tc>
@@ -16538,7 +17515,7 @@
               <w:rPr>
                 <w:sz w:val="17"/>
               </w:rPr>
-              <w:t>1</w:t>
+              <w:t>12</w:t>
             </w:r>
           </w:p>
         </w:tc>
@@ -16552,7 +17529,7 @@
               <w:rPr>
                 <w:sz w:val="17"/>
               </w:rPr>
-              <w:t>POST /policy-findings/{pf_id}/{action}</w:t>
+              <w:t>GET /poams; GET /poams/{poam_id}; GET /poams/{poam_id}/risk; PATCH /poams/{poam_id} …</w:t>
             </w:r>
           </w:p>
         </w:tc>
@@ -16568,7 +17545,7 @@
               <w:rPr>
                 <w:sz w:val="17"/>
               </w:rPr>
-              <w:t>priority-weights</w:t>
+              <w:t>policies</w:t>
             </w:r>
           </w:p>
         </w:tc>
@@ -16582,7 +17559,7 @@
               <w:rPr>
                 <w:sz w:val="17"/>
               </w:rPr>
-              <w:t>1</w:t>
+              <w:t>12</w:t>
             </w:r>
           </w:p>
         </w:tc>
@@ -16596,7 +17573,7 @@
               <w:rPr>
                 <w:sz w:val="17"/>
               </w:rPr>
-              <w:t>GET /priority-weights</w:t>
+              <w:t>GET /policies; GET /policies/{policy_id}; GET /policies/{policy_id}/mappings/{control_id}/review; GET /policies/{policy_id}/parameters.csv …</w:t>
             </w:r>
           </w:p>
         </w:tc>
@@ -16612,7 +17589,7 @@
               <w:rPr>
                 <w:sz w:val="17"/>
               </w:rPr>
-              <w:t>privacy</w:t>
+              <w:t>policy-findings</w:t>
             </w:r>
           </w:p>
         </w:tc>
@@ -16640,7 +17617,7 @@
               <w:rPr>
                 <w:sz w:val="17"/>
               </w:rPr>
-              <w:t>GET /privacy/preview</w:t>
+              <w:t>POST /policy-findings/{pf_id}/{action}</w:t>
             </w:r>
           </w:p>
         </w:tc>
@@ -16656,7 +17633,7 @@
               <w:rPr>
                 <w:sz w:val="17"/>
               </w:rPr>
-              <w:t>providers</w:t>
+              <w:t>priority-weights</w:t>
             </w:r>
           </w:p>
         </w:tc>
@@ -16670,7 +17647,7 @@
               <w:rPr>
                 <w:sz w:val="17"/>
               </w:rPr>
-              <w:t>5</w:t>
+              <w:t>1</w:t>
             </w:r>
           </w:p>
         </w:tc>
@@ -16684,7 +17661,7 @@
               <w:rPr>
                 <w:sz w:val="17"/>
               </w:rPr>
-              <w:t>PATCH /providers/{provider_id}; POST /providers; POST /providers/{provider_id}/crm/apply; POST /providers/{provider_id}/crm/preview …</w:t>
+              <w:t>GET /priority-weights</w:t>
             </w:r>
           </w:p>
         </w:tc>
@@ -16700,7 +17677,7 @@
               <w:rPr>
                 <w:sz w:val="17"/>
               </w:rPr>
-              <w:t>pta</w:t>
+              <w:t>privacy</w:t>
             </w:r>
           </w:p>
         </w:tc>
@@ -16714,7 +17691,7 @@
               <w:rPr>
                 <w:sz w:val="17"/>
               </w:rPr>
-              <w:t>2</w:t>
+              <w:t>1</w:t>
             </w:r>
           </w:p>
         </w:tc>
@@ -16728,7 +17705,7 @@
               <w:rPr>
                 <w:sz w:val="17"/>
               </w:rPr>
-              <w:t>GET /pta/question-sets; POST /pta/question-sets</w:t>
+              <w:t>GET /privacy/preview</w:t>
             </w:r>
           </w:p>
         </w:tc>
@@ -16744,7 +17721,7 @@
               <w:rPr>
                 <w:sz w:val="17"/>
               </w:rPr>
-              <w:t>public</w:t>
+              <w:t>providers</w:t>
             </w:r>
           </w:p>
         </w:tc>
@@ -16758,7 +17735,7 @@
               <w:rPr>
                 <w:sz w:val="17"/>
               </w:rPr>
-              <w:t>2</w:t>
+              <w:t>5</w:t>
             </w:r>
           </w:p>
         </w:tc>
@@ -16772,7 +17749,7 @@
               <w:rPr>
                 <w:sz w:val="17"/>
               </w:rPr>
-              <w:t>GET /public/demo/{name}; GET /public/whitepaper.{ext}</w:t>
+              <w:t>PATCH /providers/{provider_id}; POST /providers; POST /providers/{provider_id}/crm/apply; POST /providers/{provider_id}/crm/preview …</w:t>
             </w:r>
           </w:p>
         </w:tc>
@@ -16788,7 +17765,7 @@
               <w:rPr>
                 <w:sz w:val="17"/>
               </w:rPr>
-              <w:t>rbac</w:t>
+              <w:t>pta</w:t>
             </w:r>
           </w:p>
         </w:tc>
@@ -16802,7 +17779,7 @@
               <w:rPr>
                 <w:sz w:val="17"/>
               </w:rPr>
-              <w:t>1</w:t>
+              <w:t>2</w:t>
             </w:r>
           </w:p>
         </w:tc>
@@ -16816,7 +17793,7 @@
               <w:rPr>
                 <w:sz w:val="17"/>
               </w:rPr>
-              <w:t>GET /rbac/matrix</w:t>
+              <w:t>GET /pta/question-sets; POST /pta/question-sets</w:t>
             </w:r>
           </w:p>
         </w:tc>
@@ -16832,7 +17809,7 @@
               <w:rPr>
                 <w:sz w:val="17"/>
               </w:rPr>
-              <w:t>ready</w:t>
+              <w:t>public</w:t>
             </w:r>
           </w:p>
         </w:tc>
@@ -16846,7 +17823,7 @@
               <w:rPr>
                 <w:sz w:val="17"/>
               </w:rPr>
-              <w:t>1</w:t>
+              <w:t>2</w:t>
             </w:r>
           </w:p>
         </w:tc>
@@ -16860,7 +17837,7 @@
               <w:rPr>
                 <w:sz w:val="17"/>
               </w:rPr>
-              <w:t>GET /ready</w:t>
+              <w:t>GET /public/demo/{name}; GET /public/whitepaper.{ext}</w:t>
             </w:r>
           </w:p>
         </w:tc>
@@ -16876,7 +17853,7 @@
               <w:rPr>
                 <w:sz w:val="17"/>
               </w:rPr>
-              <w:t>reference</w:t>
+              <w:t>rbac</w:t>
             </w:r>
           </w:p>
         </w:tc>
@@ -16890,7 +17867,7 @@
               <w:rPr>
                 <w:sz w:val="17"/>
               </w:rPr>
-              <w:t>6</w:t>
+              <w:t>1</w:t>
             </w:r>
           </w:p>
         </w:tc>
@@ -16904,7 +17881,7 @@
               <w:rPr>
                 <w:sz w:val="17"/>
               </w:rPr>
-              <w:t>GET /reference/frameworks; GET /reference/info-types; GET /reference/registration; GET /reference/rmf …</w:t>
+              <w:t>GET /rbac/matrix</w:t>
             </w:r>
           </w:p>
         </w:tc>
@@ -16920,7 +17897,7 @@
               <w:rPr>
                 <w:sz w:val="17"/>
               </w:rPr>
-              <w:t>reviews</w:t>
+              <w:t>ready</w:t>
             </w:r>
           </w:p>
         </w:tc>
@@ -16934,7 +17911,7 @@
               <w:rPr>
                 <w:sz w:val="17"/>
               </w:rPr>
-              <w:t>3</w:t>
+              <w:t>1</w:t>
             </w:r>
           </w:p>
         </w:tc>
@@ -16948,7 +17925,7 @@
               <w:rPr>
                 <w:sz w:val="17"/>
               </w:rPr>
-              <w:t>GET /reviews; GET /reviews/{request_id}; POST /reviews/{request_id}/decisions</w:t>
+              <w:t>GET /ready</w:t>
             </w:r>
           </w:p>
         </w:tc>
@@ -16964,7 +17941,7 @@
               <w:rPr>
                 <w:sz w:val="17"/>
               </w:rPr>
-              <w:t>risk</w:t>
+              <w:t>reference</w:t>
             </w:r>
           </w:p>
         </w:tc>
@@ -16978,7 +17955,7 @@
               <w:rPr>
                 <w:sz w:val="17"/>
               </w:rPr>
-              <w:t>2</w:t>
+              <w:t>6</w:t>
             </w:r>
           </w:p>
         </w:tc>
@@ -16992,7 +17969,7 @@
               <w:rPr>
                 <w:sz w:val="17"/>
               </w:rPr>
-              <w:t>GET /risk/weights; PUT /risk/weights</w:t>
+              <w:t>GET /reference/frameworks; GET /reference/info-types; GET /reference/registration; GET /reference/rmf …</w:t>
             </w:r>
           </w:p>
         </w:tc>
@@ -17008,7 +17985,7 @@
               <w:rPr>
                 <w:sz w:val="17"/>
               </w:rPr>
-              <w:t>sandbox</w:t>
+              <w:t>reviews</w:t>
             </w:r>
           </w:p>
         </w:tc>
@@ -17022,7 +17999,7 @@
               <w:rPr>
                 <w:sz w:val="17"/>
               </w:rPr>
-              <w:t>6</w:t>
+              <w:t>3</w:t>
             </w:r>
           </w:p>
         </w:tc>
@@ -17036,7 +18013,7 @@
               <w:rPr>
                 <w:sz w:val="17"/>
               </w:rPr>
-              <w:t>GET /sandbox/samples.zip; GET /sandbox/status; POST /sandbox/act-as; POST /sandbox/demo-data …</w:t>
+              <w:t>GET /reviews; GET /reviews/{request_id}; POST /reviews/{request_id}/decisions</w:t>
             </w:r>
           </w:p>
         </w:tc>
@@ -17052,7 +18029,7 @@
               <w:rPr>
                 <w:sz w:val="17"/>
               </w:rPr>
-              <w:t>scheduled-jobs</w:t>
+              <w:t>risk</w:t>
             </w:r>
           </w:p>
         </w:tc>
@@ -17066,7 +18043,7 @@
               <w:rPr>
                 <w:sz w:val="17"/>
               </w:rPr>
-              <w:t>3</w:t>
+              <w:t>2</w:t>
             </w:r>
           </w:p>
         </w:tc>
@@ -17080,7 +18057,7 @@
               <w:rPr>
                 <w:sz w:val="17"/>
               </w:rPr>
-              <w:t>GET /scheduled-jobs; POST /scheduled-jobs/{job_id}/run; PUT /scheduled-jobs/{job_id}</w:t>
+              <w:t>GET /risk/weights; PUT /risk/weights</w:t>
             </w:r>
           </w:p>
         </w:tc>
@@ -17096,7 +18073,7 @@
               <w:rPr>
                 <w:sz w:val="17"/>
               </w:rPr>
-              <w:t>search</w:t>
+              <w:t>sandbox</w:t>
             </w:r>
           </w:p>
         </w:tc>
@@ -17110,7 +18087,7 @@
               <w:rPr>
                 <w:sz w:val="17"/>
               </w:rPr>
-              <w:t>1</w:t>
+              <w:t>6</w:t>
             </w:r>
           </w:p>
         </w:tc>
@@ -17124,7 +18101,7 @@
               <w:rPr>
                 <w:sz w:val="17"/>
               </w:rPr>
-              <w:t>GET /search</w:t>
+              <w:t>GET /sandbox/samples.zip; GET /sandbox/status; POST /sandbox/act-as; POST /sandbox/demo-data …</w:t>
             </w:r>
           </w:p>
         </w:tc>
@@ -17140,7 +18117,7 @@
               <w:rPr>
                 <w:sz w:val="17"/>
               </w:rPr>
-              <w:t>source-types</w:t>
+              <w:t>scheduled-jobs</w:t>
             </w:r>
           </w:p>
         </w:tc>
@@ -17154,7 +18131,7 @@
               <w:rPr>
                 <w:sz w:val="17"/>
               </w:rPr>
-              <w:t>1</w:t>
+              <w:t>3</w:t>
             </w:r>
           </w:p>
         </w:tc>
@@ -17168,7 +18145,7 @@
               <w:rPr>
                 <w:sz w:val="17"/>
               </w:rPr>
-              <w:t>GET /source-types</w:t>
+              <w:t>GET /scheduled-jobs; POST /scheduled-jobs/{job_id}/run; PUT /scheduled-jobs/{job_id}</w:t>
             </w:r>
           </w:p>
         </w:tc>
@@ -17184,7 +18161,7 @@
               <w:rPr>
                 <w:sz w:val="17"/>
               </w:rPr>
-              <w:t>sources</w:t>
+              <w:t>search</w:t>
             </w:r>
           </w:p>
         </w:tc>
@@ -17198,7 +18175,7 @@
               <w:rPr>
                 <w:sz w:val="17"/>
               </w:rPr>
-              <w:t>3</w:t>
+              <w:t>1</w:t>
             </w:r>
           </w:p>
         </w:tc>
@@ -17212,7 +18189,7 @@
               <w:rPr>
                 <w:sz w:val="17"/>
               </w:rPr>
-              <w:t>PATCH /sources/{source_id}; POST /sources/{source_id}/run; POST /sources/{source_id}/test</w:t>
+              <w:t>GET /search</w:t>
             </w:r>
           </w:p>
         </w:tc>
@@ -17228,6 +18205,94 @@
               <w:rPr>
                 <w:sz w:val="17"/>
               </w:rPr>
+              <w:t>source-types</w:t>
+            </w:r>
+          </w:p>
+        </w:tc>
+        <w:tc>
+          <w:tcPr>
+            <w:tcW w:type="dxa" w:w="683"/>
+          </w:tcPr>
+          <w:p>
+            <w:r/>
+            <w:r>
+              <w:rPr>
+                <w:sz w:val="17"/>
+              </w:rPr>
+              <w:t>1</w:t>
+            </w:r>
+          </w:p>
+        </w:tc>
+        <w:tc>
+          <w:tcPr>
+            <w:tcW w:type="dxa" w:w="7508"/>
+          </w:tcPr>
+          <w:p>
+            <w:r/>
+            <w:r>
+              <w:rPr>
+                <w:sz w:val="17"/>
+              </w:rPr>
+              <w:t>GET /source-types</w:t>
+            </w:r>
+          </w:p>
+        </w:tc>
+      </w:tr>
+      <w:tr>
+        <w:tc>
+          <w:tcPr>
+            <w:tcW w:type="dxa" w:w="1560"/>
+          </w:tcPr>
+          <w:p>
+            <w:r/>
+            <w:r>
+              <w:rPr>
+                <w:sz w:val="17"/>
+              </w:rPr>
+              <w:t>sources</w:t>
+            </w:r>
+          </w:p>
+        </w:tc>
+        <w:tc>
+          <w:tcPr>
+            <w:tcW w:type="dxa" w:w="683"/>
+          </w:tcPr>
+          <w:p>
+            <w:r/>
+            <w:r>
+              <w:rPr>
+                <w:sz w:val="17"/>
+              </w:rPr>
+              <w:t>3</w:t>
+            </w:r>
+          </w:p>
+        </w:tc>
+        <w:tc>
+          <w:tcPr>
+            <w:tcW w:type="dxa" w:w="7508"/>
+          </w:tcPr>
+          <w:p>
+            <w:r/>
+            <w:r>
+              <w:rPr>
+                <w:sz w:val="17"/>
+              </w:rPr>
+              <w:t>PATCH /sources/{source_id}; POST /sources/{source_id}/run; POST /sources/{source_id}/test</w:t>
+            </w:r>
+          </w:p>
+        </w:tc>
+      </w:tr>
+      <w:tr>
+        <w:tc>
+          <w:tcPr>
+            <w:tcW w:type="dxa" w:w="1560"/>
+          </w:tcPr>
+          <w:p>
+            <w:r/>
+            <w:r>
+              <w:rPr>
+                <w:sz w:val="17"/>
+              </w:rPr>
               <w:t>systems</w:t>
             </w:r>
           </w:p>
@@ -17242,7 +18307,7 @@
               <w:rPr>
                 <w:sz w:val="17"/>
               </w:rPr>
-              <w:t>113</w:t>
+              <w:t>118</w:t>
             </w:r>
           </w:p>
         </w:tc>

</xml_diff>

<commit_message>
Whitepaper v1.1: 25 fresh SYNTHETIC screenshots, Import Center + Manage imported data + no-silent-misses sections; previous PDF/DOCX archived
</commit_message>
<xml_diff>
--- a/backend/app/static/whitepaper/IronVision_AI_Whitepaper.docx
+++ b/backend/app/static/whitepaper/IronVision_AI_Whitepaper.docx
@@ -82,7 +82,7 @@
           <w:b/>
           <w:sz w:val="19"/>
         </w:rPr>
-        <w:t>Version 1.0 · October 2026</w:t>
+        <w:t>Version 1.1 · October 2026</w:t>
       </w:r>
       <w:r>
         <w:rPr>
@@ -1558,7 +1558,7 @@
               <a:graphicData uri="http://schemas.openxmlformats.org/drawingml/2006/picture">
                 <pic:pic>
                   <pic:nvPicPr>
-                    <pic:cNvPr id="0" name="signup-demo_04-role-switcher-open.jpg"/>
+                    <pic:cNvPr id="0" name="wp-2026-10_02_role_switcher.jpg"/>
                     <pic:cNvPicPr/>
                   </pic:nvPicPr>
                   <pic:blipFill>
@@ -2028,7 +2028,7 @@
               <a:graphicData uri="http://schemas.openxmlformats.org/drawingml/2006/picture">
                 <pic:pic>
                   <pic:nvPicPr>
-                    <pic:cNvPr id="0" name="sme-final_07-rmf-overview-final.jpg"/>
+                    <pic:cNvPr id="0" name="wp-2026-10_03_rmf_overview.jpg"/>
                     <pic:cNvPicPr/>
                   </pic:nvPicPr>
                   <pic:blipFill>
@@ -2302,7 +2302,7 @@
       <w:r>
         <w:drawing>
           <wp:inline xmlns:a="http://schemas.openxmlformats.org/drawingml/2006/main" xmlns:pic="http://schemas.openxmlformats.org/drawingml/2006/picture">
-            <wp:extent cx="4953600" cy="2786400"/>
+            <wp:extent cx="4953600" cy="3096000"/>
             <wp:docPr id="4" name="Picture 4"/>
             <wp:cNvGraphicFramePr>
               <a:graphicFrameLocks noChangeAspect="1"/>
@@ -2311,7 +2311,7 @@
               <a:graphicData uri="http://schemas.openxmlformats.org/drawingml/2006/picture">
                 <pic:pic>
                   <pic:nvPicPr>
-                    <pic:cNvPr id="0" name="screenshots_login-light.jpg"/>
+                    <pic:cNvPr id="0" name="wp-2026-10_01_login.jpg"/>
                     <pic:cNvPicPr/>
                   </pic:nvPicPr>
                   <pic:blipFill>
@@ -2323,7 +2323,7 @@
                   <pic:spPr>
                     <a:xfrm>
                       <a:off x="0" y="0"/>
-                      <a:ext cx="4953600" cy="2786400"/>
+                      <a:ext cx="4953600" cy="3096000"/>
                     </a:xfrm>
                     <a:prstGeom prst="rect"/>
                   </pic:spPr>
@@ -2988,7 +2988,7 @@
               <a:graphicData uri="http://schemas.openxmlformats.org/drawingml/2006/picture">
                 <pic:pic>
                   <pic:nvPicPr>
-                    <pic:cNvPr id="0" name="implemented_dashboard.jpg"/>
+                    <pic:cNvPr id="0" name="wp-2026-10_04_dashboard.jpg"/>
                     <pic:cNvPicPr/>
                   </pic:nvPicPr>
                   <pic:blipFill>
@@ -3039,7 +3039,7 @@
               <a:graphicData uri="http://schemas.openxmlformats.org/drawingml/2006/picture">
                 <pic:pic>
                   <pic:nvPicPr>
-                    <pic:cNvPr id="0" name="implemented_guided_on.jpg"/>
+                    <pic:cNvPr id="0" name="wp-2026-10_07_prepare.jpg"/>
                     <pic:cNvPicPr/>
                   </pic:nvPicPr>
                   <pic:blipFill>
@@ -3071,7 +3071,7 @@
           <w:color w:val="4B6470"/>
           <w:sz w:val="17"/>
         </w:rPr>
-        <w:t>Figure: Guided Mode on (Categorize)</w:t>
+        <w:t>Figure: Guided Mode on (Prepare – key roles)</w:t>
       </w:r>
     </w:p>
     <w:p>
@@ -3699,7 +3699,7 @@
       <w:r>
         <w:drawing>
           <wp:inline xmlns:a="http://schemas.openxmlformats.org/drawingml/2006/main" xmlns:pic="http://schemas.openxmlformats.org/drawingml/2006/picture">
-            <wp:extent cx="5572800" cy="3134700"/>
+            <wp:extent cx="5572800" cy="3483000"/>
             <wp:docPr id="7" name="Picture 7"/>
             <wp:cNvGraphicFramePr>
               <a:graphicFrameLocks noChangeAspect="1"/>
@@ -3708,7 +3708,7 @@
               <a:graphicData uri="http://schemas.openxmlformats.org/drawingml/2006/picture">
                 <pic:pic>
                   <pic:nvPicPr>
-                    <pic:cNvPr id="0" name="screenshots_leadership-light.jpg"/>
+                    <pic:cNvPr id="0" name="wp-2026-10_06_portfolio.jpg"/>
                     <pic:cNvPicPr/>
                   </pic:nvPicPr>
                   <pic:blipFill>
@@ -3720,7 +3720,7 @@
                   <pic:spPr>
                     <a:xfrm>
                       <a:off x="0" y="0"/>
-                      <a:ext cx="5572800" cy="3134700"/>
+                      <a:ext cx="5572800" cy="3483000"/>
                     </a:xfrm>
                     <a:prstGeom prst="rect"/>
                   </pic:spPr>
@@ -4187,7 +4187,7 @@
               <a:graphicData uri="http://schemas.openxmlformats.org/drawingml/2006/picture">
                 <pic:pic>
                   <pic:nvPicPr>
-                    <pic:cNvPr id="0" name="rmf-accuracy_02_categorize_framework_nss.jpg"/>
+                    <pic:cNvPr id="0" name="wp-2026-10_05_categorize.jpg"/>
                     <pic:cNvPicPr/>
                   </pic:nvPicPr>
                   <pic:blipFill>
@@ -4219,7 +4219,7 @@
           <w:color w:val="4B6470"/>
           <w:sz w:val="17"/>
         </w:rPr>
-        <w:t>Figure: Categorize: NSS determination and framework selection</w:t>
+        <w:t>Figure: Categorize: information types, NSS determination and framework</w:t>
       </w:r>
     </w:p>
     <w:p>
@@ -4452,7 +4452,7 @@
               <a:graphicData uri="http://schemas.openxmlformats.org/drawingml/2006/picture">
                 <pic:pic>
                   <pic:nvPicPr>
-                    <pic:cNvPr id="0" name="sme-overlays_1-select-overlay-groups.jpg"/>
+                    <pic:cNvPr id="0" name="wp-2026-10_08_select.jpg"/>
                     <pic:cNvPicPr/>
                   </pic:nvPicPr>
                   <pic:blipFill>
@@ -4484,7 +4484,7 @@
           <w:color w:val="4B6470"/>
           <w:sz w:val="17"/>
         </w:rPr>
-        <w:t>Figure: Select: official CNSSI 1253 overlay groups with applicability</w:t>
+        <w:t>Figure: Select: baseline, overlays and tailoring</w:t>
       </w:r>
     </w:p>
     <w:p>
@@ -4503,7 +4503,7 @@
               <a:graphicData uri="http://schemas.openxmlformats.org/drawingml/2006/picture">
                 <pic:pic>
                   <pic:nvPicPr>
-                    <pic:cNvPr id="0" name="rmf-accuracy_05_parameter_comparison.jpg"/>
+                    <pic:cNvPr id="0" name="wp-2026-10_09_control_ac2.jpg"/>
                     <pic:cNvPicPr/>
                   </pic:nvPicPr>
                   <pic:blipFill>
@@ -4535,7 +4535,7 @@
           <w:color w:val="4B6470"/>
           <w:sz w:val="17"/>
         </w:rPr>
-        <w:t>Figure: Select: parameter comparison (catalog vs. CNSSI 1253 vs. system values)</w:t>
+        <w:t>Figure: Control tab (AC-2): status, parameters and implementation statement</w:t>
       </w:r>
     </w:p>
     <w:p>
@@ -5386,7 +5386,7 @@
               <a:graphicData uri="http://schemas.openxmlformats.org/drawingml/2006/picture">
                 <pic:pic>
                   <pic:nvPicPr>
-                    <pic:cNvPr id="0" name="implemented_workbench.jpg"/>
+                    <pic:cNvPr id="0" name="wp-2026-10_10_workbench.jpg"/>
                     <pic:cNvPicPr/>
                   </pic:nvPicPr>
                   <pic:blipFill>
@@ -5840,7 +5840,7 @@
       <w:r>
         <w:drawing>
           <wp:inline xmlns:a="http://schemas.openxmlformats.org/drawingml/2006/main" xmlns:pic="http://schemas.openxmlformats.org/drawingml/2006/picture">
-            <wp:extent cx="5572800" cy="3831300"/>
+            <wp:extent cx="5572800" cy="3483000"/>
             <wp:docPr id="12" name="Picture 12"/>
             <wp:cNvGraphicFramePr>
               <a:graphicFrameLocks noChangeAspect="1"/>
@@ -5849,7 +5849,7 @@
               <a:graphicData uri="http://schemas.openxmlformats.org/drawingml/2006/picture">
                 <pic:pic>
                   <pic:nvPicPr>
-                    <pic:cNvPr id="0" name="inventory_01_inventory_overview.jpg"/>
+                    <pic:cNvPr id="0" name="wp-2026-10_11_inventory.jpg"/>
                     <pic:cNvPicPr/>
                   </pic:nvPicPr>
                   <pic:blipFill>
@@ -5861,7 +5861,7 @@
                   <pic:spPr>
                     <a:xfrm>
                       <a:off x="0" y="0"/>
-                      <a:ext cx="5572800" cy="3831300"/>
+                      <a:ext cx="5572800" cy="3483000"/>
                     </a:xfrm>
                     <a:prstGeom prst="rect"/>
                   </pic:spPr>
@@ -6289,7 +6289,7 @@
               <w:rPr>
                 <w:sz w:val="17"/>
               </w:rPr>
-              <w:t>Findings stay proposed until a human confirms them. AI may raise a requirement only with an exact quote.</w:t>
+              <w:t>Findings stay proposed until a human confirms them. AI may raise a requirement only with an exact quote. No silent misses: 'not present' is shown only after the whole document and a focused second look found nothing; otherwise the row is 'needs manual review' with candidate passages. Policy evidence supports at most Partially Implemented.</w:t>
             </w:r>
           </w:p>
         </w:tc>
@@ -6312,7 +6312,7 @@
               <a:graphicData uri="http://schemas.openxmlformats.org/drawingml/2006/picture">
                 <pic:pic>
                   <pic:nvPicPr>
-                    <pic:cNvPr id="0" name="rmf-accuracy_10_policy_mappings_confidence.jpg"/>
+                    <pic:cNvPr id="0" name="wp-2026-10_12_policy_mappings.jpg"/>
                     <pic:cNvPicPr/>
                   </pic:nvPicPr>
                   <pic:blipFill>
@@ -6344,7 +6344,109 @@
           <w:color w:val="4B6470"/>
           <w:sz w:val="17"/>
         </w:rPr>
-        <w:t>Figure: Policy mappings with confidence and source attribution</w:t>
+        <w:t>Figure: Policy mappings with confidence, matched text and decision history</w:t>
+      </w:r>
+    </w:p>
+    <w:p>
+      <w:pPr>
+        <w:jc w:val="center"/>
+      </w:pPr>
+      <w:r>
+        <w:drawing>
+          <wp:inline xmlns:a="http://schemas.openxmlformats.org/drawingml/2006/main" xmlns:pic="http://schemas.openxmlformats.org/drawingml/2006/picture">
+            <wp:extent cx="5572800" cy="3483000"/>
+            <wp:docPr id="14" name="Picture 14"/>
+            <wp:cNvGraphicFramePr>
+              <a:graphicFrameLocks noChangeAspect="1"/>
+            </wp:cNvGraphicFramePr>
+            <a:graphic>
+              <a:graphicData uri="http://schemas.openxmlformats.org/drawingml/2006/picture">
+                <pic:pic>
+                  <pic:nvPicPr>
+                    <pic:cNvPr id="0" name="wp-2026-10_24_policy_coverage.jpg"/>
+                    <pic:cNvPicPr/>
+                  </pic:nvPicPr>
+                  <pic:blipFill>
+                    <a:blip r:embed="rId23"/>
+                    <a:stretch>
+                      <a:fillRect/>
+                    </a:stretch>
+                  </pic:blipFill>
+                  <pic:spPr>
+                    <a:xfrm>
+                      <a:off x="0" y="0"/>
+                      <a:ext cx="5572800" cy="3483000"/>
+                    </a:xfrm>
+                    <a:prstGeom prst="rect"/>
+                  </pic:spPr>
+                </pic:pic>
+              </a:graphicData>
+            </a:graphic>
+          </wp:inline>
+        </w:drawing>
+      </w:r>
+    </w:p>
+    <w:p>
+      <w:pPr>
+        <w:jc w:val="center"/>
+      </w:pPr>
+      <w:r>
+        <w:rPr>
+          <w:color w:val="4B6470"/>
+          <w:sz w:val="17"/>
+        </w:rPr>
+        <w:t>Figure: Requirement coverage: keyword-only rows flagged for manual review</w:t>
+      </w:r>
+    </w:p>
+    <w:p>
+      <w:pPr>
+        <w:jc w:val="center"/>
+      </w:pPr>
+      <w:r>
+        <w:drawing>
+          <wp:inline xmlns:a="http://schemas.openxmlformats.org/drawingml/2006/main" xmlns:pic="http://schemas.openxmlformats.org/drawingml/2006/picture">
+            <wp:extent cx="5263200" cy="3289500"/>
+            <wp:docPr id="15" name="Picture 15"/>
+            <wp:cNvGraphicFramePr>
+              <a:graphicFrameLocks noChangeAspect="1"/>
+            </wp:cNvGraphicFramePr>
+            <a:graphic>
+              <a:graphicData uri="http://schemas.openxmlformats.org/drawingml/2006/picture">
+                <pic:pic>
+                  <pic:nvPicPr>
+                    <pic:cNvPr id="0" name="wp-2026-10_25_reading_report.jpg"/>
+                    <pic:cNvPicPr/>
+                  </pic:nvPicPr>
+                  <pic:blipFill>
+                    <a:blip r:embed="rId24"/>
+                    <a:stretch>
+                      <a:fillRect/>
+                    </a:stretch>
+                  </pic:blipFill>
+                  <pic:spPr>
+                    <a:xfrm>
+                      <a:off x="0" y="0"/>
+                      <a:ext cx="5263200" cy="3289500"/>
+                    </a:xfrm>
+                    <a:prstGeom prst="rect"/>
+                  </pic:spPr>
+                </pic:pic>
+              </a:graphicData>
+            </a:graphic>
+          </wp:inline>
+        </w:drawing>
+      </w:r>
+    </w:p>
+    <w:p>
+      <w:pPr>
+        <w:jc w:val="center"/>
+      </w:pPr>
+      <w:r>
+        <w:rPr>
+          <w:color w:val="4B6470"/>
+          <w:sz w:val="17"/>
+        </w:rPr>
+        <w:t>Figure: Reading report: what was read, whole-document check and second look</w:t>
       </w:r>
     </w:p>
     <w:p>
@@ -6611,7 +6713,7 @@
         <w:drawing>
           <wp:inline xmlns:a="http://schemas.openxmlformats.org/drawingml/2006/main" xmlns:pic="http://schemas.openxmlformats.org/drawingml/2006/picture">
             <wp:extent cx="5572800" cy="3483000"/>
-            <wp:docPr id="14" name="Picture 14"/>
+            <wp:docPr id="16" name="Picture 16"/>
             <wp:cNvGraphicFramePr>
               <a:graphicFrameLocks noChangeAspect="1"/>
             </wp:cNvGraphicFramePr>
@@ -6619,11 +6721,11 @@
               <a:graphicData uri="http://schemas.openxmlformats.org/drawingml/2006/picture">
                 <pic:pic>
                   <pic:nvPicPr>
-                    <pic:cNvPr id="0" name="sme-final_04-stig-run-detail.jpg"/>
+                    <pic:cNvPr id="0" name="wp-2026-10_13_stig_run.jpg"/>
                     <pic:cNvPicPr/>
                   </pic:nvPicPr>
                   <pic:blipFill>
-                    <a:blip r:embed="rId23"/>
+                    <a:blip r:embed="rId25"/>
                     <a:stretch>
                       <a:fillRect/>
                     </a:stretch>
@@ -6876,7 +6978,7 @@
         <w:drawing>
           <wp:inline xmlns:a="http://schemas.openxmlformats.org/drawingml/2006/main" xmlns:pic="http://schemas.openxmlformats.org/drawingml/2006/picture">
             <wp:extent cx="5572800" cy="3483000"/>
-            <wp:docPr id="15" name="Picture 15"/>
+            <wp:docPr id="17" name="Picture 17"/>
             <wp:cNvGraphicFramePr>
               <a:graphicFrameLocks noChangeAspect="1"/>
             </wp:cNvGraphicFramePr>
@@ -6884,11 +6986,11 @@
               <a:graphicData uri="http://schemas.openxmlformats.org/drawingml/2006/picture">
                 <pic:pic>
                   <pic:nvPicPr>
-                    <pic:cNvPr id="0" name="implemented_sca_workspace.jpg"/>
+                    <pic:cNvPr id="0" name="wp-2026-10_14_sca_workspace.jpg"/>
                     <pic:cNvPicPr/>
                   </pic:nvPicPr>
                   <pic:blipFill>
-                    <a:blip r:embed="rId24"/>
+                    <a:blip r:embed="rId26"/>
                     <a:stretch>
                       <a:fillRect/>
                     </a:stretch>
@@ -7545,7 +7647,7 @@
         <w:drawing>
           <wp:inline xmlns:a="http://schemas.openxmlformats.org/drawingml/2006/main" xmlns:pic="http://schemas.openxmlformats.org/drawingml/2006/picture">
             <wp:extent cx="5572800" cy="3483000"/>
-            <wp:docPr id="16" name="Picture 16"/>
+            <wp:docPr id="18" name="Picture 18"/>
             <wp:cNvGraphicFramePr>
               <a:graphicFrameLocks noChangeAspect="1"/>
             </wp:cNvGraphicFramePr>
@@ -7553,11 +7655,11 @@
               <a:graphicData uri="http://schemas.openxmlformats.org/drawingml/2006/picture">
                 <pic:pic>
                   <pic:nvPicPr>
-                    <pic:cNvPr id="0" name="tr_07_ai_evidence_analysis.jpg"/>
+                    <pic:cNvPr id="0" name="wp-2026-10_15_test_results.jpg"/>
                     <pic:cNvPicPr/>
                   </pic:nvPicPr>
                   <pic:blipFill>
-                    <a:blip r:embed="rId25"/>
+                    <a:blip r:embed="rId27"/>
                     <a:stretch>
                       <a:fillRect/>
                     </a:stretch>
@@ -7585,7 +7687,7 @@
           <w:color w:val="4B6470"/>
           <w:sz w:val="17"/>
         </w:rPr>
-        <w:t>Figure: Test Results: AI evidence analysis on a row (suggestion only)</w:t>
+        <w:t>Figure: Test Results workbook (AI evidence analysis is suggestion-only)</w:t>
       </w:r>
     </w:p>
     <w:p>
@@ -7802,7 +7904,7 @@
         <w:drawing>
           <wp:inline xmlns:a="http://schemas.openxmlformats.org/drawingml/2006/main" xmlns:pic="http://schemas.openxmlformats.org/drawingml/2006/picture">
             <wp:extent cx="5572800" cy="3483000"/>
-            <wp:docPr id="17" name="Picture 17"/>
+            <wp:docPr id="19" name="Picture 19"/>
             <wp:cNvGraphicFramePr>
               <a:graphicFrameLocks noChangeAspect="1"/>
             </wp:cNvGraphicFramePr>
@@ -7810,11 +7912,11 @@
               <a:graphicData uri="http://schemas.openxmlformats.org/drawingml/2006/picture">
                 <pic:pic>
                   <pic:nvPicPr>
-                    <pic:cNvPr id="0" name="rmf-accuracy_11_side_by_side_review.jpg"/>
+                    <pic:cNvPr id="0" name="wp-2026-10_16_mapping_review.jpg"/>
                     <pic:cNvPicPr/>
                   </pic:nvPicPr>
                   <pic:blipFill>
-                    <a:blip r:embed="rId26"/>
+                    <a:blip r:embed="rId28"/>
                     <a:stretch>
                       <a:fillRect/>
                     </a:stretch>
@@ -7842,7 +7944,7 @@
           <w:color w:val="4B6470"/>
           <w:sz w:val="17"/>
         </w:rPr>
-        <w:t>Figure: Mapping Review: side-by-side source passage and control requirement</w:t>
+        <w:t>Figure: Mapping Review queue with confidence filters</w:t>
       </w:r>
     </w:p>
     <w:p>
@@ -8067,7 +8169,7 @@
         <w:drawing>
           <wp:inline xmlns:a="http://schemas.openxmlformats.org/drawingml/2006/main" xmlns:pic="http://schemas.openxmlformats.org/drawingml/2006/picture">
             <wp:extent cx="5448960" cy="3405600"/>
-            <wp:docPr id="18" name="Picture 18"/>
+            <wp:docPr id="20" name="Picture 20"/>
             <wp:cNvGraphicFramePr>
               <a:graphicFrameLocks noChangeAspect="1"/>
             </wp:cNvGraphicFramePr>
@@ -8075,11 +8177,11 @@
               <a:graphicData uri="http://schemas.openxmlformats.org/drawingml/2006/picture">
                 <pic:pic>
                   <pic:nvPicPr>
-                    <pic:cNvPr id="0" name="rmf-accuracy_07_authorize_authorization_type.jpg"/>
+                    <pic:cNvPr id="0" name="wp-2026-10_17_authorize.jpg"/>
                     <pic:cNvPicPr/>
                   </pic:nvPicPr>
                   <pic:blipFill>
-                    <a:blip r:embed="rId27"/>
+                    <a:blip r:embed="rId29"/>
                     <a:stretch>
                       <a:fillRect/>
                     </a:stretch>
@@ -8107,7 +8209,7 @@
           <w:color w:val="4B6470"/>
           <w:sz w:val="17"/>
         </w:rPr>
-        <w:t>Figure: Authorize: authorization type and decision</w:t>
+        <w:t>Figure: Authorize: package, OSCAL exports and decision</w:t>
       </w:r>
     </w:p>
     <w:p>
@@ -8323,8 +8425,8 @@
       <w:r>
         <w:drawing>
           <wp:inline xmlns:a="http://schemas.openxmlformats.org/drawingml/2006/main" xmlns:pic="http://schemas.openxmlformats.org/drawingml/2006/picture">
-            <wp:extent cx="5572800" cy="3134700"/>
-            <wp:docPr id="19" name="Picture 19"/>
+            <wp:extent cx="5572800" cy="3483000"/>
+            <wp:docPr id="21" name="Picture 21"/>
             <wp:cNvGraphicFramePr>
               <a:graphicFrameLocks noChangeAspect="1"/>
             </wp:cNvGraphicFramePr>
@@ -8332,11 +8434,11 @@
               <a:graphicData uri="http://schemas.openxmlformats.org/drawingml/2006/picture">
                 <pic:pic>
                   <pic:nvPicPr>
-                    <pic:cNvPr id="0" name="screenshots_poam-light.jpg"/>
+                    <pic:cNvPr id="0" name="wp-2026-10_18_poam.jpg"/>
                     <pic:cNvPicPr/>
                   </pic:nvPicPr>
                   <pic:blipFill>
-                    <a:blip r:embed="rId28"/>
+                    <a:blip r:embed="rId30"/>
                     <a:stretch>
                       <a:fillRect/>
                     </a:stretch>
@@ -8344,7 +8446,7 @@
                   <pic:spPr>
                     <a:xfrm>
                       <a:off x="0" y="0"/>
-                      <a:ext cx="5572800" cy="3134700"/>
+                      <a:ext cx="5572800" cy="3483000"/>
                     </a:xfrm>
                     <a:prstGeom prst="rect"/>
                   </pic:spPr>
@@ -9063,8 +9165,8 @@
       <w:r>
         <w:drawing>
           <wp:inline xmlns:a="http://schemas.openxmlformats.org/drawingml/2006/main" xmlns:pic="http://schemas.openxmlformats.org/drawingml/2006/picture">
-            <wp:extent cx="5572800" cy="3134700"/>
-            <wp:docPr id="20" name="Picture 20"/>
+            <wp:extent cx="5572800" cy="3483000"/>
+            <wp:docPr id="22" name="Picture 22"/>
             <wp:cNvGraphicFramePr>
               <a:graphicFrameLocks noChangeAspect="1"/>
             </wp:cNvGraphicFramePr>
@@ -9072,11 +9174,11 @@
               <a:graphicData uri="http://schemas.openxmlformats.org/drawingml/2006/picture">
                 <pic:pic>
                   <pic:nvPicPr>
-                    <pic:cNvPr id="0" name="screenshots_evidence-ledger-light.jpg"/>
+                    <pic:cNvPr id="0" name="wp-2026-10_19_evidence_ledger.jpg"/>
                     <pic:cNvPicPr/>
                   </pic:nvPicPr>
                   <pic:blipFill>
-                    <a:blip r:embed="rId29"/>
+                    <a:blip r:embed="rId31"/>
                     <a:stretch>
                       <a:fillRect/>
                     </a:stretch>
@@ -9084,7 +9186,7 @@
                   <pic:spPr>
                     <a:xfrm>
                       <a:off x="0" y="0"/>
-                      <a:ext cx="5572800" cy="3134700"/>
+                      <a:ext cx="5572800" cy="3483000"/>
                     </a:xfrm>
                     <a:prstGeom prst="rect"/>
                   </pic:spPr>
@@ -10766,7 +10868,7 @@
               <w:rPr>
                 <w:sz w:val="17"/>
               </w:rPr>
-              <w:t>Policy coverage refine (policy.coverage_refine@1.0.0)</w:t>
+              <w:t>Policy coverage refine (policy.coverage_refine@2.x)</w:t>
             </w:r>
           </w:p>
         </w:tc>
@@ -12761,7 +12863,7 @@
         <w:drawing>
           <wp:inline xmlns:a="http://schemas.openxmlformats.org/drawingml/2006/main" xmlns:pic="http://schemas.openxmlformats.org/drawingml/2006/picture">
             <wp:extent cx="5263200" cy="3289500"/>
-            <wp:docPr id="21" name="Picture 21"/>
+            <wp:docPr id="23" name="Picture 23"/>
             <wp:cNvGraphicFramePr>
               <a:graphicFrameLocks noChangeAspect="1"/>
             </wp:cNvGraphicFramePr>
@@ -12769,11 +12871,11 @@
               <a:graphicData uri="http://schemas.openxmlformats.org/drawingml/2006/picture">
                 <pic:pic>
                   <pic:nvPicPr>
-                    <pic:cNvPr id="0" name="rmf-accuracy_09_evidence_version_history.jpg"/>
+                    <pic:cNvPr id="0" name="wp-2026-10_20_evidence_sources.jpg"/>
                     <pic:cNvPicPr/>
                   </pic:nvPicPr>
                   <pic:blipFill>
-                    <a:blip r:embed="rId30"/>
+                    <a:blip r:embed="rId32"/>
                     <a:stretch>
                       <a:fillRect/>
                     </a:stretch>
@@ -12801,7 +12903,7 @@
           <w:color w:val="4B6470"/>
           <w:sz w:val="17"/>
         </w:rPr>
-        <w:t>Figure: Evidence version history</w:t>
+        <w:t>Figure: Evidence sources and connectors</w:t>
       </w:r>
     </w:p>
     <w:p>
@@ -12902,8 +13004,8 @@
       <w:r>
         <w:drawing>
           <wp:inline xmlns:a="http://schemas.openxmlformats.org/drawingml/2006/main" xmlns:pic="http://schemas.openxmlformats.org/drawingml/2006/picture">
-            <wp:extent cx="5448960" cy="3524796"/>
-            <wp:docPr id="22" name="Picture 22"/>
+            <wp:extent cx="5448960" cy="3405600"/>
+            <wp:docPr id="24" name="Picture 24"/>
             <wp:cNvGraphicFramePr>
               <a:graphicFrameLocks noChangeAspect="1"/>
             </wp:cNvGraphicFramePr>
@@ -12911,11 +13013,11 @@
               <a:graphicData uri="http://schemas.openxmlformats.org/drawingml/2006/picture">
                 <pic:pic>
                   <pic:nvPicPr>
-                    <pic:cNvPr id="0" name="tr_6-export-history.jpg"/>
+                    <pic:cNvPr id="0" name="wp-2026-10_21_emass_hub.jpg"/>
                     <pic:cNvPicPr/>
                   </pic:nvPicPr>
                   <pic:blipFill>
-                    <a:blip r:embed="rId31"/>
+                    <a:blip r:embed="rId33"/>
                     <a:stretch>
                       <a:fillRect/>
                     </a:stretch>
@@ -12923,7 +13025,7 @@
                   <pic:spPr>
                     <a:xfrm>
                       <a:off x="0" y="0"/>
-                      <a:ext cx="5448960" cy="3524796"/>
+                      <a:ext cx="5448960" cy="3405600"/>
                     </a:xfrm>
                     <a:prstGeom prst="rect"/>
                   </pic:spPr>
@@ -12943,7 +13045,7 @@
           <w:color w:val="4B6470"/>
           <w:sz w:val="17"/>
         </w:rPr>
-        <w:t>Figure: Test Results export history with validation status</w:t>
+        <w:t>Figure: eMASS sync hub and outbound change queue</w:t>
       </w:r>
     </w:p>
     <w:p>
@@ -13022,6 +13124,172 @@
     </w:tbl>
     <w:p/>
     <w:p>
+      <w:pPr>
+        <w:pStyle w:val="Heading2"/>
+      </w:pPr>
+      <w:r>
+        <w:t>9.3 Import Center and Manage imported data</w:t>
+      </w:r>
+    </w:p>
+    <w:p>
+      <w:pPr>
+        <w:pStyle w:val="ListBullet"/>
+      </w:pPr>
+      <w:r>
+        <w:rPr>
+          <w:b/>
+        </w:rPr>
+        <w:t>One drop zone for every import.</w:t>
+      </w:r>
+      <w:r>
+        <w:t xml:space="preserve"> eMASS Control Information, Implementation Plan, Test Results / Test Plan, HW/SW, PPSM, STIG .ckl/.cklb, ACAS/Nessus and policies. Each file is detected and routed; the user chooses 'Register a new system' or 'Add to the current system', and several files can be imported at once.</w:t>
+      </w:r>
+    </w:p>
+    <w:p>
+      <w:pPr>
+        <w:pStyle w:val="ListBullet"/>
+      </w:pPr>
+      <w:r>
+        <w:rPr>
+          <w:b/>
+        </w:rPr>
+        <w:t>Review before apply.</w:t>
+      </w:r>
+      <w:r>
+        <w:t xml:space="preserve"> Changes are grouped by section with safe / conflict / invalid states; nothing is written until a human applies.</w:t>
+      </w:r>
+    </w:p>
+    <w:p>
+      <w:pPr>
+        <w:pStyle w:val="ListBullet"/>
+      </w:pPr>
+      <w:r>
+        <w:rPr>
+          <w:b/>
+        </w:rPr>
+        <w:t>Manage imported data.</w:t>
+      </w:r>
+      <w:r>
+        <w:t xml:space="preserve"> Every applied import has a Manage view grouped by section. Users restore, clear or delete one value, a row, a section or everything the import created (the system shell stays; system deletion is unchanged). Deletions can be undone for 30 days and every action is audited.</w:t>
+      </w:r>
+    </w:p>
+    <w:p>
+      <w:pPr>
+        <w:pStyle w:val="ListBullet"/>
+      </w:pPr>
+      <w:r>
+        <w:rPr>
+          <w:b/>
+        </w:rPr>
+        <w:t>Decisions are never deleted.</w:t>
+      </w:r>
+      <w:r>
+        <w:t xml:space="preserve"> If removed data underpinned an SCA determination, approved inventory, the AO's categorization or the ISSM's strategy, that decision is flagged for re-review. Removing imported evidence removes the link only; deleting the stored file needs a separate confirmation. Deleted Test Result rows and inventory items are excluded from both TR export modes.</w:t>
+      </w:r>
+    </w:p>
+    <w:p>
+      <w:pPr>
+        <w:jc w:val="center"/>
+      </w:pPr>
+      <w:r>
+        <w:drawing>
+          <wp:inline xmlns:a="http://schemas.openxmlformats.org/drawingml/2006/main" xmlns:pic="http://schemas.openxmlformats.org/drawingml/2006/picture">
+            <wp:extent cx="5448960" cy="3405600"/>
+            <wp:docPr id="25" name="Picture 25"/>
+            <wp:cNvGraphicFramePr>
+              <a:graphicFrameLocks noChangeAspect="1"/>
+            </wp:cNvGraphicFramePr>
+            <a:graphic>
+              <a:graphicData uri="http://schemas.openxmlformats.org/drawingml/2006/picture">
+                <pic:pic>
+                  <pic:nvPicPr>
+                    <pic:cNvPr id="0" name="wp-2026-10_22_import_center.jpg"/>
+                    <pic:cNvPicPr/>
+                  </pic:nvPicPr>
+                  <pic:blipFill>
+                    <a:blip r:embed="rId34"/>
+                    <a:stretch>
+                      <a:fillRect/>
+                    </a:stretch>
+                  </pic:blipFill>
+                  <pic:spPr>
+                    <a:xfrm>
+                      <a:off x="0" y="0"/>
+                      <a:ext cx="5448960" cy="3405600"/>
+                    </a:xfrm>
+                    <a:prstGeom prst="rect"/>
+                  </pic:spPr>
+                </pic:pic>
+              </a:graphicData>
+            </a:graphic>
+          </wp:inline>
+        </w:drawing>
+      </w:r>
+    </w:p>
+    <w:p>
+      <w:pPr>
+        <w:jc w:val="center"/>
+      </w:pPr>
+      <w:r>
+        <w:rPr>
+          <w:color w:val="4B6470"/>
+          <w:sz w:val="17"/>
+        </w:rPr>
+        <w:t>Figure: Import Center: drop zone and supported import types</w:t>
+      </w:r>
+    </w:p>
+    <w:p>
+      <w:pPr>
+        <w:jc w:val="center"/>
+      </w:pPr>
+      <w:r>
+        <w:drawing>
+          <wp:inline xmlns:a="http://schemas.openxmlformats.org/drawingml/2006/main" xmlns:pic="http://schemas.openxmlformats.org/drawingml/2006/picture">
+            <wp:extent cx="5448960" cy="3405600"/>
+            <wp:docPr id="26" name="Picture 26"/>
+            <wp:cNvGraphicFramePr>
+              <a:graphicFrameLocks noChangeAspect="1"/>
+            </wp:cNvGraphicFramePr>
+            <a:graphic>
+              <a:graphicData uri="http://schemas.openxmlformats.org/drawingml/2006/picture">
+                <pic:pic>
+                  <pic:nvPicPr>
+                    <pic:cNvPr id="0" name="wp-2026-10_23_manage_imported.jpg"/>
+                    <pic:cNvPicPr/>
+                  </pic:nvPicPr>
+                  <pic:blipFill>
+                    <a:blip r:embed="rId35"/>
+                    <a:stretch>
+                      <a:fillRect/>
+                    </a:stretch>
+                  </pic:blipFill>
+                  <pic:spPr>
+                    <a:xfrm>
+                      <a:off x="0" y="0"/>
+                      <a:ext cx="5448960" cy="3405600"/>
+                    </a:xfrm>
+                    <a:prstGeom prst="rect"/>
+                  </pic:spPr>
+                </pic:pic>
+              </a:graphicData>
+            </a:graphic>
+          </wp:inline>
+        </w:drawing>
+      </w:r>
+    </w:p>
+    <w:p>
+      <w:pPr>
+        <w:jc w:val="center"/>
+      </w:pPr>
+      <w:r>
+        <w:rPr>
+          <w:color w:val="4B6470"/>
+          <w:sz w:val="17"/>
+        </w:rPr>
+        <w:t>Figure: Manage imported data: sections, per-item delete, 30-day undo</w:t>
+      </w:r>
+    </w:p>
+    <w:p>
       <w:r>
         <w:br w:type="page"/>
       </w:r>
@@ -13042,7 +13310,7 @@
         <w:drawing>
           <wp:inline xmlns:a="http://schemas.openxmlformats.org/drawingml/2006/main" xmlns:pic="http://schemas.openxmlformats.org/drawingml/2006/picture">
             <wp:extent cx="6192000" cy="3803657"/>
-            <wp:docPr id="23" name="Picture 23"/>
+            <wp:docPr id="27" name="Picture 27"/>
             <wp:cNvGraphicFramePr>
               <a:graphicFrameLocks noChangeAspect="1"/>
             </wp:cNvGraphicFramePr>
@@ -13054,7 +13322,7 @@
                     <pic:cNvPicPr/>
                   </pic:nvPicPr>
                   <pic:blipFill>
-                    <a:blip r:embed="rId32"/>
+                    <a:blip r:embed="rId36"/>
                     <a:stretch>
                       <a:fillRect/>
                     </a:stretch>
@@ -13320,7 +13588,7 @@
               <w:rPr>
                 <w:sz w:val="17"/>
               </w:rPr>
-              <w:t>29 migration files (0001 … 0028); additive, reversible; org_id on every record; append-only audit trigger</w:t>
+              <w:t>40 migration files (0001 … 0039); additive, reversible; org_id on every record; append-only audit trigger</w:t>
             </w:r>
           </w:p>
         </w:tc>
@@ -14204,7 +14472,7 @@
     </w:p>
     <w:p>
       <w:r>
-        <w:t>Upload an organization's policies. The Policy Auditor maps sections and pages to controls, evaluates each assessment objective and CCI, and optionally refines the results with AI using verified quotes. Gaps become proposed findings that a human confirms or dismisses; the CCI view shows coverage.</w:t>
+        <w:t>Upload an organization's policies. The Policy Auditor maps sections and pages to controls, evaluates each assessment objective and CCI, and optionally refines the results with AI using verified quotes (whole-document reading for policies under ~60k characters, plus an AI check of every xx-1 policy requirement). A requirement is marked not present only after the whole document and a focused second look found nothing; truncated or timed-out AI batches become 'needs manual review', never 'missing'. Gaps become proposed findings that a human confirms or dismisses; the CCI view shows coverage.</w:t>
       </w:r>
     </w:p>
     <w:p>
@@ -15792,7 +16060,7 @@
         <w:rPr>
           <w:b/>
         </w:rPr>
-        <w:t>292 paths, 318 operations</w:t>
+        <w:t>306 paths, 335 operations</w:t>
       </w:r>
       <w:r>
         <w:t>, grouped by the first path segment under /api/v1. Every mutating operation requires a permission (see section 11); only sign-in, demo login, refresh, logout, sign-up, health and the public whitepaper downloads are unauthenticated.</w:t>
@@ -15887,7 +16155,7 @@
               <w:rPr>
                 <w:sz w:val="17"/>
               </w:rPr>
-              <w:t>10</w:t>
+              <w:t>11</w:t>
             </w:r>
           </w:p>
         </w:tc>
@@ -15901,7 +16169,7 @@
               <w:rPr>
                 <w:sz w:val="17"/>
               </w:rPr>
-              <w:t>GET /admin/ai-settings; GET /admin/identity-mappings; GET /admin/security; GET /admin/users …</w:t>
+              <w:t>GET /admin/ai-settings; GET /admin/identity-mappings; GET /admin/policy-feedback/export; GET /admin/security …</w:t>
             </w:r>
           </w:p>
         </w:tc>
@@ -16767,7 +17035,7 @@
               <w:rPr>
                 <w:sz w:val="17"/>
               </w:rPr>
-              <w:t>9</w:t>
+              <w:t>13</w:t>
             </w:r>
           </w:p>
         </w:tc>
@@ -16781,7 +17049,7 @@
               <w:rPr>
                 <w:sz w:val="17"/>
               </w:rPr>
-              <w:t>GET /emass-imports; GET /emass-imports/samples/{report_type}; GET /emass-imports/{import_id}; POST /emass-imports …</w:t>
+              <w:t>GET /emass-imports; GET /emass-imports/samples/{report_type}; GET /emass-imports/{import_id}; GET /emass-imports/{import_id}/manage …</w:t>
             </w:r>
           </w:p>
         </w:tc>
@@ -17017,7 +17285,7 @@
               <w:rPr>
                 <w:sz w:val="17"/>
               </w:rPr>
-              <w:t>ingest-runs</w:t>
+              <w:t>imported-data</w:t>
             </w:r>
           </w:p>
         </w:tc>
@@ -17045,7 +17313,7 @@
               <w:rPr>
                 <w:sz w:val="17"/>
               </w:rPr>
-              <w:t>GET /ingest-runs/{run_id}; GET /ingest-runs/{run_id}/stig; POST /ingest-runs/{run_id}/retry</w:t>
+              <w:t>GET /imported-data/{import_kind}/{import_id}; POST /imported-data/{import_kind}/{import_id}; POST /imported-data/{import_kind}/{import_id}/undo/{op_id}</w:t>
             </w:r>
           </w:p>
         </w:tc>
@@ -17061,7 +17329,7 @@
               <w:rPr>
                 <w:sz w:val="17"/>
               </w:rPr>
-              <w:t>inventory</w:t>
+              <w:t>ingest-runs</w:t>
             </w:r>
           </w:p>
         </w:tc>
@@ -17075,7 +17343,7 @@
               <w:rPr>
                 <w:sz w:val="17"/>
               </w:rPr>
-              <w:t>4</w:t>
+              <w:t>3</w:t>
             </w:r>
           </w:p>
         </w:tc>
@@ -17089,7 +17357,7 @@
               <w:rPr>
                 <w:sz w:val="17"/>
               </w:rPr>
-              <w:t>GET /inventory/exports/{eid}/download; GET /inventory/exports/{eid}/validation-report; POST /inventory/correlations/{cid}; POST /inventory/discrepancies/{did}</w:t>
+              <w:t>GET /ingest-runs/{run_id}; GET /ingest-runs/{run_id}/stig; POST /ingest-runs/{run_id}/retry</w:t>
             </w:r>
           </w:p>
         </w:tc>
@@ -17105,7 +17373,7 @@
               <w:rPr>
                 <w:sz w:val="17"/>
               </w:rPr>
-              <w:t>jobs</w:t>
+              <w:t>inventory</w:t>
             </w:r>
           </w:p>
         </w:tc>
@@ -17119,7 +17387,7 @@
               <w:rPr>
                 <w:sz w:val="17"/>
               </w:rPr>
-              <w:t>2</w:t>
+              <w:t>4</w:t>
             </w:r>
           </w:p>
         </w:tc>
@@ -17133,7 +17401,7 @@
               <w:rPr>
                 <w:sz w:val="17"/>
               </w:rPr>
-              <w:t>GET /jobs; GET /jobs/{job_id}</w:t>
+              <w:t>GET /inventory/exports/{eid}/download; GET /inventory/exports/{eid}/validation-report; POST /inventory/correlations/{cid}; POST /inventory/discrepancies/{did}</w:t>
             </w:r>
           </w:p>
         </w:tc>
@@ -17149,7 +17417,7 @@
               <w:rPr>
                 <w:sz w:val="17"/>
               </w:rPr>
-              <w:t>mapping-review</w:t>
+              <w:t>jobs</w:t>
             </w:r>
           </w:p>
         </w:tc>
@@ -17163,7 +17431,7 @@
               <w:rPr>
                 <w:sz w:val="17"/>
               </w:rPr>
-              <w:t>6</w:t>
+              <w:t>2</w:t>
             </w:r>
           </w:p>
         </w:tc>
@@ -17177,7 +17445,7 @@
               <w:rPr>
                 <w:sz w:val="17"/>
               </w:rPr>
-              <w:t>GET /mapping-review; GET /mapping-review/bulk-jobs/{job_id}; POST /mapping-review/bulk-jobs; POST /mapping-review/bulk-jobs/{job_id}/retry …</w:t>
+              <w:t>GET /jobs; GET /jobs/{job_id}</w:t>
             </w:r>
           </w:p>
         </w:tc>
@@ -17193,7 +17461,7 @@
               <w:rPr>
                 <w:sz w:val="17"/>
               </w:rPr>
-              <w:t>mappings</w:t>
+              <w:t>mapping-review</w:t>
             </w:r>
           </w:p>
         </w:tc>
@@ -17207,7 +17475,7 @@
               <w:rPr>
                 <w:sz w:val="17"/>
               </w:rPr>
-              <w:t>1</w:t>
+              <w:t>6</w:t>
             </w:r>
           </w:p>
         </w:tc>
@@ -17221,7 +17489,7 @@
               <w:rPr>
                 <w:sz w:val="17"/>
               </w:rPr>
-              <w:t>POST /mappings/{map_id}/review</w:t>
+              <w:t>GET /mapping-review; GET /mapping-review/bulk-jobs/{job_id}; POST /mapping-review/bulk-jobs; POST /mapping-review/bulk-jobs/{job_id}/retry …</w:t>
             </w:r>
           </w:p>
         </w:tc>
@@ -17237,7 +17505,7 @@
               <w:rPr>
                 <w:sz w:val="17"/>
               </w:rPr>
-              <w:t>notification-prefs</w:t>
+              <w:t>mappings</w:t>
             </w:r>
           </w:p>
         </w:tc>
@@ -17251,7 +17519,7 @@
               <w:rPr>
                 <w:sz w:val="17"/>
               </w:rPr>
-              <w:t>2</w:t>
+              <w:t>1</w:t>
             </w:r>
           </w:p>
         </w:tc>
@@ -17265,7 +17533,7 @@
               <w:rPr>
                 <w:sz w:val="17"/>
               </w:rPr>
-              <w:t>GET /notification-prefs; PUT /notification-prefs</w:t>
+              <w:t>POST /mappings/{map_id}/review</w:t>
             </w:r>
           </w:p>
         </w:tc>
@@ -17281,7 +17549,7 @@
               <w:rPr>
                 <w:sz w:val="17"/>
               </w:rPr>
-              <w:t>notifications</w:t>
+              <w:t>me</w:t>
             </w:r>
           </w:p>
         </w:tc>
@@ -17309,7 +17577,7 @@
               <w:rPr>
                 <w:sz w:val="17"/>
               </w:rPr>
-              <w:t>GET /notifications; POST /notifications/{notification_id}/ack</w:t>
+              <w:t>GET /me/preferences; PUT /me/preferences</w:t>
             </w:r>
           </w:p>
         </w:tc>
@@ -17325,7 +17593,7 @@
               <w:rPr>
                 <w:sz w:val="17"/>
               </w:rPr>
-              <w:t>oscal-exports</w:t>
+              <w:t>notification-prefs</w:t>
             </w:r>
           </w:p>
         </w:tc>
@@ -17339,7 +17607,7 @@
               <w:rPr>
                 <w:sz w:val="17"/>
               </w:rPr>
-              <w:t>1</w:t>
+              <w:t>2</w:t>
             </w:r>
           </w:p>
         </w:tc>
@@ -17353,7 +17621,7 @@
               <w:rPr>
                 <w:sz w:val="17"/>
               </w:rPr>
-              <w:t>GET /oscal-exports/{evidence_id}/download</w:t>
+              <w:t>GET /notification-prefs; PUT /notification-prefs</w:t>
             </w:r>
           </w:p>
         </w:tc>
@@ -17369,7 +17637,7 @@
               <w:rPr>
                 <w:sz w:val="17"/>
               </w:rPr>
-              <w:t>overlays</w:t>
+              <w:t>notifications</w:t>
             </w:r>
           </w:p>
         </w:tc>
@@ -17397,7 +17665,7 @@
               <w:rPr>
                 <w:sz w:val="17"/>
               </w:rPr>
-              <w:t>POST /overlays/import-reference; POST /overlays/{overlay_key}/import</w:t>
+              <w:t>GET /notifications; POST /notifications/{notification_id}/ack</w:t>
             </w:r>
           </w:p>
         </w:tc>
@@ -17413,7 +17681,7 @@
               <w:rPr>
                 <w:sz w:val="17"/>
               </w:rPr>
-              <w:t>poam-match-rules</w:t>
+              <w:t>oscal-exports</w:t>
             </w:r>
           </w:p>
         </w:tc>
@@ -17441,7 +17709,7 @@
               <w:rPr>
                 <w:sz w:val="17"/>
               </w:rPr>
-              <w:t>GET /poam-match-rules</w:t>
+              <w:t>GET /oscal-exports/{evidence_id}/download</w:t>
             </w:r>
           </w:p>
         </w:tc>
@@ -17457,7 +17725,7 @@
               <w:rPr>
                 <w:sz w:val="17"/>
               </w:rPr>
-              <w:t>poam-milestones</w:t>
+              <w:t>overlays</w:t>
             </w:r>
           </w:p>
         </w:tc>
@@ -17471,7 +17739,7 @@
               <w:rPr>
                 <w:sz w:val="17"/>
               </w:rPr>
-              <w:t>1</w:t>
+              <w:t>2</w:t>
             </w:r>
           </w:p>
         </w:tc>
@@ -17485,7 +17753,7 @@
               <w:rPr>
                 <w:sz w:val="17"/>
               </w:rPr>
-              <w:t>PATCH /poam-milestones/{milestone_id}</w:t>
+              <w:t>POST /overlays/import-reference; POST /overlays/{overlay_key}/import</w:t>
             </w:r>
           </w:p>
         </w:tc>
@@ -17501,7 +17769,7 @@
               <w:rPr>
                 <w:sz w:val="17"/>
               </w:rPr>
-              <w:t>poams</w:t>
+              <w:t>poam-match-rules</w:t>
             </w:r>
           </w:p>
         </w:tc>
@@ -17515,7 +17783,7 @@
               <w:rPr>
                 <w:sz w:val="17"/>
               </w:rPr>
-              <w:t>12</w:t>
+              <w:t>1</w:t>
             </w:r>
           </w:p>
         </w:tc>
@@ -17529,7 +17797,7 @@
               <w:rPr>
                 <w:sz w:val="17"/>
               </w:rPr>
-              <w:t>GET /poams; GET /poams/{poam_id}; GET /poams/{poam_id}/risk; PATCH /poams/{poam_id} …</w:t>
+              <w:t>GET /poam-match-rules</w:t>
             </w:r>
           </w:p>
         </w:tc>
@@ -17545,7 +17813,7 @@
               <w:rPr>
                 <w:sz w:val="17"/>
               </w:rPr>
-              <w:t>policies</w:t>
+              <w:t>poam-milestones</w:t>
             </w:r>
           </w:p>
         </w:tc>
@@ -17559,7 +17827,7 @@
               <w:rPr>
                 <w:sz w:val="17"/>
               </w:rPr>
-              <w:t>12</w:t>
+              <w:t>1</w:t>
             </w:r>
           </w:p>
         </w:tc>
@@ -17573,7 +17841,7 @@
               <w:rPr>
                 <w:sz w:val="17"/>
               </w:rPr>
-              <w:t>GET /policies; GET /policies/{policy_id}; GET /policies/{policy_id}/mappings/{control_id}/review; GET /policies/{policy_id}/parameters.csv …</w:t>
+              <w:t>PATCH /poam-milestones/{milestone_id}</w:t>
             </w:r>
           </w:p>
         </w:tc>
@@ -17589,7 +17857,7 @@
               <w:rPr>
                 <w:sz w:val="17"/>
               </w:rPr>
-              <w:t>policy-findings</w:t>
+              <w:t>poams</w:t>
             </w:r>
           </w:p>
         </w:tc>
@@ -17603,7 +17871,7 @@
               <w:rPr>
                 <w:sz w:val="17"/>
               </w:rPr>
-              <w:t>1</w:t>
+              <w:t>12</w:t>
             </w:r>
           </w:p>
         </w:tc>
@@ -17617,7 +17885,7 @@
               <w:rPr>
                 <w:sz w:val="17"/>
               </w:rPr>
-              <w:t>POST /policy-findings/{pf_id}/{action}</w:t>
+              <w:t>GET /poams; GET /poams/{poam_id}; GET /poams/{poam_id}/risk; PATCH /poams/{poam_id} …</w:t>
             </w:r>
           </w:p>
         </w:tc>
@@ -17633,7 +17901,7 @@
               <w:rPr>
                 <w:sz w:val="17"/>
               </w:rPr>
-              <w:t>priority-weights</w:t>
+              <w:t>policies</w:t>
             </w:r>
           </w:p>
         </w:tc>
@@ -17647,7 +17915,7 @@
               <w:rPr>
                 <w:sz w:val="17"/>
               </w:rPr>
-              <w:t>1</w:t>
+              <w:t>13</w:t>
             </w:r>
           </w:p>
         </w:tc>
@@ -17661,7 +17929,7 @@
               <w:rPr>
                 <w:sz w:val="17"/>
               </w:rPr>
-              <w:t>GET /priority-weights</w:t>
+              <w:t>GET /policies; GET /policies/{policy_id}; GET /policies/{policy_id}/mappings/{control_id}/review; GET /policies/{policy_id}/parameters.csv …</w:t>
             </w:r>
           </w:p>
         </w:tc>
@@ -17677,7 +17945,7 @@
               <w:rPr>
                 <w:sz w:val="17"/>
               </w:rPr>
-              <w:t>privacy</w:t>
+              <w:t>policy-findings</w:t>
             </w:r>
           </w:p>
         </w:tc>
@@ -17705,7 +17973,7 @@
               <w:rPr>
                 <w:sz w:val="17"/>
               </w:rPr>
-              <w:t>GET /privacy/preview</w:t>
+              <w:t>POST /policy-findings/{pf_id}/{action}</w:t>
             </w:r>
           </w:p>
         </w:tc>
@@ -17721,7 +17989,7 @@
               <w:rPr>
                 <w:sz w:val="17"/>
               </w:rPr>
-              <w:t>providers</w:t>
+              <w:t>priority-weights</w:t>
             </w:r>
           </w:p>
         </w:tc>
@@ -17735,7 +18003,7 @@
               <w:rPr>
                 <w:sz w:val="17"/>
               </w:rPr>
-              <w:t>5</w:t>
+              <w:t>1</w:t>
             </w:r>
           </w:p>
         </w:tc>
@@ -17749,7 +18017,7 @@
               <w:rPr>
                 <w:sz w:val="17"/>
               </w:rPr>
-              <w:t>PATCH /providers/{provider_id}; POST /providers; POST /providers/{provider_id}/crm/apply; POST /providers/{provider_id}/crm/preview …</w:t>
+              <w:t>GET /priority-weights</w:t>
             </w:r>
           </w:p>
         </w:tc>
@@ -17765,7 +18033,7 @@
               <w:rPr>
                 <w:sz w:val="17"/>
               </w:rPr>
-              <w:t>pta</w:t>
+              <w:t>privacy</w:t>
             </w:r>
           </w:p>
         </w:tc>
@@ -17779,7 +18047,7 @@
               <w:rPr>
                 <w:sz w:val="17"/>
               </w:rPr>
-              <w:t>2</w:t>
+              <w:t>1</w:t>
             </w:r>
           </w:p>
         </w:tc>
@@ -17793,7 +18061,7 @@
               <w:rPr>
                 <w:sz w:val="17"/>
               </w:rPr>
-              <w:t>GET /pta/question-sets; POST /pta/question-sets</w:t>
+              <w:t>GET /privacy/preview</w:t>
             </w:r>
           </w:p>
         </w:tc>
@@ -17809,7 +18077,7 @@
               <w:rPr>
                 <w:sz w:val="17"/>
               </w:rPr>
-              <w:t>public</w:t>
+              <w:t>providers</w:t>
             </w:r>
           </w:p>
         </w:tc>
@@ -17823,7 +18091,7 @@
               <w:rPr>
                 <w:sz w:val="17"/>
               </w:rPr>
-              <w:t>2</w:t>
+              <w:t>5</w:t>
             </w:r>
           </w:p>
         </w:tc>
@@ -17837,7 +18105,7 @@
               <w:rPr>
                 <w:sz w:val="17"/>
               </w:rPr>
-              <w:t>GET /public/demo/{name}; GET /public/whitepaper.{ext}</w:t>
+              <w:t>PATCH /providers/{provider_id}; POST /providers; POST /providers/{provider_id}/crm/apply; POST /providers/{provider_id}/crm/preview …</w:t>
             </w:r>
           </w:p>
         </w:tc>
@@ -17853,7 +18121,7 @@
               <w:rPr>
                 <w:sz w:val="17"/>
               </w:rPr>
-              <w:t>rbac</w:t>
+              <w:t>pta</w:t>
             </w:r>
           </w:p>
         </w:tc>
@@ -17867,7 +18135,7 @@
               <w:rPr>
                 <w:sz w:val="17"/>
               </w:rPr>
-              <w:t>1</w:t>
+              <w:t>2</w:t>
             </w:r>
           </w:p>
         </w:tc>
@@ -17881,7 +18149,7 @@
               <w:rPr>
                 <w:sz w:val="17"/>
               </w:rPr>
-              <w:t>GET /rbac/matrix</w:t>
+              <w:t>GET /pta/question-sets; POST /pta/question-sets</w:t>
             </w:r>
           </w:p>
         </w:tc>
@@ -17897,7 +18165,7 @@
               <w:rPr>
                 <w:sz w:val="17"/>
               </w:rPr>
-              <w:t>ready</w:t>
+              <w:t>public</w:t>
             </w:r>
           </w:p>
         </w:tc>
@@ -17911,7 +18179,7 @@
               <w:rPr>
                 <w:sz w:val="17"/>
               </w:rPr>
-              <w:t>1</w:t>
+              <w:t>2</w:t>
             </w:r>
           </w:p>
         </w:tc>
@@ -17925,7 +18193,7 @@
               <w:rPr>
                 <w:sz w:val="17"/>
               </w:rPr>
-              <w:t>GET /ready</w:t>
+              <w:t>GET /public/demo/{name}; GET /public/whitepaper.{ext}</w:t>
             </w:r>
           </w:p>
         </w:tc>
@@ -17941,7 +18209,7 @@
               <w:rPr>
                 <w:sz w:val="17"/>
               </w:rPr>
-              <w:t>reference</w:t>
+              <w:t>rbac</w:t>
             </w:r>
           </w:p>
         </w:tc>
@@ -17955,7 +18223,7 @@
               <w:rPr>
                 <w:sz w:val="17"/>
               </w:rPr>
-              <w:t>6</w:t>
+              <w:t>1</w:t>
             </w:r>
           </w:p>
         </w:tc>
@@ -17969,7 +18237,7 @@
               <w:rPr>
                 <w:sz w:val="17"/>
               </w:rPr>
-              <w:t>GET /reference/frameworks; GET /reference/info-types; GET /reference/registration; GET /reference/rmf …</w:t>
+              <w:t>GET /rbac/matrix</w:t>
             </w:r>
           </w:p>
         </w:tc>
@@ -17985,7 +18253,7 @@
               <w:rPr>
                 <w:sz w:val="17"/>
               </w:rPr>
-              <w:t>reviews</w:t>
+              <w:t>ready</w:t>
             </w:r>
           </w:p>
         </w:tc>
@@ -17999,7 +18267,7 @@
               <w:rPr>
                 <w:sz w:val="17"/>
               </w:rPr>
-              <w:t>3</w:t>
+              <w:t>1</w:t>
             </w:r>
           </w:p>
         </w:tc>
@@ -18013,7 +18281,7 @@
               <w:rPr>
                 <w:sz w:val="17"/>
               </w:rPr>
-              <w:t>GET /reviews; GET /reviews/{request_id}; POST /reviews/{request_id}/decisions</w:t>
+              <w:t>GET /ready</w:t>
             </w:r>
           </w:p>
         </w:tc>
@@ -18029,7 +18297,7 @@
               <w:rPr>
                 <w:sz w:val="17"/>
               </w:rPr>
-              <w:t>risk</w:t>
+              <w:t>reference</w:t>
             </w:r>
           </w:p>
         </w:tc>
@@ -18043,7 +18311,7 @@
               <w:rPr>
                 <w:sz w:val="17"/>
               </w:rPr>
-              <w:t>2</w:t>
+              <w:t>6</w:t>
             </w:r>
           </w:p>
         </w:tc>
@@ -18057,7 +18325,7 @@
               <w:rPr>
                 <w:sz w:val="17"/>
               </w:rPr>
-              <w:t>GET /risk/weights; PUT /risk/weights</w:t>
+              <w:t>GET /reference/frameworks; GET /reference/info-types; GET /reference/registration; GET /reference/rmf …</w:t>
             </w:r>
           </w:p>
         </w:tc>
@@ -18073,7 +18341,7 @@
               <w:rPr>
                 <w:sz w:val="17"/>
               </w:rPr>
-              <w:t>sandbox</w:t>
+              <w:t>review-flags</w:t>
             </w:r>
           </w:p>
         </w:tc>
@@ -18087,7 +18355,7 @@
               <w:rPr>
                 <w:sz w:val="17"/>
               </w:rPr>
-              <w:t>6</w:t>
+              <w:t>1</w:t>
             </w:r>
           </w:p>
         </w:tc>
@@ -18101,7 +18369,7 @@
               <w:rPr>
                 <w:sz w:val="17"/>
               </w:rPr>
-              <w:t>GET /sandbox/samples.zip; GET /sandbox/status; POST /sandbox/act-as; POST /sandbox/demo-data …</w:t>
+              <w:t>POST /review-flags/{flag_id}/resolve</w:t>
             </w:r>
           </w:p>
         </w:tc>
@@ -18117,7 +18385,7 @@
               <w:rPr>
                 <w:sz w:val="17"/>
               </w:rPr>
-              <w:t>scheduled-jobs</w:t>
+              <w:t>reviews</w:t>
             </w:r>
           </w:p>
         </w:tc>
@@ -18145,7 +18413,7 @@
               <w:rPr>
                 <w:sz w:val="17"/>
               </w:rPr>
-              <w:t>GET /scheduled-jobs; POST /scheduled-jobs/{job_id}/run; PUT /scheduled-jobs/{job_id}</w:t>
+              <w:t>GET /reviews; GET /reviews/{request_id}; POST /reviews/{request_id}/decisions</w:t>
             </w:r>
           </w:p>
         </w:tc>
@@ -18161,7 +18429,7 @@
               <w:rPr>
                 <w:sz w:val="17"/>
               </w:rPr>
-              <w:t>search</w:t>
+              <w:t>risk</w:t>
             </w:r>
           </w:p>
         </w:tc>
@@ -18175,7 +18443,7 @@
               <w:rPr>
                 <w:sz w:val="17"/>
               </w:rPr>
-              <w:t>1</w:t>
+              <w:t>2</w:t>
             </w:r>
           </w:p>
         </w:tc>
@@ -18189,7 +18457,7 @@
               <w:rPr>
                 <w:sz w:val="17"/>
               </w:rPr>
-              <w:t>GET /search</w:t>
+              <w:t>GET /risk/weights; PUT /risk/weights</w:t>
             </w:r>
           </w:p>
         </w:tc>
@@ -18205,7 +18473,7 @@
               <w:rPr>
                 <w:sz w:val="17"/>
               </w:rPr>
-              <w:t>source-types</w:t>
+              <w:t>sandbox</w:t>
             </w:r>
           </w:p>
         </w:tc>
@@ -18219,7 +18487,7 @@
               <w:rPr>
                 <w:sz w:val="17"/>
               </w:rPr>
-              <w:t>1</w:t>
+              <w:t>6</w:t>
             </w:r>
           </w:p>
         </w:tc>
@@ -18233,7 +18501,7 @@
               <w:rPr>
                 <w:sz w:val="17"/>
               </w:rPr>
-              <w:t>GET /source-types</w:t>
+              <w:t>GET /sandbox/samples.zip; GET /sandbox/status; POST /sandbox/act-as; POST /sandbox/demo-data …</w:t>
             </w:r>
           </w:p>
         </w:tc>
@@ -18249,7 +18517,7 @@
               <w:rPr>
                 <w:sz w:val="17"/>
               </w:rPr>
-              <w:t>sources</w:t>
+              <w:t>scheduled-jobs</w:t>
             </w:r>
           </w:p>
         </w:tc>
@@ -18277,7 +18545,7 @@
               <w:rPr>
                 <w:sz w:val="17"/>
               </w:rPr>
-              <w:t>PATCH /sources/{source_id}; POST /sources/{source_id}/run; POST /sources/{source_id}/test</w:t>
+              <w:t>GET /scheduled-jobs; POST /scheduled-jobs/{job_id}/run; PUT /scheduled-jobs/{job_id}</w:t>
             </w:r>
           </w:p>
         </w:tc>
@@ -18293,6 +18561,138 @@
               <w:rPr>
                 <w:sz w:val="17"/>
               </w:rPr>
+              <w:t>search</w:t>
+            </w:r>
+          </w:p>
+        </w:tc>
+        <w:tc>
+          <w:tcPr>
+            <w:tcW w:type="dxa" w:w="683"/>
+          </w:tcPr>
+          <w:p>
+            <w:r/>
+            <w:r>
+              <w:rPr>
+                <w:sz w:val="17"/>
+              </w:rPr>
+              <w:t>1</w:t>
+            </w:r>
+          </w:p>
+        </w:tc>
+        <w:tc>
+          <w:tcPr>
+            <w:tcW w:type="dxa" w:w="7508"/>
+          </w:tcPr>
+          <w:p>
+            <w:r/>
+            <w:r>
+              <w:rPr>
+                <w:sz w:val="17"/>
+              </w:rPr>
+              <w:t>GET /search</w:t>
+            </w:r>
+          </w:p>
+        </w:tc>
+      </w:tr>
+      <w:tr>
+        <w:tc>
+          <w:tcPr>
+            <w:tcW w:type="dxa" w:w="1560"/>
+          </w:tcPr>
+          <w:p>
+            <w:r/>
+            <w:r>
+              <w:rPr>
+                <w:sz w:val="17"/>
+              </w:rPr>
+              <w:t>source-types</w:t>
+            </w:r>
+          </w:p>
+        </w:tc>
+        <w:tc>
+          <w:tcPr>
+            <w:tcW w:type="dxa" w:w="683"/>
+          </w:tcPr>
+          <w:p>
+            <w:r/>
+            <w:r>
+              <w:rPr>
+                <w:sz w:val="17"/>
+              </w:rPr>
+              <w:t>1</w:t>
+            </w:r>
+          </w:p>
+        </w:tc>
+        <w:tc>
+          <w:tcPr>
+            <w:tcW w:type="dxa" w:w="7508"/>
+          </w:tcPr>
+          <w:p>
+            <w:r/>
+            <w:r>
+              <w:rPr>
+                <w:sz w:val="17"/>
+              </w:rPr>
+              <w:t>GET /source-types</w:t>
+            </w:r>
+          </w:p>
+        </w:tc>
+      </w:tr>
+      <w:tr>
+        <w:tc>
+          <w:tcPr>
+            <w:tcW w:type="dxa" w:w="1560"/>
+          </w:tcPr>
+          <w:p>
+            <w:r/>
+            <w:r>
+              <w:rPr>
+                <w:sz w:val="17"/>
+              </w:rPr>
+              <w:t>sources</w:t>
+            </w:r>
+          </w:p>
+        </w:tc>
+        <w:tc>
+          <w:tcPr>
+            <w:tcW w:type="dxa" w:w="683"/>
+          </w:tcPr>
+          <w:p>
+            <w:r/>
+            <w:r>
+              <w:rPr>
+                <w:sz w:val="17"/>
+              </w:rPr>
+              <w:t>3</w:t>
+            </w:r>
+          </w:p>
+        </w:tc>
+        <w:tc>
+          <w:tcPr>
+            <w:tcW w:type="dxa" w:w="7508"/>
+          </w:tcPr>
+          <w:p>
+            <w:r/>
+            <w:r>
+              <w:rPr>
+                <w:sz w:val="17"/>
+              </w:rPr>
+              <w:t>PATCH /sources/{source_id}; POST /sources/{source_id}/run; POST /sources/{source_id}/test</w:t>
+            </w:r>
+          </w:p>
+        </w:tc>
+      </w:tr>
+      <w:tr>
+        <w:tc>
+          <w:tcPr>
+            <w:tcW w:type="dxa" w:w="1560"/>
+          </w:tcPr>
+          <w:p>
+            <w:r/>
+            <w:r>
+              <w:rPr>
+                <w:sz w:val="17"/>
+              </w:rPr>
               <w:t>systems</w:t>
             </w:r>
           </w:p>
@@ -18307,7 +18707,7 @@
               <w:rPr>
                 <w:sz w:val="17"/>
               </w:rPr>
-              <w:t>118</w:t>
+              <w:t>123</w:t>
             </w:r>
           </w:p>
         </w:tc>

</xml_diff>